<commit_message>
Updating the service manual for version 6
</commit_message>
<xml_diff>
--- a/Documentation/Service Manual.docx
+++ b/Documentation/Service Manual.docx
@@ -1,6 +1,6 @@
 
 <file path=word/document.xml><?xml version="1.0" encoding="utf-8"?>
-<w:document xmlns:wpc="http://schemas.microsoft.com/office/word/2010/wordprocessingCanvas" xmlns:cx="http://schemas.microsoft.com/office/drawing/2014/chartex" xmlns:cx1="http://schemas.microsoft.com/office/drawing/2015/9/8/chartex" xmlns:cx2="http://schemas.microsoft.com/office/drawing/2015/10/21/chartex" xmlns:cx3="http://schemas.microsoft.com/office/drawing/2016/5/9/chartex" xmlns:cx4="http://schemas.microsoft.com/office/drawing/2016/5/10/chartex" xmlns:cx5="http://schemas.microsoft.com/office/drawing/2016/5/11/chartex" xmlns:cx6="http://schemas.microsoft.com/office/drawing/2016/5/12/chartex" xmlns:cx7="http://schemas.microsoft.com/office/drawing/2016/5/13/chartex" xmlns:cx8="http://schemas.microsoft.com/office/drawing/2016/5/14/chartex" xmlns:mc="http://schemas.openxmlformats.org/markup-compatibility/2006" xmlns:aink="http://schemas.microsoft.com/office/drawing/2016/ink" xmlns:am3d="http://schemas.microsoft.com/office/drawing/2017/model3d" xmlns:o="urn:schemas-microsoft-com:office:office" xmlns:oel="http://schemas.microsoft.com/office/2019/extlst" xmlns:r="http://schemas.openxmlformats.org/officeDocument/2006/relationships" xmlns:m="http://schemas.openxmlformats.org/officeDocument/2006/math" xmlns:v="urn:schemas-microsoft-com:vml" xmlns:wp14="http://schemas.microsoft.com/office/word/2010/wordprocessingDrawing" xmlns:wp="http://schemas.openxmlformats.org/drawingml/2006/wordprocessingDrawing" xmlns:w10="urn:schemas-microsoft-com:office:word" xmlns:w="http://schemas.openxmlformats.org/wordprocessingml/2006/main" xmlns:w14="http://schemas.microsoft.com/office/word/2010/wordml" xmlns:w15="http://schemas.microsoft.com/office/word/2012/wordml" xmlns:w16cex="http://schemas.microsoft.com/office/word/2018/wordml/cex" xmlns:w16cid="http://schemas.microsoft.com/office/word/2016/wordml/cid" xmlns:w16="http://schemas.microsoft.com/office/word/2018/wordml" xmlns:w16du="http://schemas.microsoft.com/office/word/2023/wordml/word16du" xmlns:w16sdtdh="http://schemas.microsoft.com/office/word/2020/wordml/sdtdatahash" xmlns:w16se="http://schemas.microsoft.com/office/word/2015/wordml/symex" xmlns:wpg="http://schemas.microsoft.com/office/word/2010/wordprocessingGroup" xmlns:wpi="http://schemas.microsoft.com/office/word/2010/wordprocessingInk" xmlns:wne="http://schemas.microsoft.com/office/word/2006/wordml" xmlns:wps="http://schemas.microsoft.com/office/word/2010/wordprocessingShape" mc:Ignorable="w14 w15 w16se w16cid w16 w16cex w16sdtdh w16du wp14">
+<w:document xmlns:wpc="http://schemas.microsoft.com/office/word/2010/wordprocessingCanvas" xmlns:cx="http://schemas.microsoft.com/office/drawing/2014/chartex" xmlns:cx1="http://schemas.microsoft.com/office/drawing/2015/9/8/chartex" xmlns:cx2="http://schemas.microsoft.com/office/drawing/2015/10/21/chartex" xmlns:cx3="http://schemas.microsoft.com/office/drawing/2016/5/9/chartex" xmlns:cx4="http://schemas.microsoft.com/office/drawing/2016/5/10/chartex" xmlns:cx5="http://schemas.microsoft.com/office/drawing/2016/5/11/chartex" xmlns:cx6="http://schemas.microsoft.com/office/drawing/2016/5/12/chartex" xmlns:cx7="http://schemas.microsoft.com/office/drawing/2016/5/13/chartex" xmlns:cx8="http://schemas.microsoft.com/office/drawing/2016/5/14/chartex" xmlns:mc="http://schemas.openxmlformats.org/markup-compatibility/2006" xmlns:aink="http://schemas.microsoft.com/office/drawing/2016/ink" xmlns:am3d="http://schemas.microsoft.com/office/drawing/2017/model3d" xmlns:o="urn:schemas-microsoft-com:office:office" xmlns:oel="http://schemas.microsoft.com/office/2019/extlst" xmlns:r="http://schemas.openxmlformats.org/officeDocument/2006/relationships" xmlns:m="http://schemas.openxmlformats.org/officeDocument/2006/math" xmlns:v="urn:schemas-microsoft-com:vml" xmlns:wp14="http://schemas.microsoft.com/office/word/2010/wordprocessingDrawing" xmlns:wp="http://schemas.openxmlformats.org/drawingml/2006/wordprocessingDrawing" xmlns:w10="urn:schemas-microsoft-com:office:word" xmlns:w="http://schemas.openxmlformats.org/wordprocessingml/2006/main" xmlns:w14="http://schemas.microsoft.com/office/word/2010/wordml" xmlns:w15="http://schemas.microsoft.com/office/word/2012/wordml" xmlns:w16cex="http://schemas.microsoft.com/office/word/2018/wordml/cex" xmlns:w16cid="http://schemas.microsoft.com/office/word/2016/wordml/cid" xmlns:w16="http://schemas.microsoft.com/office/word/2018/wordml" xmlns:w16du="http://schemas.microsoft.com/office/word/2023/wordml/word16du" xmlns:w16sdtdh="http://schemas.microsoft.com/office/word/2020/wordml/sdtdatahash" xmlns:w16sdtfl="http://schemas.microsoft.com/office/word/2024/wordml/sdtformatlock" xmlns:w16se="http://schemas.microsoft.com/office/word/2015/wordml/symex" xmlns:wpg="http://schemas.microsoft.com/office/word/2010/wordprocessingGroup" xmlns:wpi="http://schemas.microsoft.com/office/word/2010/wordprocessingInk" xmlns:wne="http://schemas.microsoft.com/office/word/2006/wordml" xmlns:wps="http://schemas.microsoft.com/office/word/2010/wordprocessingShape" mc:Ignorable="w14 w15 w16se w16cid w16 w16cex w16sdtdh w16sdtfl w16du wp14">
   <w:body>
     <w:p>
       <w:pPr>
@@ -74,14 +74,14 @@
           <w:sz w:val="96"/>
           <w:szCs w:val="96"/>
         </w:rPr>
-        <w:t>Version 5</w:t>
+        <w:t xml:space="preserve">Version </w:t>
       </w:r>
       <w:r>
         <w:rPr>
           <w:sz w:val="96"/>
           <w:szCs w:val="96"/>
         </w:rPr>
-        <w:t>.2.18</w:t>
+        <w:t>6.0.0</w:t>
       </w:r>
     </w:p>
     <w:p>
@@ -219,6 +219,15 @@
     </w:p>
     <w:sdt>
       <w:sdtPr>
+        <w:rPr>
+          <w:rFonts w:cstheme="minorBidi"/>
+          <w:b w:val="0"/>
+          <w:bCs w:val="0"/>
+          <w:i w:val="0"/>
+          <w:iCs w:val="0"/>
+          <w:sz w:val="20"/>
+          <w:szCs w:val="20"/>
+        </w:rPr>
         <w:id w:val="-783580038"/>
         <w:docPartObj>
           <w:docPartGallery w:val="Table of Contents"/>
@@ -227,12 +236,7 @@
       </w:sdtPr>
       <w:sdtEndPr>
         <w:rPr>
-          <w:rFonts w:cstheme="minorBidi"/>
-          <w:i w:val="0"/>
-          <w:iCs w:val="0"/>
           <w:noProof/>
-          <w:sz w:val="20"/>
-          <w:szCs w:val="20"/>
         </w:rPr>
       </w:sdtEndPr>
       <w:sdtContent>
@@ -2070,7 +2074,21 @@
                 <w:rStyle w:val="Hyperlink"/>
                 <w:noProof/>
               </w:rPr>
-              <w:t>WiFi OPERATION</w:t>
+              <w:t>WiFi OPERA</w:t>
+            </w:r>
+            <w:r>
+              <w:rPr>
+                <w:rStyle w:val="Hyperlink"/>
+                <w:noProof/>
+              </w:rPr>
+              <w:t>T</w:t>
+            </w:r>
+            <w:r>
+              <w:rPr>
+                <w:rStyle w:val="Hyperlink"/>
+                <w:noProof/>
+              </w:rPr>
+              <w:t>ION</w:t>
             </w:r>
             <w:r>
               <w:rPr>
@@ -10365,7 +10383,13 @@
           </w:tcPr>
           <w:p>
             <w:r>
-              <w:t>The NAME_ID allow the operator to select an SSID from a list of available SSIDs</w:t>
+              <w:t>The NAME_ID allow</w:t>
+            </w:r>
+            <w:r>
+              <w:t>s</w:t>
+            </w:r>
+            <w:r>
+              <w:t xml:space="preserve"> the operator to select an SSID from a list of available SSIDs</w:t>
             </w:r>
           </w:p>
           <w:p>
@@ -10533,7 +10557,19 @@
           </w:p>
           <w:p>
             <w:r>
-              <w:t>30 - BALDAR</w:t>
+              <w:t xml:space="preserve">30 </w:t>
+            </w:r>
+            <w:r>
+              <w:t>–</w:t>
+            </w:r>
+            <w:r>
+              <w:t xml:space="preserve"> BALDAR</w:t>
+            </w:r>
+          </w:p>
+          <w:p/>
+          <w:p>
+            <w:r>
+              <w:t>99 – User Defined</w:t>
             </w:r>
           </w:p>
         </w:tc>
@@ -10745,8 +10781,8 @@
         <w:tblLook w:val="04A0" w:firstRow="1" w:lastRow="0" w:firstColumn="1" w:lastColumn="0" w:noHBand="0" w:noVBand="1"/>
       </w:tblPr>
       <w:tblGrid>
-        <w:gridCol w:w="1952"/>
-        <w:gridCol w:w="8838"/>
+        <w:gridCol w:w="2375"/>
+        <w:gridCol w:w="8415"/>
       </w:tblGrid>
       <w:tr>
         <w:tc>
@@ -10834,13 +10870,111 @@
             <w:tcW w:w="8866" w:type="dxa"/>
           </w:tcPr>
           <w:p>
+            <w:r>
+              <w:t>Selects</w:t>
+            </w:r>
+            <w:r>
+              <w:t xml:space="preserve"> the SSID to be used by the target</w:t>
+            </w:r>
+          </w:p>
+        </w:tc>
+      </w:tr>
+      <w:tr>
+        <w:tc>
+          <w:tcPr>
+            <w:tcW w:w="1924" w:type="dxa"/>
+          </w:tcPr>
+          <w:p/>
+        </w:tc>
+        <w:tc>
+          <w:tcPr>
+            <w:tcW w:w="8866" w:type="dxa"/>
+          </w:tcPr>
+          <w:p>
+            <w:r>
+              <w:t>Under normal operation the target will receive a dynamic IP address from the router.  To fix the IP address between operation, it is necessary to use a static IP</w:t>
+            </w:r>
+          </w:p>
+        </w:tc>
+      </w:tr>
+      <w:tr>
+        <w:tc>
+          <w:tcPr>
+            <w:tcW w:w="1924" w:type="dxa"/>
+          </w:tcPr>
+          <w:p>
+            <w:r>
+              <w:t>{“WIFI_</w:t>
+            </w:r>
+            <w:r>
+              <w:t>IP</w:t>
+            </w:r>
+            <w:r>
+              <w:t>”</w:t>
+            </w:r>
+            <w:proofErr w:type="gramStart"/>
+            <w:r>
+              <w:t>:”</w:t>
+            </w:r>
             <w:proofErr w:type="spellStart"/>
             <w:r>
-              <w:t>Selectes</w:t>
+              <w:t>xxxx</w:t>
             </w:r>
             <w:proofErr w:type="spellEnd"/>
-            <w:r>
-              <w:t xml:space="preserve"> the SSID to be used by the target</w:t>
+            <w:proofErr w:type="gramEnd"/>
+            <w:r>
+              <w:t>”}</w:t>
+            </w:r>
+          </w:p>
+        </w:tc>
+        <w:tc>
+          <w:tcPr>
+            <w:tcW w:w="8866" w:type="dxa"/>
+          </w:tcPr>
+          <w:p>
+            <w:r>
+              <w:t>Forces a static IP into the target</w:t>
+            </w:r>
+          </w:p>
+        </w:tc>
+      </w:tr>
+      <w:tr>
+        <w:tc>
+          <w:tcPr>
+            <w:tcW w:w="1924" w:type="dxa"/>
+          </w:tcPr>
+          <w:p>
+            <w:r>
+              <w:t>{“WIFI_</w:t>
+            </w:r>
+            <w:r>
+              <w:t>GATEWAY</w:t>
+            </w:r>
+            <w:r>
+              <w:t>”</w:t>
+            </w:r>
+            <w:proofErr w:type="gramStart"/>
+            <w:r>
+              <w:t>:”</w:t>
+            </w:r>
+            <w:proofErr w:type="spellStart"/>
+            <w:r>
+              <w:t>xxxx</w:t>
+            </w:r>
+            <w:proofErr w:type="spellEnd"/>
+            <w:proofErr w:type="gramEnd"/>
+            <w:r>
+              <w:t>”}</w:t>
+            </w:r>
+          </w:p>
+        </w:tc>
+        <w:tc>
+          <w:tcPr>
+            <w:tcW w:w="8866" w:type="dxa"/>
+          </w:tcPr>
+          <w:p>
+            <w:r>
+              <w:t>Assigns a gateway address to the target</w:t>
             </w:r>
           </w:p>
         </w:tc>
@@ -10854,11 +10988,19 @@
           <w:bCs/>
         </w:rPr>
       </w:pPr>
-      <w:r>
+    </w:p>
+    <w:p>
+      <w:pPr>
         <w:rPr>
           <w:b/>
           <w:bCs/>
         </w:rPr>
+      </w:pPr>
+      <w:r>
+        <w:rPr>
+          <w:b/>
+          <w:bCs/>
+        </w:rPr>
         <w:t>IMPORTANT</w:t>
       </w:r>
     </w:p>
@@ -10869,12 +11011,41 @@
     </w:p>
     <w:p>
       <w:r>
+        <w:t xml:space="preserve">The IP address can be overwritten by using the </w:t>
+      </w:r>
+      <w:r>
+        <w:t>{“WIFI_</w:t>
+      </w:r>
+      <w:r>
+        <w:t>IP</w:t>
+      </w:r>
+      <w:r>
+        <w:t>”</w:t>
+      </w:r>
+      <w:proofErr w:type="gramStart"/>
+      <w:r>
+        <w:t>:”</w:t>
+      </w:r>
+      <w:proofErr w:type="spellStart"/>
+      <w:r>
+        <w:t>xxxx</w:t>
+      </w:r>
+      <w:proofErr w:type="spellEnd"/>
+      <w:proofErr w:type="gramEnd"/>
+      <w:r>
+        <w:t>”}</w:t>
+      </w:r>
+      <w:r>
+        <w:t xml:space="preserve"> command</w:t>
+      </w:r>
+    </w:p>
+    <w:p>
+      <w:r>
         <w:t>WIFI_IP_ADDRESS: A.B.C.D, where A.B.C.D is the address that needs to be entered into PC client configuration</w:t>
       </w:r>
     </w:p>
     <w:p>
       <w:r>
-        <w:lastRenderedPageBreak/>
         <w:t>When using Station Mode, the PC Client will issue a warning that the SSID is not of the form FET-name. This is for information only and can be ignored.</w:t>
       </w:r>
     </w:p>
@@ -12532,7 +12703,7 @@
               <w:rPr>
                 <w:rFonts w:ascii="Calibri" w:eastAsia="Times New Roman" w:hAnsi="Calibri" w:cs="Calibri"/>
               </w:rPr>
-              <w:t>MIN_RING_TIME</w:t>
+              <w:t>MFS_SELECT_CD</w:t>
             </w:r>
           </w:p>
         </w:tc>
@@ -12551,7 +12722,7 @@
               <w:rPr>
                 <w:rFonts w:ascii="Calibri" w:eastAsia="Times New Roman" w:hAnsi="Calibri" w:cs="Calibri"/>
               </w:rPr>
-              <w:t>Time before next shot is recognized after the current shott</w:t>
+              <w:t>Output polarity of signals C and D</w:t>
             </w:r>
           </w:p>
         </w:tc>
@@ -12570,16 +12741,8 @@
               <w:rPr>
                 <w:rFonts w:ascii="Calibri" w:eastAsia="Times New Roman" w:hAnsi="Calibri" w:cs="Calibri"/>
               </w:rPr>
-              <w:t xml:space="preserve">500 </w:t>
-            </w:r>
-            <w:proofErr w:type="spellStart"/>
-            <w:r>
-              <w:rPr>
-                <w:rFonts w:ascii="Calibri" w:eastAsia="Times New Roman" w:hAnsi="Calibri" w:cs="Calibri"/>
-              </w:rPr>
-              <w:t>ms</w:t>
-            </w:r>
-            <w:proofErr w:type="spellEnd"/>
+              <w:t>22 – Invert output</w:t>
+            </w:r>
           </w:p>
         </w:tc>
         <w:tc>
@@ -12619,7 +12782,7 @@
               <w:rPr>
                 <w:rFonts w:ascii="Calibri" w:eastAsia="Times New Roman" w:hAnsi="Calibri" w:cs="Calibri"/>
               </w:rPr>
-              <w:t>NAME_ID</w:t>
+              <w:t>MIN_RING_TIME</w:t>
             </w:r>
           </w:p>
         </w:tc>
@@ -12638,7 +12801,7 @@
               <w:rPr>
                 <w:rFonts w:ascii="Calibri" w:eastAsia="Times New Roman" w:hAnsi="Calibri" w:cs="Calibri"/>
               </w:rPr>
-              <w:t>Index to select a target name for FET-</w:t>
+              <w:t>Time before next shot is recognized after the current shott</w:t>
             </w:r>
           </w:p>
         </w:tc>
@@ -12657,8 +12820,16 @@
               <w:rPr>
                 <w:rFonts w:ascii="Calibri" w:eastAsia="Times New Roman" w:hAnsi="Calibri" w:cs="Calibri"/>
               </w:rPr>
-              <w:t>0-31, default 0</w:t>
-            </w:r>
+              <w:t xml:space="preserve">500 </w:t>
+            </w:r>
+            <w:proofErr w:type="spellStart"/>
+            <w:r>
+              <w:rPr>
+                <w:rFonts w:ascii="Calibri" w:eastAsia="Times New Roman" w:hAnsi="Calibri" w:cs="Calibri"/>
+              </w:rPr>
+              <w:t>ms</w:t>
+            </w:r>
+            <w:proofErr w:type="spellEnd"/>
           </w:p>
         </w:tc>
         <w:tc>
@@ -12698,7 +12869,7 @@
               <w:rPr>
                 <w:rFonts w:ascii="Calibri" w:eastAsia="Times New Roman" w:hAnsi="Calibri" w:cs="Calibri"/>
               </w:rPr>
-              <w:t>PAPER_ECO</w:t>
+              <w:t>NAME_ID</w:t>
             </w:r>
           </w:p>
         </w:tc>
@@ -12717,7 +12888,7 @@
               <w:rPr>
                 <w:rFonts w:ascii="Calibri" w:eastAsia="Times New Roman" w:hAnsi="Calibri" w:cs="Calibri"/>
               </w:rPr>
-              <w:t>Distance in mm to ignore shot and not move paper</w:t>
+              <w:t>Index to select a target name for FET-</w:t>
             </w:r>
           </w:p>
         </w:tc>
@@ -12727,46 +12898,16 @@
           </w:tcPr>
           <w:p>
             <w:pPr>
-              <w:rPr>
-                <w:rFonts w:ascii="Calibri" w:eastAsia="Times New Roman" w:hAnsi="Calibri" w:cs="Calibri"/>
-              </w:rPr>
-            </w:pPr>
-            <w:r>
-              <w:rPr>
-                <w:rFonts w:ascii="Calibri" w:eastAsia="Times New Roman" w:hAnsi="Calibri" w:cs="Calibri"/>
-              </w:rPr>
-              <w:t xml:space="preserve">0 – Disabled, </w:t>
-            </w:r>
-          </w:p>
-          <w:p>
-            <w:pPr>
-              <w:rPr>
-                <w:rFonts w:ascii="Calibri" w:eastAsia="Times New Roman" w:hAnsi="Calibri" w:cs="Calibri"/>
-              </w:rPr>
-            </w:pPr>
-            <w:r>
-              <w:rPr>
-                <w:rFonts w:ascii="Calibri" w:eastAsia="Times New Roman" w:hAnsi="Calibri" w:cs="Calibri"/>
-              </w:rPr>
-              <w:t>1</w:t>
-            </w:r>
-            <w:r>
-              <w:rPr>
-                <w:rFonts w:ascii="Calibri" w:eastAsia="Times New Roman" w:hAnsi="Calibri" w:cs="Calibri"/>
-              </w:rPr>
-              <w:t xml:space="preserve"> to </w:t>
-            </w:r>
-            <w:r>
-              <w:rPr>
-                <w:rFonts w:ascii="Calibri" w:eastAsia="Times New Roman" w:hAnsi="Calibri" w:cs="Calibri"/>
-              </w:rPr>
-              <w:t>100</w:t>
-            </w:r>
-            <w:r>
-              <w:rPr>
-                <w:rFonts w:ascii="Calibri" w:eastAsia="Times New Roman" w:hAnsi="Calibri" w:cs="Calibri"/>
-              </w:rPr>
-              <w:t xml:space="preserve"> mm</w:t>
+              <w:spacing w:before="100" w:beforeAutospacing="1" w:after="100" w:afterAutospacing="1"/>
+              <w:rPr>
+                <w:rFonts w:ascii="Calibri" w:eastAsia="Times New Roman" w:hAnsi="Calibri" w:cs="Calibri"/>
+              </w:rPr>
+            </w:pPr>
+            <w:r>
+              <w:rPr>
+                <w:rFonts w:ascii="Calibri" w:eastAsia="Times New Roman" w:hAnsi="Calibri" w:cs="Calibri"/>
+              </w:rPr>
+              <w:t>0-31, default 0</w:t>
             </w:r>
           </w:p>
         </w:tc>
@@ -12807,7 +12948,7 @@
               <w:rPr>
                 <w:rFonts w:ascii="Calibri" w:eastAsia="Times New Roman" w:hAnsi="Calibri" w:cs="Calibri"/>
               </w:rPr>
-              <w:t>PAPER_SHOT</w:t>
+              <w:t>PAPER_ECO</w:t>
             </w:r>
           </w:p>
         </w:tc>
@@ -12826,7 +12967,7 @@
               <w:rPr>
                 <w:rFonts w:ascii="Calibri" w:eastAsia="Times New Roman" w:hAnsi="Calibri" w:cs="Calibri"/>
               </w:rPr>
-              <w:t>How many shots to fire before advancing paper</w:t>
+              <w:t>Distance in mm to ignore shot and not move paper</w:t>
             </w:r>
           </w:p>
         </w:tc>
@@ -12844,7 +12985,38 @@
               <w:rPr>
                 <w:rFonts w:ascii="Calibri" w:eastAsia="Times New Roman" w:hAnsi="Calibri" w:cs="Calibri"/>
               </w:rPr>
-              <w:t>0 – Advance every time</w:t>
+              <w:t xml:space="preserve">0 – Disabled, </w:t>
+            </w:r>
+          </w:p>
+          <w:p>
+            <w:pPr>
+              <w:rPr>
+                <w:rFonts w:ascii="Calibri" w:eastAsia="Times New Roman" w:hAnsi="Calibri" w:cs="Calibri"/>
+              </w:rPr>
+            </w:pPr>
+            <w:r>
+              <w:rPr>
+                <w:rFonts w:ascii="Calibri" w:eastAsia="Times New Roman" w:hAnsi="Calibri" w:cs="Calibri"/>
+              </w:rPr>
+              <w:t>1</w:t>
+            </w:r>
+            <w:r>
+              <w:rPr>
+                <w:rFonts w:ascii="Calibri" w:eastAsia="Times New Roman" w:hAnsi="Calibri" w:cs="Calibri"/>
+              </w:rPr>
+              <w:t xml:space="preserve"> to </w:t>
+            </w:r>
+            <w:r>
+              <w:rPr>
+                <w:rFonts w:ascii="Calibri" w:eastAsia="Times New Roman" w:hAnsi="Calibri" w:cs="Calibri"/>
+              </w:rPr>
+              <w:t>100</w:t>
+            </w:r>
+            <w:r>
+              <w:rPr>
+                <w:rFonts w:ascii="Calibri" w:eastAsia="Times New Roman" w:hAnsi="Calibri" w:cs="Calibri"/>
+              </w:rPr>
+              <w:t xml:space="preserve"> mm</w:t>
             </w:r>
           </w:p>
         </w:tc>
@@ -12885,7 +13057,7 @@
               <w:rPr>
                 <w:rFonts w:ascii="Calibri" w:eastAsia="Times New Roman" w:hAnsi="Calibri" w:cs="Calibri"/>
               </w:rPr>
-              <w:t>PAPER_TIME</w:t>
+              <w:t>PAPER_SHOT</w:t>
             </w:r>
           </w:p>
         </w:tc>
@@ -12904,7 +13076,7 @@
               <w:rPr>
                 <w:rFonts w:ascii="Calibri" w:eastAsia="Times New Roman" w:hAnsi="Calibri" w:cs="Calibri"/>
               </w:rPr>
-              <w:t>Sets the time the motor turns to advance the witness paper</w:t>
+              <w:t>How many shots to fire before advancing paper</w:t>
             </w:r>
           </w:p>
         </w:tc>
@@ -12914,16 +13086,15 @@
           </w:tcPr>
           <w:p>
             <w:pPr>
-              <w:spacing w:before="100" w:beforeAutospacing="1" w:after="100" w:afterAutospacing="1"/>
-              <w:rPr>
-                <w:rFonts w:ascii="Calibri" w:eastAsia="Times New Roman" w:hAnsi="Calibri" w:cs="Calibri"/>
-              </w:rPr>
-            </w:pPr>
-            <w:r>
-              <w:rPr>
-                <w:rFonts w:ascii="Calibri" w:eastAsia="Times New Roman" w:hAnsi="Calibri" w:cs="Calibri"/>
-              </w:rPr>
-              <w:t>500ms</w:t>
+              <w:rPr>
+                <w:rFonts w:ascii="Calibri" w:eastAsia="Times New Roman" w:hAnsi="Calibri" w:cs="Calibri"/>
+              </w:rPr>
+            </w:pPr>
+            <w:r>
+              <w:rPr>
+                <w:rFonts w:ascii="Calibri" w:eastAsia="Times New Roman" w:hAnsi="Calibri" w:cs="Calibri"/>
+              </w:rPr>
+              <w:t>0 – Advance every time</w:t>
             </w:r>
           </w:p>
         </w:tc>
@@ -12964,7 +13135,7 @@
               <w:rPr>
                 <w:rFonts w:ascii="Calibri" w:eastAsia="Times New Roman" w:hAnsi="Calibri" w:cs="Calibri"/>
               </w:rPr>
-              <w:t xml:space="preserve">PCNT_LATENCY":    </w:t>
+              <w:t>PAPER_TIME</w:t>
             </w:r>
           </w:p>
         </w:tc>
@@ -12983,7 +13154,7 @@
               <w:rPr>
                 <w:rFonts w:ascii="Calibri" w:eastAsia="Times New Roman" w:hAnsi="Calibri" w:cs="Calibri"/>
               </w:rPr>
-              <w:t>Uses a calibrated offset to improve the detection accuracy</w:t>
+              <w:t>Sets the time the motor turns to advance the witness paper</w:t>
             </w:r>
           </w:p>
         </w:tc>
@@ -13002,7 +13173,7 @@
               <w:rPr>
                 <w:rFonts w:ascii="Calibri" w:eastAsia="Times New Roman" w:hAnsi="Calibri" w:cs="Calibri"/>
               </w:rPr>
-              <w:t>0 – Disabled, 32 Typical</w:t>
+              <w:t>500ms</w:t>
             </w:r>
           </w:p>
         </w:tc>
@@ -13043,7 +13214,7 @@
               <w:rPr>
                 <w:rFonts w:ascii="Calibri" w:eastAsia="Times New Roman" w:hAnsi="Calibri" w:cs="Calibri"/>
               </w:rPr>
-              <w:t>POWER_SAVE</w:t>
+              <w:t xml:space="preserve">PCNT_LATENCY":    </w:t>
             </w:r>
           </w:p>
         </w:tc>
@@ -13062,7 +13233,7 @@
               <w:rPr>
                 <w:rFonts w:ascii="Calibri" w:eastAsia="Times New Roman" w:hAnsi="Calibri" w:cs="Calibri"/>
               </w:rPr>
-              <w:t>Idle time in minutes before going to sleep</w:t>
+              <w:t>Uses a calibrated offset to improve the detection accuracy</w:t>
             </w:r>
           </w:p>
         </w:tc>
@@ -13081,7 +13252,7 @@
               <w:rPr>
                 <w:rFonts w:ascii="Calibri" w:eastAsia="Times New Roman" w:hAnsi="Calibri" w:cs="Calibri"/>
               </w:rPr>
-              <w:t>0 – Off, Typical 30 minutes</w:t>
+              <w:t>0 – Disabled, 32 Typical</w:t>
             </w:r>
           </w:p>
         </w:tc>
@@ -13122,7 +13293,7 @@
               <w:rPr>
                 <w:rFonts w:ascii="Calibri" w:eastAsia="Times New Roman" w:hAnsi="Calibri" w:cs="Calibri"/>
               </w:rPr>
-              <w:t>RAPID_COUNT</w:t>
+              <w:t>POWER_SAVE</w:t>
             </w:r>
           </w:p>
         </w:tc>
@@ -13141,21 +13312,7 @@
               <w:rPr>
                 <w:rFonts w:ascii="Calibri" w:eastAsia="Times New Roman" w:hAnsi="Calibri" w:cs="Calibri"/>
               </w:rPr>
-              <w:t xml:space="preserve">How many shots in a </w:t>
-            </w:r>
-            <w:proofErr w:type="gramStart"/>
-            <w:r>
-              <w:rPr>
-                <w:rFonts w:ascii="Calibri" w:eastAsia="Times New Roman" w:hAnsi="Calibri" w:cs="Calibri"/>
-              </w:rPr>
-              <w:t>rapid fire</w:t>
-            </w:r>
-            <w:proofErr w:type="gramEnd"/>
-            <w:r>
-              <w:rPr>
-                <w:rFonts w:ascii="Calibri" w:eastAsia="Times New Roman" w:hAnsi="Calibri" w:cs="Calibri"/>
-              </w:rPr>
-              <w:t xml:space="preserve"> string</w:t>
+              <w:t>Idle time in minutes before going to sleep</w:t>
             </w:r>
           </w:p>
         </w:tc>
@@ -13170,6 +13327,12 @@
                 <w:rFonts w:ascii="Calibri" w:eastAsia="Times New Roman" w:hAnsi="Calibri" w:cs="Calibri"/>
               </w:rPr>
             </w:pPr>
+            <w:r>
+              <w:rPr>
+                <w:rFonts w:ascii="Calibri" w:eastAsia="Times New Roman" w:hAnsi="Calibri" w:cs="Calibri"/>
+              </w:rPr>
+              <w:t>0 – Off, Typical 30 minutes</w:t>
+            </w:r>
           </w:p>
         </w:tc>
         <w:tc>
@@ -13188,7 +13351,7 @@
               <w:rPr>
                 <w:rFonts w:ascii="Calibri" w:eastAsia="Times New Roman" w:hAnsi="Calibri" w:cs="Calibri"/>
               </w:rPr>
-              <w:t>N</w:t>
+              <w:t>Y</w:t>
             </w:r>
           </w:p>
         </w:tc>
@@ -13209,7 +13372,7 @@
               <w:rPr>
                 <w:rFonts w:ascii="Calibri" w:eastAsia="Times New Roman" w:hAnsi="Calibri" w:cs="Calibri"/>
               </w:rPr>
-              <w:t>RAPID_ENABLE</w:t>
+              <w:t>RAPID_COUNT</w:t>
             </w:r>
           </w:p>
         </w:tc>
@@ -13228,7 +13391,21 @@
               <w:rPr>
                 <w:rFonts w:ascii="Calibri" w:eastAsia="Times New Roman" w:hAnsi="Calibri" w:cs="Calibri"/>
               </w:rPr>
-              <w:t>Enable rapid fire mode</w:t>
+              <w:t xml:space="preserve">How many shots in a </w:t>
+            </w:r>
+            <w:proofErr w:type="gramStart"/>
+            <w:r>
+              <w:rPr>
+                <w:rFonts w:ascii="Calibri" w:eastAsia="Times New Roman" w:hAnsi="Calibri" w:cs="Calibri"/>
+              </w:rPr>
+              <w:t>rapid fire</w:t>
+            </w:r>
+            <w:proofErr w:type="gramEnd"/>
+            <w:r>
+              <w:rPr>
+                <w:rFonts w:ascii="Calibri" w:eastAsia="Times New Roman" w:hAnsi="Calibri" w:cs="Calibri"/>
+              </w:rPr>
+              <w:t xml:space="preserve"> string</w:t>
             </w:r>
           </w:p>
         </w:tc>
@@ -13243,12 +13420,6 @@
                 <w:rFonts w:ascii="Calibri" w:eastAsia="Times New Roman" w:hAnsi="Calibri" w:cs="Calibri"/>
               </w:rPr>
             </w:pPr>
-            <w:r>
-              <w:rPr>
-                <w:rFonts w:ascii="Calibri" w:eastAsia="Times New Roman" w:hAnsi="Calibri" w:cs="Calibri"/>
-              </w:rPr>
-              <w:t>1 - Enable</w:t>
-            </w:r>
           </w:p>
         </w:tc>
         <w:tc>
@@ -13288,7 +13459,7 @@
               <w:rPr>
                 <w:rFonts w:ascii="Calibri" w:eastAsia="Times New Roman" w:hAnsi="Calibri" w:cs="Calibri"/>
               </w:rPr>
-              <w:t>RAPID_TIME</w:t>
+              <w:t>RAPID_ENABLE</w:t>
             </w:r>
           </w:p>
         </w:tc>
@@ -13307,21 +13478,7 @@
               <w:rPr>
                 <w:rFonts w:ascii="Calibri" w:eastAsia="Times New Roman" w:hAnsi="Calibri" w:cs="Calibri"/>
               </w:rPr>
-              <w:t xml:space="preserve">How long will the </w:t>
-            </w:r>
-            <w:proofErr w:type="gramStart"/>
-            <w:r>
-              <w:rPr>
-                <w:rFonts w:ascii="Calibri" w:eastAsia="Times New Roman" w:hAnsi="Calibri" w:cs="Calibri"/>
-              </w:rPr>
-              <w:t>rapid fire</w:t>
-            </w:r>
-            <w:proofErr w:type="gramEnd"/>
-            <w:r>
-              <w:rPr>
-                <w:rFonts w:ascii="Calibri" w:eastAsia="Times New Roman" w:hAnsi="Calibri" w:cs="Calibri"/>
-              </w:rPr>
-              <w:t xml:space="preserve"> event last in seconds</w:t>
+              <w:t>Enable rapid fire mode</w:t>
             </w:r>
           </w:p>
         </w:tc>
@@ -13336,6 +13493,12 @@
                 <w:rFonts w:ascii="Calibri" w:eastAsia="Times New Roman" w:hAnsi="Calibri" w:cs="Calibri"/>
               </w:rPr>
             </w:pPr>
+            <w:r>
+              <w:rPr>
+                <w:rFonts w:ascii="Calibri" w:eastAsia="Times New Roman" w:hAnsi="Calibri" w:cs="Calibri"/>
+              </w:rPr>
+              <w:t>1 - Enable</w:t>
+            </w:r>
           </w:p>
         </w:tc>
         <w:tc>
@@ -13375,7 +13538,7 @@
               <w:rPr>
                 <w:rFonts w:ascii="Calibri" w:eastAsia="Times New Roman" w:hAnsi="Calibri" w:cs="Calibri"/>
               </w:rPr>
-              <w:t>RAPID_WAIT</w:t>
+              <w:t>RAPID_TIME</w:t>
             </w:r>
           </w:p>
         </w:tc>
@@ -13394,7 +13557,21 @@
               <w:rPr>
                 <w:rFonts w:ascii="Calibri" w:eastAsia="Times New Roman" w:hAnsi="Calibri" w:cs="Calibri"/>
               </w:rPr>
-              <w:t>How long to delay after rapid fire has been enabled</w:t>
+              <w:t xml:space="preserve">How long will the </w:t>
+            </w:r>
+            <w:proofErr w:type="gramStart"/>
+            <w:r>
+              <w:rPr>
+                <w:rFonts w:ascii="Calibri" w:eastAsia="Times New Roman" w:hAnsi="Calibri" w:cs="Calibri"/>
+              </w:rPr>
+              <w:t>rapid fire</w:t>
+            </w:r>
+            <w:proofErr w:type="gramEnd"/>
+            <w:r>
+              <w:rPr>
+                <w:rFonts w:ascii="Calibri" w:eastAsia="Times New Roman" w:hAnsi="Calibri" w:cs="Calibri"/>
+              </w:rPr>
+              <w:t xml:space="preserve"> event last in seconds</w:t>
             </w:r>
           </w:p>
         </w:tc>
@@ -13448,7 +13625,7 @@
               <w:rPr>
                 <w:rFonts w:ascii="Calibri" w:eastAsia="Times New Roman" w:hAnsi="Calibri" w:cs="Calibri"/>
               </w:rPr>
-              <w:t>SEND_MISS</w:t>
+              <w:t>RAPID_WAIT</w:t>
             </w:r>
           </w:p>
         </w:tc>
@@ -13467,7 +13644,7 @@
               <w:rPr>
                 <w:rFonts w:ascii="Calibri" w:eastAsia="Times New Roman" w:hAnsi="Calibri" w:cs="Calibri"/>
               </w:rPr>
-              <w:t>Send a record to the PC whenever a shot has been missed</w:t>
+              <w:t>How long to delay after rapid fire has been enabled</w:t>
             </w:r>
           </w:p>
         </w:tc>
@@ -13482,12 +13659,6 @@
                 <w:rFonts w:ascii="Calibri" w:eastAsia="Times New Roman" w:hAnsi="Calibri" w:cs="Calibri"/>
               </w:rPr>
             </w:pPr>
-            <w:r>
-              <w:rPr>
-                <w:rFonts w:ascii="Calibri" w:eastAsia="Times New Roman" w:hAnsi="Calibri" w:cs="Calibri"/>
-              </w:rPr>
-              <w:t>0 – Miss not sent</w:t>
-            </w:r>
           </w:p>
         </w:tc>
         <w:tc>
@@ -13506,7 +13677,7 @@
               <w:rPr>
                 <w:rFonts w:ascii="Calibri" w:eastAsia="Times New Roman" w:hAnsi="Calibri" w:cs="Calibri"/>
               </w:rPr>
-              <w:t>Y</w:t>
+              <w:t>N</w:t>
             </w:r>
           </w:p>
         </w:tc>
@@ -13527,13 +13698,7 @@
               <w:rPr>
                 <w:rFonts w:ascii="Calibri" w:eastAsia="Times New Roman" w:hAnsi="Calibri" w:cs="Calibri"/>
               </w:rPr>
-              <w:t>SENSOR</w:t>
-            </w:r>
-            <w:r>
-              <w:rPr>
-                <w:rFonts w:ascii="Calibri" w:eastAsia="Times New Roman" w:hAnsi="Calibri" w:cs="Calibri"/>
-              </w:rPr>
-              <w:t>_DIA</w:t>
+              <w:t>REMOTE_ACTIVE</w:t>
             </w:r>
           </w:p>
         </w:tc>
@@ -13552,7 +13717,7 @@
               <w:rPr>
                 <w:rFonts w:ascii="Calibri" w:eastAsia="Times New Roman" w:hAnsi="Calibri" w:cs="Calibri"/>
               </w:rPr>
-              <w:t>Calibrated distance between sensor faces</w:t>
+              <w:t>Is there a remote server that can receive scores</w:t>
             </w:r>
           </w:p>
         </w:tc>
@@ -13571,19 +13736,7 @@
               <w:rPr>
                 <w:rFonts w:ascii="Calibri" w:eastAsia="Times New Roman" w:hAnsi="Calibri" w:cs="Calibri"/>
               </w:rPr>
-              <w:t>232</w:t>
-            </w:r>
-            <w:r>
-              <w:rPr>
-                <w:rFonts w:ascii="Calibri" w:eastAsia="Times New Roman" w:hAnsi="Calibri" w:cs="Calibri"/>
-              </w:rPr>
-              <w:t xml:space="preserve">mm </w:t>
-            </w:r>
-            <w:r>
-              <w:rPr>
-                <w:rFonts w:ascii="Calibri" w:eastAsia="Times New Roman" w:hAnsi="Calibri" w:cs="Calibri"/>
-              </w:rPr>
-              <w:t>for air pistol or air rifle</w:t>
+              <w:t>1 – Enable</w:t>
             </w:r>
           </w:p>
         </w:tc>
@@ -13624,7 +13777,7 @@
               <w:rPr>
                 <w:rFonts w:ascii="Calibri" w:eastAsia="Times New Roman" w:hAnsi="Calibri" w:cs="Calibri"/>
               </w:rPr>
-              <w:t>SN</w:t>
+              <w:t>REMOTE_KEY</w:t>
             </w:r>
           </w:p>
         </w:tc>
@@ -13643,7 +13796,7 @@
               <w:rPr>
                 <w:rFonts w:ascii="Calibri" w:eastAsia="Times New Roman" w:hAnsi="Calibri" w:cs="Calibri"/>
               </w:rPr>
-              <w:t>Serial number</w:t>
+              <w:t xml:space="preserve">Access key for authentication </w:t>
             </w:r>
           </w:p>
         </w:tc>
@@ -13662,7 +13815,7 @@
               <w:rPr>
                 <w:rFonts w:ascii="Calibri" w:eastAsia="Times New Roman" w:hAnsi="Calibri" w:cs="Calibri"/>
               </w:rPr>
-              <w:t>Cannot be changed</w:t>
+              <w:t>Text String</w:t>
             </w:r>
           </w:p>
         </w:tc>
@@ -13678,6 +13831,12 @@
                 <w:rFonts w:ascii="Calibri" w:eastAsia="Times New Roman" w:hAnsi="Calibri" w:cs="Calibri"/>
               </w:rPr>
             </w:pPr>
+            <w:r>
+              <w:rPr>
+                <w:rFonts w:ascii="Calibri" w:eastAsia="Times New Roman" w:hAnsi="Calibri" w:cs="Calibri"/>
+              </w:rPr>
+              <w:t>Y</w:t>
+            </w:r>
           </w:p>
         </w:tc>
       </w:tr>
@@ -13697,7 +13856,7 @@
               <w:rPr>
                 <w:rFonts w:ascii="Calibri" w:eastAsia="Times New Roman" w:hAnsi="Calibri" w:cs="Calibri"/>
               </w:rPr>
-              <w:t>STEP_COUNT</w:t>
+              <w:t>REMOTE_URL</w:t>
             </w:r>
           </w:p>
         </w:tc>
@@ -13716,7 +13875,7 @@
               <w:rPr>
                 <w:rFonts w:ascii="Calibri" w:eastAsia="Times New Roman" w:hAnsi="Calibri" w:cs="Calibri"/>
               </w:rPr>
-              <w:t>How many steps to issue stepper motor witness paper</w:t>
+              <w:t>URL of the remote server</w:t>
             </w:r>
           </w:p>
         </w:tc>
@@ -13735,7 +13894,7 @@
               <w:rPr>
                 <w:rFonts w:ascii="Calibri" w:eastAsia="Times New Roman" w:hAnsi="Calibri" w:cs="Calibri"/>
               </w:rPr>
-              <w:t>0 – Disabled</w:t>
+              <w:t>IP Address (ex “192.168.1.1”)</w:t>
             </w:r>
           </w:p>
         </w:tc>
@@ -13776,7 +13935,7 @@
               <w:rPr>
                 <w:rFonts w:ascii="Calibri" w:eastAsia="Times New Roman" w:hAnsi="Calibri" w:cs="Calibri"/>
               </w:rPr>
-              <w:t>STEP_RAMP</w:t>
+              <w:t>SEND_MISS</w:t>
             </w:r>
           </w:p>
         </w:tc>
@@ -13795,7 +13954,7 @@
               <w:rPr>
                 <w:rFonts w:ascii="Calibri" w:eastAsia="Times New Roman" w:hAnsi="Calibri" w:cs="Calibri"/>
               </w:rPr>
-              <w:t>How many cycles to change during ramp-up</w:t>
+              <w:t>Send a record to the PC whenever a shot has been missed</w:t>
             </w:r>
           </w:p>
         </w:tc>
@@ -13814,7 +13973,7 @@
               <w:rPr>
                 <w:rFonts w:ascii="Calibri" w:eastAsia="Times New Roman" w:hAnsi="Calibri" w:cs="Calibri"/>
               </w:rPr>
-              <w:t>0 – Disabled</w:t>
+              <w:t>0 – Miss not sent</w:t>
             </w:r>
           </w:p>
         </w:tc>
@@ -13855,7 +14014,13 @@
               <w:rPr>
                 <w:rFonts w:ascii="Calibri" w:eastAsia="Times New Roman" w:hAnsi="Calibri" w:cs="Calibri"/>
               </w:rPr>
-              <w:t>STEP_START</w:t>
+              <w:t>SENSOR</w:t>
+            </w:r>
+            <w:r>
+              <w:rPr>
+                <w:rFonts w:ascii="Calibri" w:eastAsia="Times New Roman" w:hAnsi="Calibri" w:cs="Calibri"/>
+              </w:rPr>
+              <w:t>_DIA</w:t>
             </w:r>
           </w:p>
         </w:tc>
@@ -13874,7 +14039,7 @@
               <w:rPr>
                 <w:rFonts w:ascii="Calibri" w:eastAsia="Times New Roman" w:hAnsi="Calibri" w:cs="Calibri"/>
               </w:rPr>
-              <w:t>Number of cycles to start stepping at</w:t>
+              <w:t>Calibrated distance between sensor faces</w:t>
             </w:r>
           </w:p>
         </w:tc>
@@ -13893,7 +14058,19 @@
               <w:rPr>
                 <w:rFonts w:ascii="Calibri" w:eastAsia="Times New Roman" w:hAnsi="Calibri" w:cs="Calibri"/>
               </w:rPr>
-              <w:t>0 – Disabled</w:t>
+              <w:t>232</w:t>
+            </w:r>
+            <w:r>
+              <w:rPr>
+                <w:rFonts w:ascii="Calibri" w:eastAsia="Times New Roman" w:hAnsi="Calibri" w:cs="Calibri"/>
+              </w:rPr>
+              <w:t xml:space="preserve">mm </w:t>
+            </w:r>
+            <w:r>
+              <w:rPr>
+                <w:rFonts w:ascii="Calibri" w:eastAsia="Times New Roman" w:hAnsi="Calibri" w:cs="Calibri"/>
+              </w:rPr>
+              <w:t>for air pistol or air rifle</w:t>
             </w:r>
           </w:p>
         </w:tc>
@@ -13934,7 +14111,7 @@
               <w:rPr>
                 <w:rFonts w:ascii="Calibri" w:eastAsia="Times New Roman" w:hAnsi="Calibri" w:cs="Calibri"/>
               </w:rPr>
-              <w:t>STEP_TIME</w:t>
+              <w:t>STEP_COUNT</w:t>
             </w:r>
           </w:p>
         </w:tc>
@@ -13953,21 +14130,7 @@
               <w:rPr>
                 <w:rFonts w:ascii="Calibri" w:eastAsia="Times New Roman" w:hAnsi="Calibri" w:cs="Calibri"/>
               </w:rPr>
-              <w:t xml:space="preserve">Time interval in </w:t>
-            </w:r>
-            <w:proofErr w:type="spellStart"/>
-            <w:r>
-              <w:rPr>
-                <w:rFonts w:ascii="Calibri" w:eastAsia="Times New Roman" w:hAnsi="Calibri" w:cs="Calibri"/>
-              </w:rPr>
-              <w:t>ms</w:t>
-            </w:r>
-            <w:proofErr w:type="spellEnd"/>
-            <w:r>
-              <w:rPr>
-                <w:rFonts w:ascii="Calibri" w:eastAsia="Times New Roman" w:hAnsi="Calibri" w:cs="Calibri"/>
-              </w:rPr>
-              <w:t xml:space="preserve"> between steps</w:t>
+              <w:t>How many steps to issue stepper motor witness paper</w:t>
             </w:r>
           </w:p>
         </w:tc>
@@ -14027,7 +14190,7 @@
               <w:rPr>
                 <w:rFonts w:ascii="Calibri" w:eastAsia="Times New Roman" w:hAnsi="Calibri" w:cs="Calibri"/>
               </w:rPr>
-              <w:t>TABATA_ENABLE</w:t>
+              <w:t>STEP_RAMP</w:t>
             </w:r>
           </w:p>
         </w:tc>
@@ -14046,7 +14209,7 @@
               <w:rPr>
                 <w:rFonts w:ascii="Calibri" w:eastAsia="Times New Roman" w:hAnsi="Calibri" w:cs="Calibri"/>
               </w:rPr>
-              <w:t>Enable the Tabata training mode</w:t>
+              <w:t>How many cycles to change during ramp-up</w:t>
             </w:r>
           </w:p>
         </w:tc>
@@ -14085,7 +14248,7 @@
               <w:rPr>
                 <w:rFonts w:ascii="Calibri" w:eastAsia="Times New Roman" w:hAnsi="Calibri" w:cs="Calibri"/>
               </w:rPr>
-              <w:t>N</w:t>
+              <w:t>Y</w:t>
             </w:r>
           </w:p>
         </w:tc>
@@ -14106,7 +14269,7 @@
               <w:rPr>
                 <w:rFonts w:ascii="Calibri" w:eastAsia="Times New Roman" w:hAnsi="Calibri" w:cs="Calibri"/>
               </w:rPr>
-              <w:t>TABATA_ON</w:t>
+              <w:t>STEP_START</w:t>
             </w:r>
           </w:p>
         </w:tc>
@@ -14125,19 +14288,7 @@
               <w:rPr>
                 <w:rFonts w:ascii="Calibri" w:eastAsia="Times New Roman" w:hAnsi="Calibri" w:cs="Calibri"/>
               </w:rPr>
-              <w:t xml:space="preserve">Time in seconds </w:t>
-            </w:r>
-            <w:r>
-              <w:rPr>
-                <w:rFonts w:ascii="Calibri" w:eastAsia="Times New Roman" w:hAnsi="Calibri" w:cs="Calibri"/>
-              </w:rPr>
-              <w:t xml:space="preserve">that the </w:t>
-            </w:r>
-            <w:r>
-              <w:rPr>
-                <w:rFonts w:ascii="Calibri" w:eastAsia="Times New Roman" w:hAnsi="Calibri" w:cs="Calibri"/>
-              </w:rPr>
-              <w:t>LEDs are on during a Tabata cycle</w:t>
+              <w:t>Number of cycles to start stepping at</w:t>
             </w:r>
           </w:p>
         </w:tc>
@@ -14152,6 +14303,12 @@
                 <w:rFonts w:ascii="Calibri" w:eastAsia="Times New Roman" w:hAnsi="Calibri" w:cs="Calibri"/>
               </w:rPr>
             </w:pPr>
+            <w:r>
+              <w:rPr>
+                <w:rFonts w:ascii="Calibri" w:eastAsia="Times New Roman" w:hAnsi="Calibri" w:cs="Calibri"/>
+              </w:rPr>
+              <w:t>0 – Disabled</w:t>
+            </w:r>
           </w:p>
         </w:tc>
         <w:tc>
@@ -14170,7 +14327,7 @@
               <w:rPr>
                 <w:rFonts w:ascii="Calibri" w:eastAsia="Times New Roman" w:hAnsi="Calibri" w:cs="Calibri"/>
               </w:rPr>
-              <w:t>N</w:t>
+              <w:t>Y</w:t>
             </w:r>
           </w:p>
         </w:tc>
@@ -14191,7 +14348,7 @@
               <w:rPr>
                 <w:rFonts w:ascii="Calibri" w:eastAsia="Times New Roman" w:hAnsi="Calibri" w:cs="Calibri"/>
               </w:rPr>
-              <w:t>TABATA_REST</w:t>
+              <w:t>STEP_TIME</w:t>
             </w:r>
           </w:p>
         </w:tc>
@@ -14210,7 +14367,21 @@
               <w:rPr>
                 <w:rFonts w:ascii="Calibri" w:eastAsia="Times New Roman" w:hAnsi="Calibri" w:cs="Calibri"/>
               </w:rPr>
-              <w:t>Time in seconds that the LEDs are off between shots</w:t>
+              <w:t xml:space="preserve">Time interval in </w:t>
+            </w:r>
+            <w:proofErr w:type="spellStart"/>
+            <w:r>
+              <w:rPr>
+                <w:rFonts w:ascii="Calibri" w:eastAsia="Times New Roman" w:hAnsi="Calibri" w:cs="Calibri"/>
+              </w:rPr>
+              <w:t>ms</w:t>
+            </w:r>
+            <w:proofErr w:type="spellEnd"/>
+            <w:r>
+              <w:rPr>
+                <w:rFonts w:ascii="Calibri" w:eastAsia="Times New Roman" w:hAnsi="Calibri" w:cs="Calibri"/>
+              </w:rPr>
+              <w:t xml:space="preserve"> between steps</w:t>
             </w:r>
           </w:p>
         </w:tc>
@@ -14225,6 +14396,12 @@
                 <w:rFonts w:ascii="Calibri" w:eastAsia="Times New Roman" w:hAnsi="Calibri" w:cs="Calibri"/>
               </w:rPr>
             </w:pPr>
+            <w:r>
+              <w:rPr>
+                <w:rFonts w:ascii="Calibri" w:eastAsia="Times New Roman" w:hAnsi="Calibri" w:cs="Calibri"/>
+              </w:rPr>
+              <w:t>0 – Disabled</w:t>
+            </w:r>
           </w:p>
         </w:tc>
         <w:tc>
@@ -14243,7 +14420,7 @@
               <w:rPr>
                 <w:rFonts w:ascii="Calibri" w:eastAsia="Times New Roman" w:hAnsi="Calibri" w:cs="Calibri"/>
               </w:rPr>
-              <w:t>N</w:t>
+              <w:t>Y</w:t>
             </w:r>
           </w:p>
         </w:tc>
@@ -14264,7 +14441,7 @@
               <w:rPr>
                 <w:rFonts w:ascii="Calibri" w:eastAsia="Times New Roman" w:hAnsi="Calibri" w:cs="Calibri"/>
               </w:rPr>
-              <w:t>TABATA_WARN_OFF</w:t>
+              <w:t>TABATA_ENABLE</w:t>
             </w:r>
           </w:p>
         </w:tc>
@@ -14283,7 +14460,7 @@
               <w:rPr>
                 <w:rFonts w:ascii="Calibri" w:eastAsia="Times New Roman" w:hAnsi="Calibri" w:cs="Calibri"/>
               </w:rPr>
-              <w:t>Time in seconds that the LEDs are off after the warning</w:t>
+              <w:t>Enable the Tabata training mode</w:t>
             </w:r>
           </w:p>
         </w:tc>
@@ -14298,6 +14475,12 @@
                 <w:rFonts w:ascii="Calibri" w:eastAsia="Times New Roman" w:hAnsi="Calibri" w:cs="Calibri"/>
               </w:rPr>
             </w:pPr>
+            <w:r>
+              <w:rPr>
+                <w:rFonts w:ascii="Calibri" w:eastAsia="Times New Roman" w:hAnsi="Calibri" w:cs="Calibri"/>
+              </w:rPr>
+              <w:t>0 – Disabled</w:t>
+            </w:r>
           </w:p>
         </w:tc>
         <w:tc>
@@ -14338,13 +14521,7 @@
                 <w:rFonts w:ascii="Calibri" w:eastAsia="Times New Roman" w:hAnsi="Calibri" w:cs="Calibri"/>
               </w:rPr>
               <w:lastRenderedPageBreak/>
-              <w:t>TABATA_WARN_O</w:t>
-            </w:r>
-            <w:r>
-              <w:rPr>
-                <w:rFonts w:ascii="Calibri" w:eastAsia="Times New Roman" w:hAnsi="Calibri" w:cs="Calibri"/>
-              </w:rPr>
-              <w:t>N</w:t>
+              <w:t>TABATA_ON</w:t>
             </w:r>
           </w:p>
         </w:tc>
@@ -14363,7 +14540,19 @@
               <w:rPr>
                 <w:rFonts w:ascii="Calibri" w:eastAsia="Times New Roman" w:hAnsi="Calibri" w:cs="Calibri"/>
               </w:rPr>
-              <w:t>Time in seconds that the LEDs are on to warn the shooter</w:t>
+              <w:t xml:space="preserve">Time in seconds </w:t>
+            </w:r>
+            <w:r>
+              <w:rPr>
+                <w:rFonts w:ascii="Calibri" w:eastAsia="Times New Roman" w:hAnsi="Calibri" w:cs="Calibri"/>
+              </w:rPr>
+              <w:t xml:space="preserve">that the </w:t>
+            </w:r>
+            <w:r>
+              <w:rPr>
+                <w:rFonts w:ascii="Calibri" w:eastAsia="Times New Roman" w:hAnsi="Calibri" w:cs="Calibri"/>
+              </w:rPr>
+              <w:t>LEDs are on during a Tabata cycle</w:t>
             </w:r>
           </w:p>
         </w:tc>
@@ -14417,7 +14606,7 @@
               <w:rPr>
                 <w:rFonts w:ascii="Calibri" w:eastAsia="Times New Roman" w:hAnsi="Calibri" w:cs="Calibri"/>
               </w:rPr>
-              <w:t>TARGET_TYPE</w:t>
+              <w:t>TABATA_REST</w:t>
             </w:r>
           </w:p>
         </w:tc>
@@ -14436,7 +14625,7 @@
               <w:rPr>
                 <w:rFonts w:ascii="Calibri" w:eastAsia="Times New Roman" w:hAnsi="Calibri" w:cs="Calibri"/>
               </w:rPr>
-              <w:t>Target Override for alternate targets</w:t>
+              <w:t>Time in seconds that the LEDs are off between shots</w:t>
             </w:r>
           </w:p>
         </w:tc>
@@ -14446,68 +14635,11 @@
           </w:tcPr>
           <w:p>
             <w:pPr>
-              <w:rPr>
-                <w:rFonts w:ascii="Calibri" w:eastAsia="Times New Roman" w:hAnsi="Calibri" w:cs="Calibri"/>
-              </w:rPr>
-            </w:pPr>
-            <w:r>
-              <w:rPr>
-                <w:rFonts w:ascii="Calibri" w:eastAsia="Times New Roman" w:hAnsi="Calibri" w:cs="Calibri"/>
-              </w:rPr>
-              <w:t>0 – No override</w:t>
-            </w:r>
-          </w:p>
-          <w:p>
-            <w:pPr>
-              <w:rPr>
-                <w:rFonts w:ascii="Calibri" w:eastAsia="Times New Roman" w:hAnsi="Calibri" w:cs="Calibri"/>
-              </w:rPr>
-            </w:pPr>
-            <w:r>
-              <w:rPr>
-                <w:rFonts w:ascii="Calibri" w:eastAsia="Times New Roman" w:hAnsi="Calibri" w:cs="Calibri"/>
-              </w:rPr>
-              <w:t>4 – 5 bull target 74mm</w:t>
-            </w:r>
-          </w:p>
-          <w:p>
-            <w:pPr>
-              <w:rPr>
-                <w:rFonts w:ascii="Calibri" w:eastAsia="Times New Roman" w:hAnsi="Calibri" w:cs="Calibri"/>
-              </w:rPr>
-            </w:pPr>
-            <w:r>
-              <w:rPr>
-                <w:rFonts w:ascii="Calibri" w:eastAsia="Times New Roman" w:hAnsi="Calibri" w:cs="Calibri"/>
-              </w:rPr>
-              <w:t>5 – 5 bull target 79mm</w:t>
-            </w:r>
-          </w:p>
-          <w:p>
-            <w:pPr>
-              <w:rPr>
-                <w:rFonts w:ascii="Calibri" w:eastAsia="Times New Roman" w:hAnsi="Calibri" w:cs="Calibri"/>
-              </w:rPr>
-            </w:pPr>
-            <w:r>
-              <w:rPr>
-                <w:rFonts w:ascii="Calibri" w:eastAsia="Times New Roman" w:hAnsi="Calibri" w:cs="Calibri"/>
-              </w:rPr>
-              <w:t>11 – 10bull + sighters (Orion)</w:t>
-            </w:r>
-          </w:p>
-          <w:p>
-            <w:pPr>
-              <w:rPr>
-                <w:rFonts w:ascii="Calibri" w:eastAsia="Times New Roman" w:hAnsi="Calibri" w:cs="Calibri"/>
-              </w:rPr>
-            </w:pPr>
-            <w:r>
-              <w:rPr>
-                <w:rFonts w:ascii="Calibri" w:eastAsia="Times New Roman" w:hAnsi="Calibri" w:cs="Calibri"/>
-              </w:rPr>
-              <w:t>12 – 10 bull + sighters (NRA)</w:t>
-            </w:r>
+              <w:spacing w:before="100" w:beforeAutospacing="1" w:after="100" w:afterAutospacing="1"/>
+              <w:rPr>
+                <w:rFonts w:ascii="Calibri" w:eastAsia="Times New Roman" w:hAnsi="Calibri" w:cs="Calibri"/>
+              </w:rPr>
+            </w:pPr>
           </w:p>
         </w:tc>
         <w:tc>
@@ -14526,7 +14658,7 @@
               <w:rPr>
                 <w:rFonts w:ascii="Calibri" w:eastAsia="Times New Roman" w:hAnsi="Calibri" w:cs="Calibri"/>
               </w:rPr>
-              <w:t>Y</w:t>
+              <w:t>N</w:t>
             </w:r>
           </w:p>
         </w:tc>
@@ -14547,7 +14679,7 @@
               <w:rPr>
                 <w:rFonts w:ascii="Calibri" w:eastAsia="Times New Roman" w:hAnsi="Calibri" w:cs="Calibri"/>
               </w:rPr>
-              <w:t>TEST</w:t>
+              <w:t>TABATA_WARN_OFF</w:t>
             </w:r>
           </w:p>
         </w:tc>
@@ -14566,7 +14698,7 @@
               <w:rPr>
                 <w:rFonts w:ascii="Calibri" w:eastAsia="Times New Roman" w:hAnsi="Calibri" w:cs="Calibri"/>
               </w:rPr>
-              <w:t>Run diagnostics test</w:t>
+              <w:t>Time in seconds that the LEDs are off after the warning</w:t>
             </w:r>
           </w:p>
         </w:tc>
@@ -14576,16 +14708,11 @@
           </w:tcPr>
           <w:p>
             <w:pPr>
-              <w:rPr>
-                <w:rFonts w:ascii="Calibri" w:eastAsia="Times New Roman" w:hAnsi="Calibri" w:cs="Calibri"/>
-              </w:rPr>
-            </w:pPr>
-            <w:r>
-              <w:rPr>
-                <w:rFonts w:ascii="Calibri" w:eastAsia="Times New Roman" w:hAnsi="Calibri" w:cs="Calibri"/>
-              </w:rPr>
-              <w:t>0 – Show help menu</w:t>
-            </w:r>
+              <w:spacing w:before="100" w:beforeAutospacing="1" w:after="100" w:afterAutospacing="1"/>
+              <w:rPr>
+                <w:rFonts w:ascii="Calibri" w:eastAsia="Times New Roman" w:hAnsi="Calibri" w:cs="Calibri"/>
+              </w:rPr>
+            </w:pPr>
           </w:p>
         </w:tc>
         <w:tc>
@@ -14625,7 +14752,13 @@
               <w:rPr>
                 <w:rFonts w:ascii="Calibri" w:eastAsia="Times New Roman" w:hAnsi="Calibri" w:cs="Calibri"/>
               </w:rPr>
-              <w:t>TOKEN</w:t>
+              <w:t>TABATA_WARN_O</w:t>
+            </w:r>
+            <w:r>
+              <w:rPr>
+                <w:rFonts w:ascii="Calibri" w:eastAsia="Times New Roman" w:hAnsi="Calibri" w:cs="Calibri"/>
+              </w:rPr>
+              <w:t>N</w:t>
             </w:r>
           </w:p>
         </w:tc>
@@ -14644,7 +14777,7 @@
               <w:rPr>
                 <w:rFonts w:ascii="Calibri" w:eastAsia="Times New Roman" w:hAnsi="Calibri" w:cs="Calibri"/>
               </w:rPr>
-              <w:t>Enable Rapid Fire token ring</w:t>
+              <w:t>Time in seconds that the LEDs are on to warn the shooter</w:t>
             </w:r>
           </w:p>
         </w:tc>
@@ -14654,41 +14787,11 @@
           </w:tcPr>
           <w:p>
             <w:pPr>
-              <w:rPr>
-                <w:rFonts w:ascii="Calibri" w:eastAsia="Times New Roman" w:hAnsi="Calibri" w:cs="Calibri"/>
-              </w:rPr>
-            </w:pPr>
-            <w:r>
-              <w:rPr>
-                <w:rFonts w:ascii="Calibri" w:eastAsia="Times New Roman" w:hAnsi="Calibri" w:cs="Calibri"/>
-              </w:rPr>
-              <w:t>0 – Disable,</w:t>
-            </w:r>
-          </w:p>
-          <w:p>
-            <w:pPr>
-              <w:rPr>
-                <w:rFonts w:ascii="Calibri" w:eastAsia="Times New Roman" w:hAnsi="Calibri" w:cs="Calibri"/>
-              </w:rPr>
-            </w:pPr>
-            <w:r>
-              <w:rPr>
-                <w:rFonts w:ascii="Calibri" w:eastAsia="Times New Roman" w:hAnsi="Calibri" w:cs="Calibri"/>
-              </w:rPr>
-              <w:t xml:space="preserve">1 </w:t>
-            </w:r>
-            <w:r>
-              <w:rPr>
-                <w:rFonts w:ascii="Calibri" w:eastAsia="Times New Roman" w:hAnsi="Calibri" w:cs="Calibri"/>
-              </w:rPr>
-              <w:t>E</w:t>
-            </w:r>
-            <w:r>
-              <w:rPr>
-                <w:rFonts w:ascii="Calibri" w:eastAsia="Times New Roman" w:hAnsi="Calibri" w:cs="Calibri"/>
-              </w:rPr>
-              <w:t>nable</w:t>
-            </w:r>
+              <w:spacing w:before="100" w:beforeAutospacing="1" w:after="100" w:afterAutospacing="1"/>
+              <w:rPr>
+                <w:rFonts w:ascii="Calibri" w:eastAsia="Times New Roman" w:hAnsi="Calibri" w:cs="Calibri"/>
+              </w:rPr>
+            </w:pPr>
           </w:p>
         </w:tc>
         <w:tc>
@@ -14707,7 +14810,7 @@
               <w:rPr>
                 <w:rFonts w:ascii="Calibri" w:eastAsia="Times New Roman" w:hAnsi="Calibri" w:cs="Calibri"/>
               </w:rPr>
-              <w:t>Y</w:t>
+              <w:t>N</w:t>
             </w:r>
           </w:p>
         </w:tc>
@@ -14719,15 +14822,16 @@
           </w:tcPr>
           <w:p>
             <w:pPr>
-              <w:rPr>
-                <w:rFonts w:ascii="Calibri" w:eastAsia="Times New Roman" w:hAnsi="Calibri" w:cs="Calibri"/>
-              </w:rPr>
-            </w:pPr>
-            <w:r>
-              <w:rPr>
-                <w:rFonts w:ascii="Calibri" w:eastAsia="Times New Roman" w:hAnsi="Calibri" w:cs="Calibri"/>
-              </w:rPr>
-              <w:t>TRACE</w:t>
+              <w:spacing w:before="100" w:beforeAutospacing="1" w:after="100" w:afterAutospacing="1"/>
+              <w:rPr>
+                <w:rFonts w:ascii="Calibri" w:eastAsia="Times New Roman" w:hAnsi="Calibri" w:cs="Calibri"/>
+              </w:rPr>
+            </w:pPr>
+            <w:r>
+              <w:rPr>
+                <w:rFonts w:ascii="Calibri" w:eastAsia="Times New Roman" w:hAnsi="Calibri" w:cs="Calibri"/>
+              </w:rPr>
+              <w:t>TARGET_TYPE</w:t>
             </w:r>
           </w:p>
         </w:tc>
@@ -14737,74 +14841,16 @@
           </w:tcPr>
           <w:p>
             <w:pPr>
-              <w:rPr>
-                <w:rFonts w:ascii="Calibri" w:eastAsia="Times New Roman" w:hAnsi="Calibri" w:cs="Calibri"/>
-              </w:rPr>
-            </w:pPr>
-            <w:r>
-              <w:rPr>
-                <w:rFonts w:ascii="Calibri" w:eastAsia="Times New Roman" w:hAnsi="Calibri" w:cs="Calibri"/>
-              </w:rPr>
-              <w:t xml:space="preserve">Display diagnostics trace.  </w:t>
-            </w:r>
-          </w:p>
-          <w:p>
-            <w:pPr>
-              <w:rPr>
-                <w:rFonts w:ascii="Calibri" w:eastAsia="Times New Roman" w:hAnsi="Calibri" w:cs="Calibri"/>
-              </w:rPr>
-            </w:pPr>
-            <w:r>
-              <w:rPr>
-                <w:rFonts w:ascii="Calibri" w:eastAsia="Times New Roman" w:hAnsi="Calibri" w:cs="Calibri"/>
-              </w:rPr>
-              <w:t>Cleared on next power cycle</w:t>
-            </w:r>
-          </w:p>
-          <w:p>
-            <w:pPr>
-              <w:rPr>
-                <w:rFonts w:ascii="Calibri" w:eastAsia="Times New Roman" w:hAnsi="Calibri" w:cs="Calibri"/>
-              </w:rPr>
-            </w:pPr>
-          </w:p>
-          <w:p>
-            <w:pPr>
-              <w:rPr>
-                <w:rFonts w:ascii="Calibri" w:eastAsia="Times New Roman" w:hAnsi="Calibri" w:cs="Calibri"/>
-              </w:rPr>
-            </w:pPr>
-            <w:r>
-              <w:rPr>
-                <w:rFonts w:ascii="Calibri" w:eastAsia="Times New Roman" w:hAnsi="Calibri" w:cs="Calibri"/>
-              </w:rPr>
-              <w:t>DLT_CRITICAL – Error effects normal operation</w:t>
-            </w:r>
-          </w:p>
-          <w:p>
-            <w:pPr>
-              <w:rPr>
-                <w:rFonts w:ascii="Calibri" w:eastAsia="Times New Roman" w:hAnsi="Calibri" w:cs="Calibri"/>
-              </w:rPr>
-            </w:pPr>
-            <w:r>
-              <w:rPr>
-                <w:rFonts w:ascii="Calibri" w:eastAsia="Times New Roman" w:hAnsi="Calibri" w:cs="Calibri"/>
-              </w:rPr>
-              <w:t>DLT_INFO – Internal operational information</w:t>
-            </w:r>
-          </w:p>
-          <w:p>
-            <w:pPr>
-              <w:rPr>
-                <w:rFonts w:ascii="Calibri" w:eastAsia="Times New Roman" w:hAnsi="Calibri" w:cs="Calibri"/>
-              </w:rPr>
-            </w:pPr>
-            <w:r>
-              <w:rPr>
-                <w:rFonts w:ascii="Calibri" w:eastAsia="Times New Roman" w:hAnsi="Calibri" w:cs="Calibri"/>
-              </w:rPr>
-              <w:t xml:space="preserve">DLT_APPLICATION – Scoring calculations </w:t>
+              <w:spacing w:before="100" w:beforeAutospacing="1" w:after="100" w:afterAutospacing="1"/>
+              <w:rPr>
+                <w:rFonts w:ascii="Calibri" w:eastAsia="Times New Roman" w:hAnsi="Calibri" w:cs="Calibri"/>
+              </w:rPr>
+            </w:pPr>
+            <w:r>
+              <w:rPr>
+                <w:rFonts w:ascii="Calibri" w:eastAsia="Times New Roman" w:hAnsi="Calibri" w:cs="Calibri"/>
+              </w:rPr>
+              <w:t>Target Override for alternate targets</w:t>
             </w:r>
           </w:p>
         </w:tc>
@@ -14822,140 +14868,59 @@
               <w:rPr>
                 <w:rFonts w:ascii="Calibri" w:eastAsia="Times New Roman" w:hAnsi="Calibri" w:cs="Calibri"/>
               </w:rPr>
-              <w:t>1-</w:t>
-            </w:r>
-            <w:r>
-              <w:rPr>
-                <w:rFonts w:ascii="Calibri" w:eastAsia="Times New Roman" w:hAnsi="Calibri" w:cs="Calibri"/>
-              </w:rPr>
-              <w:t>DLT_CRITICAL</w:t>
-            </w:r>
-          </w:p>
-          <w:p>
-            <w:pPr>
-              <w:rPr>
-                <w:rFonts w:ascii="Calibri" w:eastAsia="Times New Roman" w:hAnsi="Calibri" w:cs="Calibri"/>
-              </w:rPr>
-            </w:pPr>
-            <w:r>
-              <w:rPr>
-                <w:rFonts w:ascii="Calibri" w:eastAsia="Times New Roman" w:hAnsi="Calibri" w:cs="Calibri"/>
-              </w:rPr>
-              <w:t>2-DLT_INFO</w:t>
-            </w:r>
-          </w:p>
-          <w:p>
-            <w:pPr>
-              <w:rPr>
-                <w:rFonts w:ascii="Calibri" w:eastAsia="Times New Roman" w:hAnsi="Calibri" w:cs="Calibri"/>
-              </w:rPr>
-            </w:pPr>
-            <w:r>
-              <w:rPr>
-                <w:rFonts w:ascii="Calibri" w:eastAsia="Times New Roman" w:hAnsi="Calibri" w:cs="Calibri"/>
-              </w:rPr>
-              <w:t>4-</w:t>
-            </w:r>
-            <w:r>
-              <w:rPr>
-                <w:rFonts w:ascii="Calibri" w:eastAsia="Times New Roman" w:hAnsi="Calibri" w:cs="Calibri"/>
-              </w:rPr>
-              <w:t>DLT_APPLICATION</w:t>
-            </w:r>
-          </w:p>
-          <w:p>
-            <w:pPr>
-              <w:rPr>
-                <w:rFonts w:ascii="Calibri" w:eastAsia="Times New Roman" w:hAnsi="Calibri" w:cs="Calibri"/>
-              </w:rPr>
-            </w:pPr>
-            <w:r>
-              <w:rPr>
-                <w:rFonts w:ascii="Calibri" w:eastAsia="Times New Roman" w:hAnsi="Calibri" w:cs="Calibri"/>
-              </w:rPr>
-              <w:t>8-</w:t>
-            </w:r>
-            <w:r>
-              <w:rPr>
-                <w:rFonts w:ascii="Calibri" w:eastAsia="Times New Roman" w:hAnsi="Calibri" w:cs="Calibri"/>
-              </w:rPr>
-              <w:t>DLT_COMMUNICATION</w:t>
-            </w:r>
-          </w:p>
-          <w:p>
-            <w:pPr>
-              <w:rPr>
-                <w:rFonts w:ascii="Calibri" w:eastAsia="Times New Roman" w:hAnsi="Calibri" w:cs="Calibri"/>
-              </w:rPr>
-            </w:pPr>
-            <w:r>
-              <w:rPr>
-                <w:rFonts w:ascii="Calibri" w:eastAsia="Times New Roman" w:hAnsi="Calibri" w:cs="Calibri"/>
-              </w:rPr>
-              <w:t>16-</w:t>
-            </w:r>
-            <w:r>
-              <w:rPr>
-                <w:rFonts w:ascii="Calibri" w:eastAsia="Times New Roman" w:hAnsi="Calibri" w:cs="Calibri"/>
-              </w:rPr>
-              <w:t>DLT_DIAG</w:t>
-            </w:r>
-          </w:p>
-          <w:p>
-            <w:pPr>
-              <w:rPr>
-                <w:rFonts w:ascii="Calibri" w:eastAsia="Times New Roman" w:hAnsi="Calibri" w:cs="Calibri"/>
-              </w:rPr>
-            </w:pPr>
-            <w:r>
-              <w:rPr>
-                <w:rFonts w:ascii="Calibri" w:eastAsia="Times New Roman" w:hAnsi="Calibri" w:cs="Calibri"/>
-              </w:rPr>
-              <w:t>32-</w:t>
-            </w:r>
-            <w:r>
-              <w:rPr>
-                <w:rFonts w:ascii="Calibri" w:eastAsia="Times New Roman" w:hAnsi="Calibri" w:cs="Calibri"/>
-              </w:rPr>
-              <w:t>DLT_DEBUG</w:t>
-            </w:r>
-          </w:p>
-          <w:p>
-            <w:pPr>
-              <w:rPr>
-                <w:rFonts w:ascii="Calibri" w:eastAsia="Times New Roman" w:hAnsi="Calibri" w:cs="Calibri"/>
-              </w:rPr>
-            </w:pPr>
-            <w:r>
-              <w:rPr>
-                <w:rFonts w:ascii="Calibri" w:eastAsia="Times New Roman" w:hAnsi="Calibri" w:cs="Calibri"/>
-              </w:rPr>
-              <w:t>64-</w:t>
-            </w:r>
-            <w:r>
-              <w:rPr>
-                <w:rFonts w:ascii="Calibri" w:eastAsia="Times New Roman" w:hAnsi="Calibri" w:cs="Calibri"/>
-              </w:rPr>
-              <w:t>DLT_SCORE</w:t>
-            </w:r>
-          </w:p>
-          <w:p>
-            <w:pPr>
-              <w:rPr>
-                <w:rFonts w:ascii="Calibri" w:eastAsia="Times New Roman" w:hAnsi="Calibri" w:cs="Calibri"/>
-              </w:rPr>
-            </w:pPr>
-            <w:r>
-              <w:rPr>
-                <w:rFonts w:ascii="Calibri" w:eastAsia="Times New Roman" w:hAnsi="Calibri" w:cs="Calibri"/>
-              </w:rPr>
-              <w:t>128-</w:t>
-            </w:r>
-            <w:r>
-              <w:rPr>
-                <w:rFonts w:ascii="Calibri" w:eastAsia="Times New Roman" w:hAnsi="Calibri" w:cs="Calibri"/>
-              </w:rPr>
-              <w:t>DLT_HEARTBEAT</w:t>
+              <w:t>0 – No override</w:t>
+            </w:r>
+          </w:p>
+          <w:p>
+            <w:pPr>
+              <w:rPr>
+                <w:rFonts w:ascii="Calibri" w:eastAsia="Times New Roman" w:hAnsi="Calibri" w:cs="Calibri"/>
+              </w:rPr>
+            </w:pPr>
+            <w:r>
+              <w:rPr>
+                <w:rFonts w:ascii="Calibri" w:eastAsia="Times New Roman" w:hAnsi="Calibri" w:cs="Calibri"/>
+              </w:rPr>
+              <w:t>4 – 5 bull target 74mm</w:t>
+            </w:r>
+          </w:p>
+          <w:p>
+            <w:pPr>
+              <w:rPr>
+                <w:rFonts w:ascii="Calibri" w:eastAsia="Times New Roman" w:hAnsi="Calibri" w:cs="Calibri"/>
+              </w:rPr>
+            </w:pPr>
+            <w:r>
+              <w:rPr>
+                <w:rFonts w:ascii="Calibri" w:eastAsia="Times New Roman" w:hAnsi="Calibri" w:cs="Calibri"/>
+              </w:rPr>
+              <w:t>5 – 5 bull target 79mm</w:t>
+            </w:r>
+          </w:p>
+          <w:p>
+            <w:pPr>
+              <w:rPr>
+                <w:rFonts w:ascii="Calibri" w:eastAsia="Times New Roman" w:hAnsi="Calibri" w:cs="Calibri"/>
+              </w:rPr>
+            </w:pPr>
+            <w:r>
+              <w:rPr>
+                <w:rFonts w:ascii="Calibri" w:eastAsia="Times New Roman" w:hAnsi="Calibri" w:cs="Calibri"/>
+              </w:rPr>
+              <w:t>11 – 10bull + sighters (Orion)</w:t>
+            </w:r>
+          </w:p>
+          <w:p>
+            <w:pPr>
+              <w:rPr>
+                <w:rFonts w:ascii="Calibri" w:eastAsia="Times New Roman" w:hAnsi="Calibri" w:cs="Calibri"/>
+              </w:rPr>
+            </w:pPr>
+            <w:r>
+              <w:rPr>
+                <w:rFonts w:ascii="Calibri" w:eastAsia="Times New Roman" w:hAnsi="Calibri" w:cs="Calibri"/>
+              </w:rPr>
+              <w:t>12 – 10 bull + sighters (NRA)</w:t>
             </w:r>
           </w:p>
         </w:tc>
@@ -14965,6 +14930,7 @@
           </w:tcPr>
           <w:p>
             <w:pPr>
+              <w:spacing w:before="100" w:beforeAutospacing="1" w:after="100" w:afterAutospacing="1"/>
               <w:jc w:val="center"/>
               <w:rPr>
                 <w:rFonts w:ascii="Calibri" w:eastAsia="Times New Roman" w:hAnsi="Calibri" w:cs="Calibri"/>
@@ -14974,7 +14940,7 @@
               <w:rPr>
                 <w:rFonts w:ascii="Calibri" w:eastAsia="Times New Roman" w:hAnsi="Calibri" w:cs="Calibri"/>
               </w:rPr>
-              <w:t>N</w:t>
+              <w:t>Y</w:t>
             </w:r>
           </w:p>
         </w:tc>
@@ -14995,7 +14961,7 @@
               <w:rPr>
                 <w:rFonts w:ascii="Calibri" w:eastAsia="Times New Roman" w:hAnsi="Calibri" w:cs="Calibri"/>
               </w:rPr>
-              <w:t>VREF_LO</w:t>
+              <w:t>TEST</w:t>
             </w:r>
           </w:p>
         </w:tc>
@@ -15014,7 +14980,7 @@
               <w:rPr>
                 <w:rFonts w:ascii="Calibri" w:eastAsia="Times New Roman" w:hAnsi="Calibri" w:cs="Calibri"/>
               </w:rPr>
-              <w:t>Shot detection low voltage threshold</w:t>
+              <w:t>Run diagnostics test</w:t>
             </w:r>
           </w:p>
         </w:tc>
@@ -15024,16 +14990,15 @@
           </w:tcPr>
           <w:p>
             <w:pPr>
-              <w:spacing w:before="100" w:beforeAutospacing="1" w:after="100" w:afterAutospacing="1"/>
-              <w:rPr>
-                <w:rFonts w:ascii="Calibri" w:eastAsia="Times New Roman" w:hAnsi="Calibri" w:cs="Calibri"/>
-              </w:rPr>
-            </w:pPr>
-            <w:r>
-              <w:rPr>
-                <w:rFonts w:ascii="Calibri" w:eastAsia="Times New Roman" w:hAnsi="Calibri" w:cs="Calibri"/>
-              </w:rPr>
-              <w:t>1.25 Volts</w:t>
+              <w:rPr>
+                <w:rFonts w:ascii="Calibri" w:eastAsia="Times New Roman" w:hAnsi="Calibri" w:cs="Calibri"/>
+              </w:rPr>
+            </w:pPr>
+            <w:r>
+              <w:rPr>
+                <w:rFonts w:ascii="Calibri" w:eastAsia="Times New Roman" w:hAnsi="Calibri" w:cs="Calibri"/>
+              </w:rPr>
+              <w:t>0 – Show help menu</w:t>
             </w:r>
           </w:p>
         </w:tc>
@@ -15053,7 +15018,7 @@
               <w:rPr>
                 <w:rFonts w:ascii="Calibri" w:eastAsia="Times New Roman" w:hAnsi="Calibri" w:cs="Calibri"/>
               </w:rPr>
-              <w:t>Y</w:t>
+              <w:t>N</w:t>
             </w:r>
           </w:p>
         </w:tc>
@@ -15074,13 +15039,7 @@
               <w:rPr>
                 <w:rFonts w:ascii="Calibri" w:eastAsia="Times New Roman" w:hAnsi="Calibri" w:cs="Calibri"/>
               </w:rPr>
-              <w:t>VREF_</w:t>
-            </w:r>
-            <w:r>
-              <w:rPr>
-                <w:rFonts w:ascii="Calibri" w:eastAsia="Times New Roman" w:hAnsi="Calibri" w:cs="Calibri"/>
-              </w:rPr>
-              <w:t>HI</w:t>
+              <w:t>TOKEN</w:t>
             </w:r>
           </w:p>
         </w:tc>
@@ -15099,7 +15058,7 @@
               <w:rPr>
                 <w:rFonts w:ascii="Calibri" w:eastAsia="Times New Roman" w:hAnsi="Calibri" w:cs="Calibri"/>
               </w:rPr>
-              <w:t>Shot detection high voltage threshold (VREF_HI &gt; VREF_LO)</w:t>
+              <w:t>Enable Rapid Fire token ring</w:t>
             </w:r>
           </w:p>
         </w:tc>
@@ -15109,16 +15068,40 @@
           </w:tcPr>
           <w:p>
             <w:pPr>
-              <w:spacing w:before="100" w:beforeAutospacing="1" w:after="100" w:afterAutospacing="1"/>
-              <w:rPr>
-                <w:rFonts w:ascii="Calibri" w:eastAsia="Times New Roman" w:hAnsi="Calibri" w:cs="Calibri"/>
-              </w:rPr>
-            </w:pPr>
-            <w:r>
-              <w:rPr>
-                <w:rFonts w:ascii="Calibri" w:eastAsia="Times New Roman" w:hAnsi="Calibri" w:cs="Calibri"/>
-              </w:rPr>
-              <w:t>2.0 Volts</w:t>
+              <w:rPr>
+                <w:rFonts w:ascii="Calibri" w:eastAsia="Times New Roman" w:hAnsi="Calibri" w:cs="Calibri"/>
+              </w:rPr>
+            </w:pPr>
+            <w:r>
+              <w:rPr>
+                <w:rFonts w:ascii="Calibri" w:eastAsia="Times New Roman" w:hAnsi="Calibri" w:cs="Calibri"/>
+              </w:rPr>
+              <w:t>0 – Disable,</w:t>
+            </w:r>
+          </w:p>
+          <w:p>
+            <w:pPr>
+              <w:rPr>
+                <w:rFonts w:ascii="Calibri" w:eastAsia="Times New Roman" w:hAnsi="Calibri" w:cs="Calibri"/>
+              </w:rPr>
+            </w:pPr>
+            <w:r>
+              <w:rPr>
+                <w:rFonts w:ascii="Calibri" w:eastAsia="Times New Roman" w:hAnsi="Calibri" w:cs="Calibri"/>
+              </w:rPr>
+              <w:t xml:space="preserve">1 </w:t>
+            </w:r>
+            <w:r>
+              <w:rPr>
+                <w:rFonts w:ascii="Calibri" w:eastAsia="Times New Roman" w:hAnsi="Calibri" w:cs="Calibri"/>
+              </w:rPr>
+              <w:t>E</w:t>
+            </w:r>
+            <w:r>
+              <w:rPr>
+                <w:rFonts w:ascii="Calibri" w:eastAsia="Times New Roman" w:hAnsi="Calibri" w:cs="Calibri"/>
+              </w:rPr>
+              <w:t>nable</w:t>
             </w:r>
           </w:p>
         </w:tc>
@@ -15158,7 +15141,7 @@
               <w:rPr>
                 <w:rFonts w:ascii="Calibri" w:eastAsia="Times New Roman" w:hAnsi="Calibri" w:cs="Calibri"/>
               </w:rPr>
-              <w:t>WIFI_CHANNEL</w:t>
+              <w:t>TRACE</w:t>
             </w:r>
           </w:p>
         </w:tc>
@@ -15172,19 +15155,70 @@
                 <w:rFonts w:ascii="Calibri" w:eastAsia="Times New Roman" w:hAnsi="Calibri" w:cs="Calibri"/>
               </w:rPr>
             </w:pPr>
-            <w:proofErr w:type="spellStart"/>
-            <w:r>
-              <w:rPr>
-                <w:rFonts w:ascii="Calibri" w:eastAsia="Times New Roman" w:hAnsi="Calibri" w:cs="Calibri"/>
-              </w:rPr>
-              <w:t>WiFi</w:t>
-            </w:r>
-            <w:proofErr w:type="spellEnd"/>
-            <w:r>
-              <w:rPr>
-                <w:rFonts w:ascii="Calibri" w:eastAsia="Times New Roman" w:hAnsi="Calibri" w:cs="Calibri"/>
-              </w:rPr>
-              <w:t xml:space="preserve"> channel used with Access Point targets</w:t>
+            <w:r>
+              <w:rPr>
+                <w:rFonts w:ascii="Calibri" w:eastAsia="Times New Roman" w:hAnsi="Calibri" w:cs="Calibri"/>
+              </w:rPr>
+              <w:t xml:space="preserve">Display diagnostics trace.  </w:t>
+            </w:r>
+          </w:p>
+          <w:p>
+            <w:pPr>
+              <w:rPr>
+                <w:rFonts w:ascii="Calibri" w:eastAsia="Times New Roman" w:hAnsi="Calibri" w:cs="Calibri"/>
+              </w:rPr>
+            </w:pPr>
+            <w:r>
+              <w:rPr>
+                <w:rFonts w:ascii="Calibri" w:eastAsia="Times New Roman" w:hAnsi="Calibri" w:cs="Calibri"/>
+              </w:rPr>
+              <w:t>Cleared on next power cycle</w:t>
+            </w:r>
+          </w:p>
+          <w:p>
+            <w:pPr>
+              <w:rPr>
+                <w:rFonts w:ascii="Calibri" w:eastAsia="Times New Roman" w:hAnsi="Calibri" w:cs="Calibri"/>
+              </w:rPr>
+            </w:pPr>
+          </w:p>
+          <w:p>
+            <w:pPr>
+              <w:rPr>
+                <w:rFonts w:ascii="Calibri" w:eastAsia="Times New Roman" w:hAnsi="Calibri" w:cs="Calibri"/>
+              </w:rPr>
+            </w:pPr>
+            <w:r>
+              <w:rPr>
+                <w:rFonts w:ascii="Calibri" w:eastAsia="Times New Roman" w:hAnsi="Calibri" w:cs="Calibri"/>
+              </w:rPr>
+              <w:t>DLT_CRITICAL – Error effects normal operation</w:t>
+            </w:r>
+          </w:p>
+          <w:p>
+            <w:pPr>
+              <w:rPr>
+                <w:rFonts w:ascii="Calibri" w:eastAsia="Times New Roman" w:hAnsi="Calibri" w:cs="Calibri"/>
+              </w:rPr>
+            </w:pPr>
+            <w:r>
+              <w:rPr>
+                <w:rFonts w:ascii="Calibri" w:eastAsia="Times New Roman" w:hAnsi="Calibri" w:cs="Calibri"/>
+              </w:rPr>
+              <w:t>DLT_INFO – Internal operational information</w:t>
+            </w:r>
+          </w:p>
+          <w:p>
+            <w:pPr>
+              <w:rPr>
+                <w:rFonts w:ascii="Calibri" w:eastAsia="Times New Roman" w:hAnsi="Calibri" w:cs="Calibri"/>
+              </w:rPr>
+            </w:pPr>
+            <w:r>
+              <w:rPr>
+                <w:rFonts w:ascii="Calibri" w:eastAsia="Times New Roman" w:hAnsi="Calibri" w:cs="Calibri"/>
+              </w:rPr>
+              <w:t xml:space="preserve">DLT_APPLICATION – Scoring calculations </w:t>
             </w:r>
           </w:p>
         </w:tc>
@@ -15202,33 +15236,140 @@
               <w:rPr>
                 <w:rFonts w:ascii="Calibri" w:eastAsia="Times New Roman" w:hAnsi="Calibri" w:cs="Calibri"/>
               </w:rPr>
-              <w:t>1 – First</w:t>
-            </w:r>
-          </w:p>
-          <w:p>
-            <w:pPr>
-              <w:rPr>
-                <w:rFonts w:ascii="Calibri" w:eastAsia="Times New Roman" w:hAnsi="Calibri" w:cs="Calibri"/>
-              </w:rPr>
-            </w:pPr>
-            <w:r>
-              <w:rPr>
-                <w:rFonts w:ascii="Calibri" w:eastAsia="Times New Roman" w:hAnsi="Calibri" w:cs="Calibri"/>
-              </w:rPr>
-              <w:t>6 – Recommended</w:t>
-            </w:r>
-          </w:p>
-          <w:p>
-            <w:pPr>
-              <w:rPr>
-                <w:rFonts w:ascii="Calibri" w:eastAsia="Times New Roman" w:hAnsi="Calibri" w:cs="Calibri"/>
-              </w:rPr>
-            </w:pPr>
-            <w:r>
-              <w:rPr>
-                <w:rFonts w:ascii="Calibri" w:eastAsia="Times New Roman" w:hAnsi="Calibri" w:cs="Calibri"/>
-              </w:rPr>
-              <w:t>11 - Last</w:t>
+              <w:t>1-</w:t>
+            </w:r>
+            <w:r>
+              <w:rPr>
+                <w:rFonts w:ascii="Calibri" w:eastAsia="Times New Roman" w:hAnsi="Calibri" w:cs="Calibri"/>
+              </w:rPr>
+              <w:t>DLT_CRITICAL</w:t>
+            </w:r>
+          </w:p>
+          <w:p>
+            <w:pPr>
+              <w:rPr>
+                <w:rFonts w:ascii="Calibri" w:eastAsia="Times New Roman" w:hAnsi="Calibri" w:cs="Calibri"/>
+              </w:rPr>
+            </w:pPr>
+            <w:r>
+              <w:rPr>
+                <w:rFonts w:ascii="Calibri" w:eastAsia="Times New Roman" w:hAnsi="Calibri" w:cs="Calibri"/>
+              </w:rPr>
+              <w:t>2-DLT_INFO</w:t>
+            </w:r>
+          </w:p>
+          <w:p>
+            <w:pPr>
+              <w:rPr>
+                <w:rFonts w:ascii="Calibri" w:eastAsia="Times New Roman" w:hAnsi="Calibri" w:cs="Calibri"/>
+              </w:rPr>
+            </w:pPr>
+            <w:r>
+              <w:rPr>
+                <w:rFonts w:ascii="Calibri" w:eastAsia="Times New Roman" w:hAnsi="Calibri" w:cs="Calibri"/>
+              </w:rPr>
+              <w:t>4-</w:t>
+            </w:r>
+            <w:r>
+              <w:rPr>
+                <w:rFonts w:ascii="Calibri" w:eastAsia="Times New Roman" w:hAnsi="Calibri" w:cs="Calibri"/>
+              </w:rPr>
+              <w:t>DLT_APPLICATION</w:t>
+            </w:r>
+          </w:p>
+          <w:p>
+            <w:pPr>
+              <w:rPr>
+                <w:rFonts w:ascii="Calibri" w:eastAsia="Times New Roman" w:hAnsi="Calibri" w:cs="Calibri"/>
+              </w:rPr>
+            </w:pPr>
+            <w:r>
+              <w:rPr>
+                <w:rFonts w:ascii="Calibri" w:eastAsia="Times New Roman" w:hAnsi="Calibri" w:cs="Calibri"/>
+              </w:rPr>
+              <w:t>8-</w:t>
+            </w:r>
+            <w:r>
+              <w:rPr>
+                <w:rFonts w:ascii="Calibri" w:eastAsia="Times New Roman" w:hAnsi="Calibri" w:cs="Calibri"/>
+              </w:rPr>
+              <w:t>DLT_COMMUNICATION</w:t>
+            </w:r>
+          </w:p>
+          <w:p>
+            <w:pPr>
+              <w:rPr>
+                <w:rFonts w:ascii="Calibri" w:eastAsia="Times New Roman" w:hAnsi="Calibri" w:cs="Calibri"/>
+              </w:rPr>
+            </w:pPr>
+            <w:r>
+              <w:rPr>
+                <w:rFonts w:ascii="Calibri" w:eastAsia="Times New Roman" w:hAnsi="Calibri" w:cs="Calibri"/>
+              </w:rPr>
+              <w:t>16-</w:t>
+            </w:r>
+            <w:r>
+              <w:rPr>
+                <w:rFonts w:ascii="Calibri" w:eastAsia="Times New Roman" w:hAnsi="Calibri" w:cs="Calibri"/>
+              </w:rPr>
+              <w:t>DLT_DIAG</w:t>
+            </w:r>
+          </w:p>
+          <w:p>
+            <w:pPr>
+              <w:rPr>
+                <w:rFonts w:ascii="Calibri" w:eastAsia="Times New Roman" w:hAnsi="Calibri" w:cs="Calibri"/>
+              </w:rPr>
+            </w:pPr>
+            <w:r>
+              <w:rPr>
+                <w:rFonts w:ascii="Calibri" w:eastAsia="Times New Roman" w:hAnsi="Calibri" w:cs="Calibri"/>
+              </w:rPr>
+              <w:t>32-</w:t>
+            </w:r>
+            <w:r>
+              <w:rPr>
+                <w:rFonts w:ascii="Calibri" w:eastAsia="Times New Roman" w:hAnsi="Calibri" w:cs="Calibri"/>
+              </w:rPr>
+              <w:t>DLT_DEBUG</w:t>
+            </w:r>
+          </w:p>
+          <w:p>
+            <w:pPr>
+              <w:rPr>
+                <w:rFonts w:ascii="Calibri" w:eastAsia="Times New Roman" w:hAnsi="Calibri" w:cs="Calibri"/>
+              </w:rPr>
+            </w:pPr>
+            <w:r>
+              <w:rPr>
+                <w:rFonts w:ascii="Calibri" w:eastAsia="Times New Roman" w:hAnsi="Calibri" w:cs="Calibri"/>
+              </w:rPr>
+              <w:t>64-</w:t>
+            </w:r>
+            <w:r>
+              <w:rPr>
+                <w:rFonts w:ascii="Calibri" w:eastAsia="Times New Roman" w:hAnsi="Calibri" w:cs="Calibri"/>
+              </w:rPr>
+              <w:t>DLT_SCORE</w:t>
+            </w:r>
+          </w:p>
+          <w:p>
+            <w:pPr>
+              <w:rPr>
+                <w:rFonts w:ascii="Calibri" w:eastAsia="Times New Roman" w:hAnsi="Calibri" w:cs="Calibri"/>
+              </w:rPr>
+            </w:pPr>
+            <w:r>
+              <w:rPr>
+                <w:rFonts w:ascii="Calibri" w:eastAsia="Times New Roman" w:hAnsi="Calibri" w:cs="Calibri"/>
+              </w:rPr>
+              <w:t>128-</w:t>
+            </w:r>
+            <w:r>
+              <w:rPr>
+                <w:rFonts w:ascii="Calibri" w:eastAsia="Times New Roman" w:hAnsi="Calibri" w:cs="Calibri"/>
+              </w:rPr>
+              <w:t>DLT_HEARTBEAT</w:t>
             </w:r>
           </w:p>
         </w:tc>
@@ -15247,7 +15388,7 @@
               <w:rPr>
                 <w:rFonts w:ascii="Calibri" w:eastAsia="Times New Roman" w:hAnsi="Calibri" w:cs="Calibri"/>
               </w:rPr>
-              <w:t>Y</w:t>
+              <w:t>N</w:t>
             </w:r>
           </w:p>
         </w:tc>
@@ -15268,6 +15409,371 @@
               <w:rPr>
                 <w:rFonts w:ascii="Calibri" w:eastAsia="Times New Roman" w:hAnsi="Calibri" w:cs="Calibri"/>
               </w:rPr>
+              <w:t>VREF_LO</w:t>
+            </w:r>
+          </w:p>
+        </w:tc>
+        <w:tc>
+          <w:tcPr>
+            <w:tcW w:w="5206" w:type="dxa"/>
+          </w:tcPr>
+          <w:p>
+            <w:pPr>
+              <w:spacing w:before="100" w:beforeAutospacing="1" w:after="100" w:afterAutospacing="1"/>
+              <w:rPr>
+                <w:rFonts w:ascii="Calibri" w:eastAsia="Times New Roman" w:hAnsi="Calibri" w:cs="Calibri"/>
+              </w:rPr>
+            </w:pPr>
+            <w:r>
+              <w:rPr>
+                <w:rFonts w:ascii="Calibri" w:eastAsia="Times New Roman" w:hAnsi="Calibri" w:cs="Calibri"/>
+              </w:rPr>
+              <w:t>Shot detection low voltage threshold</w:t>
+            </w:r>
+          </w:p>
+        </w:tc>
+        <w:tc>
+          <w:tcPr>
+            <w:tcW w:w="2961" w:type="dxa"/>
+          </w:tcPr>
+          <w:p>
+            <w:pPr>
+              <w:spacing w:before="100" w:beforeAutospacing="1" w:after="100" w:afterAutospacing="1"/>
+              <w:rPr>
+                <w:rFonts w:ascii="Calibri" w:eastAsia="Times New Roman" w:hAnsi="Calibri" w:cs="Calibri"/>
+              </w:rPr>
+            </w:pPr>
+            <w:r>
+              <w:rPr>
+                <w:rFonts w:ascii="Calibri" w:eastAsia="Times New Roman" w:hAnsi="Calibri" w:cs="Calibri"/>
+              </w:rPr>
+              <w:t>1.25 Volts</w:t>
+            </w:r>
+          </w:p>
+        </w:tc>
+        <w:tc>
+          <w:tcPr>
+            <w:tcW w:w="699" w:type="dxa"/>
+          </w:tcPr>
+          <w:p>
+            <w:pPr>
+              <w:spacing w:before="100" w:beforeAutospacing="1" w:after="100" w:afterAutospacing="1"/>
+              <w:jc w:val="center"/>
+              <w:rPr>
+                <w:rFonts w:ascii="Calibri" w:eastAsia="Times New Roman" w:hAnsi="Calibri" w:cs="Calibri"/>
+              </w:rPr>
+            </w:pPr>
+            <w:r>
+              <w:rPr>
+                <w:rFonts w:ascii="Calibri" w:eastAsia="Times New Roman" w:hAnsi="Calibri" w:cs="Calibri"/>
+              </w:rPr>
+              <w:t>Y</w:t>
+            </w:r>
+          </w:p>
+        </w:tc>
+      </w:tr>
+      <w:tr>
+        <w:tc>
+          <w:tcPr>
+            <w:tcW w:w="1924" w:type="dxa"/>
+          </w:tcPr>
+          <w:p>
+            <w:pPr>
+              <w:spacing w:before="100" w:beforeAutospacing="1" w:after="100" w:afterAutospacing="1"/>
+              <w:rPr>
+                <w:rFonts w:ascii="Calibri" w:eastAsia="Times New Roman" w:hAnsi="Calibri" w:cs="Calibri"/>
+              </w:rPr>
+            </w:pPr>
+            <w:r>
+              <w:rPr>
+                <w:rFonts w:ascii="Calibri" w:eastAsia="Times New Roman" w:hAnsi="Calibri" w:cs="Calibri"/>
+              </w:rPr>
+              <w:t>VREF_</w:t>
+            </w:r>
+            <w:r>
+              <w:rPr>
+                <w:rFonts w:ascii="Calibri" w:eastAsia="Times New Roman" w:hAnsi="Calibri" w:cs="Calibri"/>
+              </w:rPr>
+              <w:t>HI</w:t>
+            </w:r>
+          </w:p>
+        </w:tc>
+        <w:tc>
+          <w:tcPr>
+            <w:tcW w:w="5206" w:type="dxa"/>
+          </w:tcPr>
+          <w:p>
+            <w:pPr>
+              <w:spacing w:before="100" w:beforeAutospacing="1" w:after="100" w:afterAutospacing="1"/>
+              <w:rPr>
+                <w:rFonts w:ascii="Calibri" w:eastAsia="Times New Roman" w:hAnsi="Calibri" w:cs="Calibri"/>
+              </w:rPr>
+            </w:pPr>
+            <w:r>
+              <w:rPr>
+                <w:rFonts w:ascii="Calibri" w:eastAsia="Times New Roman" w:hAnsi="Calibri" w:cs="Calibri"/>
+              </w:rPr>
+              <w:t>Shot detection high voltage threshold (VREF_HI &gt; VREF_LO)</w:t>
+            </w:r>
+          </w:p>
+        </w:tc>
+        <w:tc>
+          <w:tcPr>
+            <w:tcW w:w="2961" w:type="dxa"/>
+          </w:tcPr>
+          <w:p>
+            <w:pPr>
+              <w:spacing w:before="100" w:beforeAutospacing="1" w:after="100" w:afterAutospacing="1"/>
+              <w:rPr>
+                <w:rFonts w:ascii="Calibri" w:eastAsia="Times New Roman" w:hAnsi="Calibri" w:cs="Calibri"/>
+              </w:rPr>
+            </w:pPr>
+            <w:r>
+              <w:rPr>
+                <w:rFonts w:ascii="Calibri" w:eastAsia="Times New Roman" w:hAnsi="Calibri" w:cs="Calibri"/>
+              </w:rPr>
+              <w:t>2.0 Volts</w:t>
+            </w:r>
+          </w:p>
+        </w:tc>
+        <w:tc>
+          <w:tcPr>
+            <w:tcW w:w="699" w:type="dxa"/>
+          </w:tcPr>
+          <w:p>
+            <w:pPr>
+              <w:spacing w:before="100" w:beforeAutospacing="1" w:after="100" w:afterAutospacing="1"/>
+              <w:jc w:val="center"/>
+              <w:rPr>
+                <w:rFonts w:ascii="Calibri" w:eastAsia="Times New Roman" w:hAnsi="Calibri" w:cs="Calibri"/>
+              </w:rPr>
+            </w:pPr>
+            <w:r>
+              <w:rPr>
+                <w:rFonts w:ascii="Calibri" w:eastAsia="Times New Roman" w:hAnsi="Calibri" w:cs="Calibri"/>
+              </w:rPr>
+              <w:t>Y</w:t>
+            </w:r>
+          </w:p>
+        </w:tc>
+      </w:tr>
+      <w:tr>
+        <w:tc>
+          <w:tcPr>
+            <w:tcW w:w="1924" w:type="dxa"/>
+          </w:tcPr>
+          <w:p>
+            <w:pPr>
+              <w:rPr>
+                <w:rFonts w:ascii="Calibri" w:eastAsia="Times New Roman" w:hAnsi="Calibri" w:cs="Calibri"/>
+              </w:rPr>
+            </w:pPr>
+            <w:r>
+              <w:rPr>
+                <w:rFonts w:ascii="Calibri" w:eastAsia="Times New Roman" w:hAnsi="Calibri" w:cs="Calibri"/>
+              </w:rPr>
+              <w:t>WIFI_CHANNEL</w:t>
+            </w:r>
+          </w:p>
+        </w:tc>
+        <w:tc>
+          <w:tcPr>
+            <w:tcW w:w="5206" w:type="dxa"/>
+          </w:tcPr>
+          <w:p>
+            <w:pPr>
+              <w:rPr>
+                <w:rFonts w:ascii="Calibri" w:eastAsia="Times New Roman" w:hAnsi="Calibri" w:cs="Calibri"/>
+              </w:rPr>
+            </w:pPr>
+            <w:proofErr w:type="spellStart"/>
+            <w:r>
+              <w:rPr>
+                <w:rFonts w:ascii="Calibri" w:eastAsia="Times New Roman" w:hAnsi="Calibri" w:cs="Calibri"/>
+              </w:rPr>
+              <w:t>WiFi</w:t>
+            </w:r>
+            <w:proofErr w:type="spellEnd"/>
+            <w:r>
+              <w:rPr>
+                <w:rFonts w:ascii="Calibri" w:eastAsia="Times New Roman" w:hAnsi="Calibri" w:cs="Calibri"/>
+              </w:rPr>
+              <w:t xml:space="preserve"> channel used with Access Point targets</w:t>
+            </w:r>
+          </w:p>
+        </w:tc>
+        <w:tc>
+          <w:tcPr>
+            <w:tcW w:w="2961" w:type="dxa"/>
+          </w:tcPr>
+          <w:p>
+            <w:pPr>
+              <w:rPr>
+                <w:rFonts w:ascii="Calibri" w:eastAsia="Times New Roman" w:hAnsi="Calibri" w:cs="Calibri"/>
+              </w:rPr>
+            </w:pPr>
+            <w:r>
+              <w:rPr>
+                <w:rFonts w:ascii="Calibri" w:eastAsia="Times New Roman" w:hAnsi="Calibri" w:cs="Calibri"/>
+              </w:rPr>
+              <w:t>1 – First</w:t>
+            </w:r>
+          </w:p>
+          <w:p>
+            <w:pPr>
+              <w:rPr>
+                <w:rFonts w:ascii="Calibri" w:eastAsia="Times New Roman" w:hAnsi="Calibri" w:cs="Calibri"/>
+              </w:rPr>
+            </w:pPr>
+            <w:r>
+              <w:rPr>
+                <w:rFonts w:ascii="Calibri" w:eastAsia="Times New Roman" w:hAnsi="Calibri" w:cs="Calibri"/>
+              </w:rPr>
+              <w:t>6 – Recommended</w:t>
+            </w:r>
+          </w:p>
+          <w:p>
+            <w:pPr>
+              <w:rPr>
+                <w:rFonts w:ascii="Calibri" w:eastAsia="Times New Roman" w:hAnsi="Calibri" w:cs="Calibri"/>
+              </w:rPr>
+            </w:pPr>
+            <w:r>
+              <w:rPr>
+                <w:rFonts w:ascii="Calibri" w:eastAsia="Times New Roman" w:hAnsi="Calibri" w:cs="Calibri"/>
+              </w:rPr>
+              <w:t>11 - Last</w:t>
+            </w:r>
+          </w:p>
+        </w:tc>
+        <w:tc>
+          <w:tcPr>
+            <w:tcW w:w="699" w:type="dxa"/>
+          </w:tcPr>
+          <w:p>
+            <w:pPr>
+              <w:jc w:val="center"/>
+              <w:rPr>
+                <w:rFonts w:ascii="Calibri" w:eastAsia="Times New Roman" w:hAnsi="Calibri" w:cs="Calibri"/>
+              </w:rPr>
+            </w:pPr>
+            <w:r>
+              <w:rPr>
+                <w:rFonts w:ascii="Calibri" w:eastAsia="Times New Roman" w:hAnsi="Calibri" w:cs="Calibri"/>
+              </w:rPr>
+              <w:t>Y</w:t>
+            </w:r>
+          </w:p>
+        </w:tc>
+      </w:tr>
+      <w:tr>
+        <w:tc>
+          <w:tcPr>
+            <w:tcW w:w="1924" w:type="dxa"/>
+          </w:tcPr>
+          <w:p>
+            <w:pPr>
+              <w:spacing w:before="100" w:beforeAutospacing="1" w:after="100" w:afterAutospacing="1"/>
+              <w:rPr>
+                <w:rFonts w:ascii="Calibri" w:eastAsia="Times New Roman" w:hAnsi="Calibri" w:cs="Calibri"/>
+              </w:rPr>
+            </w:pPr>
+            <w:r>
+              <w:rPr>
+                <w:rFonts w:ascii="Calibri" w:eastAsia="Times New Roman" w:hAnsi="Calibri" w:cs="Calibri"/>
+              </w:rPr>
+              <w:t>WIFI_GATEWAY</w:t>
+            </w:r>
+          </w:p>
+        </w:tc>
+        <w:tc>
+          <w:tcPr>
+            <w:tcW w:w="5206" w:type="dxa"/>
+          </w:tcPr>
+          <w:p>
+            <w:pPr>
+              <w:spacing w:before="100" w:beforeAutospacing="1" w:after="100" w:afterAutospacing="1"/>
+              <w:rPr>
+                <w:rFonts w:ascii="Calibri" w:eastAsia="Times New Roman" w:hAnsi="Calibri" w:cs="Calibri"/>
+              </w:rPr>
+            </w:pPr>
+            <w:r>
+              <w:rPr>
+                <w:rFonts w:ascii="Calibri" w:eastAsia="Times New Roman" w:hAnsi="Calibri" w:cs="Calibri"/>
+              </w:rPr>
+              <w:t xml:space="preserve">Location of the gateway to </w:t>
+            </w:r>
+            <w:proofErr w:type="spellStart"/>
+            <w:r>
+              <w:rPr>
+                <w:rFonts w:ascii="Calibri" w:eastAsia="Times New Roman" w:hAnsi="Calibri" w:cs="Calibri"/>
+              </w:rPr>
+              <w:t>rthe</w:t>
+            </w:r>
+            <w:proofErr w:type="spellEnd"/>
+            <w:r>
+              <w:rPr>
+                <w:rFonts w:ascii="Calibri" w:eastAsia="Times New Roman" w:hAnsi="Calibri" w:cs="Calibri"/>
+              </w:rPr>
+              <w:t xml:space="preserve"> remote server</w:t>
+            </w:r>
+          </w:p>
+        </w:tc>
+        <w:tc>
+          <w:tcPr>
+            <w:tcW w:w="2961" w:type="dxa"/>
+          </w:tcPr>
+          <w:p>
+            <w:pPr>
+              <w:rPr>
+                <w:rFonts w:ascii="Calibri" w:eastAsia="Times New Roman" w:hAnsi="Calibri" w:cs="Calibri"/>
+              </w:rPr>
+            </w:pPr>
+            <w:r>
+              <w:rPr>
+                <w:rFonts w:ascii="Calibri" w:eastAsia="Times New Roman" w:hAnsi="Calibri" w:cs="Calibri"/>
+              </w:rPr>
+              <w:t>Text (ex “192.168.1.0”)</w:t>
+            </w:r>
+          </w:p>
+        </w:tc>
+        <w:tc>
+          <w:tcPr>
+            <w:tcW w:w="699" w:type="dxa"/>
+          </w:tcPr>
+          <w:p>
+            <w:pPr>
+              <w:spacing w:before="100" w:beforeAutospacing="1" w:after="100" w:afterAutospacing="1"/>
+              <w:jc w:val="center"/>
+              <w:rPr>
+                <w:rFonts w:ascii="Calibri" w:eastAsia="Times New Roman" w:hAnsi="Calibri" w:cs="Calibri"/>
+              </w:rPr>
+            </w:pPr>
+            <w:r>
+              <w:rPr>
+                <w:rFonts w:ascii="Calibri" w:eastAsia="Times New Roman" w:hAnsi="Calibri" w:cs="Calibri"/>
+              </w:rPr>
+              <w:t>Y</w:t>
+            </w:r>
+          </w:p>
+        </w:tc>
+      </w:tr>
+      <w:tr>
+        <w:tc>
+          <w:tcPr>
+            <w:tcW w:w="1924" w:type="dxa"/>
+          </w:tcPr>
+          <w:p>
+            <w:pPr>
+              <w:spacing w:before="100" w:beforeAutospacing="1" w:after="100" w:afterAutospacing="1"/>
+              <w:rPr>
+                <w:rFonts w:ascii="Calibri" w:eastAsia="Times New Roman" w:hAnsi="Calibri" w:cs="Calibri"/>
+              </w:rPr>
+            </w:pPr>
+            <w:r>
+              <w:rPr>
+                <w:rFonts w:ascii="Calibri" w:eastAsia="Times New Roman" w:hAnsi="Calibri" w:cs="Calibri"/>
+              </w:rPr>
               <w:t>WIFI_</w:t>
             </w:r>
             <w:r>
@@ -15325,6 +15831,85 @@
                 <w:rFonts w:ascii="Calibri" w:eastAsia="Times New Roman" w:hAnsi="Calibri" w:cs="Calibri"/>
               </w:rPr>
               <w:t>1 – Hode SSID</w:t>
+            </w:r>
+          </w:p>
+        </w:tc>
+        <w:tc>
+          <w:tcPr>
+            <w:tcW w:w="699" w:type="dxa"/>
+          </w:tcPr>
+          <w:p>
+            <w:pPr>
+              <w:spacing w:before="100" w:beforeAutospacing="1" w:after="100" w:afterAutospacing="1"/>
+              <w:jc w:val="center"/>
+              <w:rPr>
+                <w:rFonts w:ascii="Calibri" w:eastAsia="Times New Roman" w:hAnsi="Calibri" w:cs="Calibri"/>
+              </w:rPr>
+            </w:pPr>
+            <w:r>
+              <w:rPr>
+                <w:rFonts w:ascii="Calibri" w:eastAsia="Times New Roman" w:hAnsi="Calibri" w:cs="Calibri"/>
+              </w:rPr>
+              <w:t>Y</w:t>
+            </w:r>
+          </w:p>
+        </w:tc>
+      </w:tr>
+      <w:tr>
+        <w:tc>
+          <w:tcPr>
+            <w:tcW w:w="1924" w:type="dxa"/>
+          </w:tcPr>
+          <w:p>
+            <w:pPr>
+              <w:spacing w:before="100" w:beforeAutospacing="1" w:after="100" w:afterAutospacing="1"/>
+              <w:rPr>
+                <w:rFonts w:ascii="Calibri" w:eastAsia="Times New Roman" w:hAnsi="Calibri" w:cs="Calibri"/>
+              </w:rPr>
+            </w:pPr>
+            <w:r>
+              <w:rPr>
+                <w:rFonts w:ascii="Calibri" w:eastAsia="Times New Roman" w:hAnsi="Calibri" w:cs="Calibri"/>
+              </w:rPr>
+              <w:t>WIFI_IP</w:t>
+            </w:r>
+          </w:p>
+        </w:tc>
+        <w:tc>
+          <w:tcPr>
+            <w:tcW w:w="5206" w:type="dxa"/>
+          </w:tcPr>
+          <w:p>
+            <w:pPr>
+              <w:spacing w:before="100" w:beforeAutospacing="1" w:after="100" w:afterAutospacing="1"/>
+              <w:rPr>
+                <w:rFonts w:ascii="Calibri" w:eastAsia="Times New Roman" w:hAnsi="Calibri" w:cs="Calibri"/>
+              </w:rPr>
+            </w:pPr>
+            <w:r>
+              <w:rPr>
+                <w:rFonts w:ascii="Calibri" w:eastAsia="Times New Roman" w:hAnsi="Calibri" w:cs="Calibri"/>
+              </w:rPr>
+              <w:t>Static IP of the target (empty =&gt; not used)</w:t>
+            </w:r>
+          </w:p>
+        </w:tc>
+        <w:tc>
+          <w:tcPr>
+            <w:tcW w:w="2961" w:type="dxa"/>
+          </w:tcPr>
+          <w:p>
+            <w:pPr>
+              <w:spacing w:before="100" w:beforeAutospacing="1" w:after="100" w:afterAutospacing="1"/>
+              <w:rPr>
+                <w:rFonts w:ascii="Calibri" w:eastAsia="Times New Roman" w:hAnsi="Calibri" w:cs="Calibri"/>
+              </w:rPr>
+            </w:pPr>
+            <w:r>
+              <w:rPr>
+                <w:rFonts w:ascii="Calibri" w:eastAsia="Times New Roman" w:hAnsi="Calibri" w:cs="Calibri"/>
+              </w:rPr>
+              <w:t>Text (ex “192.168.1.54”)</w:t>
             </w:r>
           </w:p>
         </w:tc>
@@ -16394,6 +16979,7 @@
               <w:rPr>
                 <w:rFonts w:ascii="Calibri" w:eastAsia="Times New Roman" w:hAnsi="Calibri" w:cs="Calibri"/>
               </w:rPr>
+              <w:lastRenderedPageBreak/>
               <w:t>RUN_STATE</w:t>
             </w:r>
           </w:p>
@@ -16584,7 +17170,6 @@
               <w:rPr>
                 <w:rFonts w:ascii="Calibri" w:eastAsia="Times New Roman" w:hAnsi="Calibri" w:cs="Calibri"/>
               </w:rPr>
-              <w:lastRenderedPageBreak/>
               <w:t>TIME_TO_SLEEP</w:t>
             </w:r>
           </w:p>
@@ -17629,6 +18214,7 @@
     </w:p>
     <w:p>
       <w:r>
+        <w:lastRenderedPageBreak/>
         <w:t xml:space="preserve">The stepper motor requires a separate circuit, for example </w:t>
       </w:r>
       <w:r>
@@ -17677,7 +18263,6 @@
     </w:p>
     <w:p>
       <w:r>
-        <w:lastRenderedPageBreak/>
         <w:t>{“PAPER_ON”:0</w:t>
       </w:r>
     </w:p>
@@ -17839,6 +18424,7 @@
     </w:p>
     <w:p>
       <w:r>
+        <w:lastRenderedPageBreak/>
         <w:t>{“</w:t>
       </w:r>
       <w:proofErr w:type="spellStart"/>
@@ -17854,6 +18440,24 @@
       <w:r>
         <w:t xml:space="preserve"> network”}</w:t>
       </w:r>
+      <w:r>
+        <w:tab/>
+      </w:r>
+      <w:r>
+        <w:tab/>
+      </w:r>
+      <w:r>
+        <w:tab/>
+        <w:t>Example “</w:t>
+      </w:r>
+      <w:proofErr w:type="spellStart"/>
+      <w:r>
+        <w:t>myHome</w:t>
+      </w:r>
+      <w:proofErr w:type="spellEnd"/>
+      <w:r>
+        <w:t>”</w:t>
+      </w:r>
     </w:p>
     <w:p>
       <w:r>
@@ -17875,6 +18479,82 @@
       <w:r>
         <w:t>”}</w:t>
       </w:r>
+      <w:r>
+        <w:tab/>
+      </w:r>
+      <w:r>
+        <w:tab/>
+      </w:r>
+      <w:r>
+        <w:tab/>
+        <w:t>Example “12345678”</w:t>
+      </w:r>
+    </w:p>
+    <w:p>
+      <w:r>
+        <w:t>Optional Static IP</w:t>
+      </w:r>
+    </w:p>
+    <w:p>
+      <w:r>
+        <w:t>{“WIFI_</w:t>
+      </w:r>
+      <w:r>
+        <w:t>IP</w:t>
+      </w:r>
+      <w:r>
+        <w:t>”</w:t>
+      </w:r>
+      <w:proofErr w:type="gramStart"/>
+      <w:r>
+        <w:t>:”</w:t>
+      </w:r>
+      <w:r>
+        <w:t>IP</w:t>
+      </w:r>
+      <w:proofErr w:type="gramEnd"/>
+      <w:r>
+        <w:t xml:space="preserve"> address of the target </w:t>
+      </w:r>
+      <w:r>
+        <w:t>”}</w:t>
+      </w:r>
+      <w:r>
+        <w:tab/>
+      </w:r>
+      <w:r>
+        <w:tab/>
+        <w:t>Example 192.168.1.54</w:t>
+      </w:r>
+    </w:p>
+    <w:p>
+      <w:r>
+        <w:t>{“WIFI_</w:t>
+      </w:r>
+      <w:r>
+        <w:t>GATEWAY</w:t>
+      </w:r>
+      <w:r>
+        <w:t>”</w:t>
+      </w:r>
+      <w:proofErr w:type="gramStart"/>
+      <w:r>
+        <w:t>:”IP</w:t>
+      </w:r>
+      <w:proofErr w:type="gramEnd"/>
+      <w:r>
+        <w:t xml:space="preserve"> address </w:t>
+      </w:r>
+      <w:r>
+        <w:t>of the gateway</w:t>
+      </w:r>
+      <w:r>
+        <w:t xml:space="preserve"> ”}</w:t>
+      </w:r>
+      <w:r>
+        <w:tab/>
+        <w:t>Typically 192.168.1.0</w:t>
+      </w:r>
     </w:p>
     <w:p>
       <w:pPr>
@@ -17882,7 +18562,6 @@
       </w:pPr>
       <w:bookmarkStart w:id="64" w:name="_Toc185694469"/>
       <w:r>
-        <w:lastRenderedPageBreak/>
         <w:t xml:space="preserve">WiFi Access </w:t>
       </w:r>
       <w:r>
@@ -21425,7 +22104,7 @@
 </file>
 
 <file path=word/endnotes.xml><?xml version="1.0" encoding="utf-8"?>
-<w:endnotes xmlns:wpc="http://schemas.microsoft.com/office/word/2010/wordprocessingCanvas" xmlns:cx="http://schemas.microsoft.com/office/drawing/2014/chartex" xmlns:cx1="http://schemas.microsoft.com/office/drawing/2015/9/8/chartex" xmlns:cx2="http://schemas.microsoft.com/office/drawing/2015/10/21/chartex" xmlns:cx3="http://schemas.microsoft.com/office/drawing/2016/5/9/chartex" xmlns:cx4="http://schemas.microsoft.com/office/drawing/2016/5/10/chartex" xmlns:cx5="http://schemas.microsoft.com/office/drawing/2016/5/11/chartex" xmlns:cx6="http://schemas.microsoft.com/office/drawing/2016/5/12/chartex" xmlns:cx7="http://schemas.microsoft.com/office/drawing/2016/5/13/chartex" xmlns:cx8="http://schemas.microsoft.com/office/drawing/2016/5/14/chartex" xmlns:mc="http://schemas.openxmlformats.org/markup-compatibility/2006" xmlns:aink="http://schemas.microsoft.com/office/drawing/2016/ink" xmlns:am3d="http://schemas.microsoft.com/office/drawing/2017/model3d" xmlns:o="urn:schemas-microsoft-com:office:office" xmlns:oel="http://schemas.microsoft.com/office/2019/extlst" xmlns:r="http://schemas.openxmlformats.org/officeDocument/2006/relationships" xmlns:m="http://schemas.openxmlformats.org/officeDocument/2006/math" xmlns:v="urn:schemas-microsoft-com:vml" xmlns:wp14="http://schemas.microsoft.com/office/word/2010/wordprocessingDrawing" xmlns:wp="http://schemas.openxmlformats.org/drawingml/2006/wordprocessingDrawing" xmlns:w10="urn:schemas-microsoft-com:office:word" xmlns:w="http://schemas.openxmlformats.org/wordprocessingml/2006/main" xmlns:w14="http://schemas.microsoft.com/office/word/2010/wordml" xmlns:w15="http://schemas.microsoft.com/office/word/2012/wordml" xmlns:w16cex="http://schemas.microsoft.com/office/word/2018/wordml/cex" xmlns:w16cid="http://schemas.microsoft.com/office/word/2016/wordml/cid" xmlns:w16="http://schemas.microsoft.com/office/word/2018/wordml" xmlns:w16du="http://schemas.microsoft.com/office/word/2023/wordml/word16du" xmlns:w16sdtdh="http://schemas.microsoft.com/office/word/2020/wordml/sdtdatahash" xmlns:w16se="http://schemas.microsoft.com/office/word/2015/wordml/symex" xmlns:wpg="http://schemas.microsoft.com/office/word/2010/wordprocessingGroup" xmlns:wpi="http://schemas.microsoft.com/office/word/2010/wordprocessingInk" xmlns:wne="http://schemas.microsoft.com/office/word/2006/wordml" xmlns:wps="http://schemas.microsoft.com/office/word/2010/wordprocessingShape" mc:Ignorable="w14 w15 w16se w16cid w16 w16cex w16sdtdh w16du wp14">
+<w:endnotes xmlns:wpc="http://schemas.microsoft.com/office/word/2010/wordprocessingCanvas" xmlns:cx="http://schemas.microsoft.com/office/drawing/2014/chartex" xmlns:cx1="http://schemas.microsoft.com/office/drawing/2015/9/8/chartex" xmlns:cx2="http://schemas.microsoft.com/office/drawing/2015/10/21/chartex" xmlns:cx3="http://schemas.microsoft.com/office/drawing/2016/5/9/chartex" xmlns:cx4="http://schemas.microsoft.com/office/drawing/2016/5/10/chartex" xmlns:cx5="http://schemas.microsoft.com/office/drawing/2016/5/11/chartex" xmlns:cx6="http://schemas.microsoft.com/office/drawing/2016/5/12/chartex" xmlns:cx7="http://schemas.microsoft.com/office/drawing/2016/5/13/chartex" xmlns:cx8="http://schemas.microsoft.com/office/drawing/2016/5/14/chartex" xmlns:mc="http://schemas.openxmlformats.org/markup-compatibility/2006" xmlns:aink="http://schemas.microsoft.com/office/drawing/2016/ink" xmlns:am3d="http://schemas.microsoft.com/office/drawing/2017/model3d" xmlns:o="urn:schemas-microsoft-com:office:office" xmlns:oel="http://schemas.microsoft.com/office/2019/extlst" xmlns:r="http://schemas.openxmlformats.org/officeDocument/2006/relationships" xmlns:m="http://schemas.openxmlformats.org/officeDocument/2006/math" xmlns:v="urn:schemas-microsoft-com:vml" xmlns:wp14="http://schemas.microsoft.com/office/word/2010/wordprocessingDrawing" xmlns:wp="http://schemas.openxmlformats.org/drawingml/2006/wordprocessingDrawing" xmlns:w10="urn:schemas-microsoft-com:office:word" xmlns:w="http://schemas.openxmlformats.org/wordprocessingml/2006/main" xmlns:w14="http://schemas.microsoft.com/office/word/2010/wordml" xmlns:w15="http://schemas.microsoft.com/office/word/2012/wordml" xmlns:w16cex="http://schemas.microsoft.com/office/word/2018/wordml/cex" xmlns:w16cid="http://schemas.microsoft.com/office/word/2016/wordml/cid" xmlns:w16="http://schemas.microsoft.com/office/word/2018/wordml" xmlns:w16du="http://schemas.microsoft.com/office/word/2023/wordml/word16du" xmlns:w16sdtdh="http://schemas.microsoft.com/office/word/2020/wordml/sdtdatahash" xmlns:w16sdtfl="http://schemas.microsoft.com/office/word/2024/wordml/sdtformatlock" xmlns:w16se="http://schemas.microsoft.com/office/word/2015/wordml/symex" xmlns:wpg="http://schemas.microsoft.com/office/word/2010/wordprocessingGroup" xmlns:wpi="http://schemas.microsoft.com/office/word/2010/wordprocessingInk" xmlns:wne="http://schemas.microsoft.com/office/word/2006/wordml" xmlns:wps="http://schemas.microsoft.com/office/word/2010/wordprocessingShape" mc:Ignorable="w14 w15 w16se w16cid w16 w16cex w16sdtdh w16sdtfl w16du wp14">
   <w:endnote w:type="separator" w:id="-1">
     <w:p>
       <w:pPr>
@@ -21450,7 +22129,7 @@
 </file>
 
 <file path=word/footer1.xml><?xml version="1.0" encoding="utf-8"?>
-<w:ftr xmlns:wpc="http://schemas.microsoft.com/office/word/2010/wordprocessingCanvas" xmlns:cx="http://schemas.microsoft.com/office/drawing/2014/chartex" xmlns:cx1="http://schemas.microsoft.com/office/drawing/2015/9/8/chartex" xmlns:cx2="http://schemas.microsoft.com/office/drawing/2015/10/21/chartex" xmlns:cx3="http://schemas.microsoft.com/office/drawing/2016/5/9/chartex" xmlns:cx4="http://schemas.microsoft.com/office/drawing/2016/5/10/chartex" xmlns:cx5="http://schemas.microsoft.com/office/drawing/2016/5/11/chartex" xmlns:cx6="http://schemas.microsoft.com/office/drawing/2016/5/12/chartex" xmlns:cx7="http://schemas.microsoft.com/office/drawing/2016/5/13/chartex" xmlns:cx8="http://schemas.microsoft.com/office/drawing/2016/5/14/chartex" xmlns:mc="http://schemas.openxmlformats.org/markup-compatibility/2006" xmlns:aink="http://schemas.microsoft.com/office/drawing/2016/ink" xmlns:am3d="http://schemas.microsoft.com/office/drawing/2017/model3d" xmlns:o="urn:schemas-microsoft-com:office:office" xmlns:oel="http://schemas.microsoft.com/office/2019/extlst" xmlns:r="http://schemas.openxmlformats.org/officeDocument/2006/relationships" xmlns:m="http://schemas.openxmlformats.org/officeDocument/2006/math" xmlns:v="urn:schemas-microsoft-com:vml" xmlns:wp14="http://schemas.microsoft.com/office/word/2010/wordprocessingDrawing" xmlns:wp="http://schemas.openxmlformats.org/drawingml/2006/wordprocessingDrawing" xmlns:w10="urn:schemas-microsoft-com:office:word" xmlns:w="http://schemas.openxmlformats.org/wordprocessingml/2006/main" xmlns:w14="http://schemas.microsoft.com/office/word/2010/wordml" xmlns:w15="http://schemas.microsoft.com/office/word/2012/wordml" xmlns:w16cex="http://schemas.microsoft.com/office/word/2018/wordml/cex" xmlns:w16cid="http://schemas.microsoft.com/office/word/2016/wordml/cid" xmlns:w16="http://schemas.microsoft.com/office/word/2018/wordml" xmlns:w16du="http://schemas.microsoft.com/office/word/2023/wordml/word16du" xmlns:w16sdtdh="http://schemas.microsoft.com/office/word/2020/wordml/sdtdatahash" xmlns:w16se="http://schemas.microsoft.com/office/word/2015/wordml/symex" xmlns:wpg="http://schemas.microsoft.com/office/word/2010/wordprocessingGroup" xmlns:wpi="http://schemas.microsoft.com/office/word/2010/wordprocessingInk" xmlns:wne="http://schemas.microsoft.com/office/word/2006/wordml" xmlns:wps="http://schemas.microsoft.com/office/word/2010/wordprocessingShape" mc:Ignorable="w14 w15 w16se w16cid w16 w16cex w16sdtdh w16du wp14">
+<w:ftr xmlns:wpc="http://schemas.microsoft.com/office/word/2010/wordprocessingCanvas" xmlns:cx="http://schemas.microsoft.com/office/drawing/2014/chartex" xmlns:cx1="http://schemas.microsoft.com/office/drawing/2015/9/8/chartex" xmlns:cx2="http://schemas.microsoft.com/office/drawing/2015/10/21/chartex" xmlns:cx3="http://schemas.microsoft.com/office/drawing/2016/5/9/chartex" xmlns:cx4="http://schemas.microsoft.com/office/drawing/2016/5/10/chartex" xmlns:cx5="http://schemas.microsoft.com/office/drawing/2016/5/11/chartex" xmlns:cx6="http://schemas.microsoft.com/office/drawing/2016/5/12/chartex" xmlns:cx7="http://schemas.microsoft.com/office/drawing/2016/5/13/chartex" xmlns:cx8="http://schemas.microsoft.com/office/drawing/2016/5/14/chartex" xmlns:mc="http://schemas.openxmlformats.org/markup-compatibility/2006" xmlns:aink="http://schemas.microsoft.com/office/drawing/2016/ink" xmlns:am3d="http://schemas.microsoft.com/office/drawing/2017/model3d" xmlns:o="urn:schemas-microsoft-com:office:office" xmlns:oel="http://schemas.microsoft.com/office/2019/extlst" xmlns:r="http://schemas.openxmlformats.org/officeDocument/2006/relationships" xmlns:m="http://schemas.openxmlformats.org/officeDocument/2006/math" xmlns:v="urn:schemas-microsoft-com:vml" xmlns:wp14="http://schemas.microsoft.com/office/word/2010/wordprocessingDrawing" xmlns:wp="http://schemas.openxmlformats.org/drawingml/2006/wordprocessingDrawing" xmlns:w10="urn:schemas-microsoft-com:office:word" xmlns:w="http://schemas.openxmlformats.org/wordprocessingml/2006/main" xmlns:w14="http://schemas.microsoft.com/office/word/2010/wordml" xmlns:w15="http://schemas.microsoft.com/office/word/2012/wordml" xmlns:w16cex="http://schemas.microsoft.com/office/word/2018/wordml/cex" xmlns:w16cid="http://schemas.microsoft.com/office/word/2016/wordml/cid" xmlns:w16="http://schemas.microsoft.com/office/word/2018/wordml" xmlns:w16du="http://schemas.microsoft.com/office/word/2023/wordml/word16du" xmlns:w16sdtdh="http://schemas.microsoft.com/office/word/2020/wordml/sdtdatahash" xmlns:w16sdtfl="http://schemas.microsoft.com/office/word/2024/wordml/sdtformatlock" xmlns:w16se="http://schemas.microsoft.com/office/word/2015/wordml/symex" xmlns:wpg="http://schemas.microsoft.com/office/word/2010/wordprocessingGroup" xmlns:wpi="http://schemas.microsoft.com/office/word/2010/wordprocessingInk" xmlns:wne="http://schemas.microsoft.com/office/word/2006/wordml" xmlns:wps="http://schemas.microsoft.com/office/word/2010/wordprocessingShape" mc:Ignorable="w14 w15 w16se w16cid w16 w16cex w16sdtdh w16sdtfl w16du wp14">
   <w:sdt>
     <w:sdtPr>
       <w:rPr>
@@ -21502,7 +22181,7 @@
 </file>
 
 <file path=word/footer2.xml><?xml version="1.0" encoding="utf-8"?>
-<w:ftr xmlns:wpc="http://schemas.microsoft.com/office/word/2010/wordprocessingCanvas" xmlns:cx="http://schemas.microsoft.com/office/drawing/2014/chartex" xmlns:cx1="http://schemas.microsoft.com/office/drawing/2015/9/8/chartex" xmlns:cx2="http://schemas.microsoft.com/office/drawing/2015/10/21/chartex" xmlns:cx3="http://schemas.microsoft.com/office/drawing/2016/5/9/chartex" xmlns:cx4="http://schemas.microsoft.com/office/drawing/2016/5/10/chartex" xmlns:cx5="http://schemas.microsoft.com/office/drawing/2016/5/11/chartex" xmlns:cx6="http://schemas.microsoft.com/office/drawing/2016/5/12/chartex" xmlns:cx7="http://schemas.microsoft.com/office/drawing/2016/5/13/chartex" xmlns:cx8="http://schemas.microsoft.com/office/drawing/2016/5/14/chartex" xmlns:mc="http://schemas.openxmlformats.org/markup-compatibility/2006" xmlns:aink="http://schemas.microsoft.com/office/drawing/2016/ink" xmlns:am3d="http://schemas.microsoft.com/office/drawing/2017/model3d" xmlns:o="urn:schemas-microsoft-com:office:office" xmlns:oel="http://schemas.microsoft.com/office/2019/extlst" xmlns:r="http://schemas.openxmlformats.org/officeDocument/2006/relationships" xmlns:m="http://schemas.openxmlformats.org/officeDocument/2006/math" xmlns:v="urn:schemas-microsoft-com:vml" xmlns:wp14="http://schemas.microsoft.com/office/word/2010/wordprocessingDrawing" xmlns:wp="http://schemas.openxmlformats.org/drawingml/2006/wordprocessingDrawing" xmlns:w10="urn:schemas-microsoft-com:office:word" xmlns:w="http://schemas.openxmlformats.org/wordprocessingml/2006/main" xmlns:w14="http://schemas.microsoft.com/office/word/2010/wordml" xmlns:w15="http://schemas.microsoft.com/office/word/2012/wordml" xmlns:w16cex="http://schemas.microsoft.com/office/word/2018/wordml/cex" xmlns:w16cid="http://schemas.microsoft.com/office/word/2016/wordml/cid" xmlns:w16="http://schemas.microsoft.com/office/word/2018/wordml" xmlns:w16du="http://schemas.microsoft.com/office/word/2023/wordml/word16du" xmlns:w16sdtdh="http://schemas.microsoft.com/office/word/2020/wordml/sdtdatahash" xmlns:w16se="http://schemas.microsoft.com/office/word/2015/wordml/symex" xmlns:wpg="http://schemas.microsoft.com/office/word/2010/wordprocessingGroup" xmlns:wpi="http://schemas.microsoft.com/office/word/2010/wordprocessingInk" xmlns:wne="http://schemas.microsoft.com/office/word/2006/wordml" xmlns:wps="http://schemas.microsoft.com/office/word/2010/wordprocessingShape" mc:Ignorable="w14 w15 w16se w16cid w16 w16cex w16sdtdh w16du wp14">
+<w:ftr xmlns:wpc="http://schemas.microsoft.com/office/word/2010/wordprocessingCanvas" xmlns:cx="http://schemas.microsoft.com/office/drawing/2014/chartex" xmlns:cx1="http://schemas.microsoft.com/office/drawing/2015/9/8/chartex" xmlns:cx2="http://schemas.microsoft.com/office/drawing/2015/10/21/chartex" xmlns:cx3="http://schemas.microsoft.com/office/drawing/2016/5/9/chartex" xmlns:cx4="http://schemas.microsoft.com/office/drawing/2016/5/10/chartex" xmlns:cx5="http://schemas.microsoft.com/office/drawing/2016/5/11/chartex" xmlns:cx6="http://schemas.microsoft.com/office/drawing/2016/5/12/chartex" xmlns:cx7="http://schemas.microsoft.com/office/drawing/2016/5/13/chartex" xmlns:cx8="http://schemas.microsoft.com/office/drawing/2016/5/14/chartex" xmlns:mc="http://schemas.openxmlformats.org/markup-compatibility/2006" xmlns:aink="http://schemas.microsoft.com/office/drawing/2016/ink" xmlns:am3d="http://schemas.microsoft.com/office/drawing/2017/model3d" xmlns:o="urn:schemas-microsoft-com:office:office" xmlns:oel="http://schemas.microsoft.com/office/2019/extlst" xmlns:r="http://schemas.openxmlformats.org/officeDocument/2006/relationships" xmlns:m="http://schemas.openxmlformats.org/officeDocument/2006/math" xmlns:v="urn:schemas-microsoft-com:vml" xmlns:wp14="http://schemas.microsoft.com/office/word/2010/wordprocessingDrawing" xmlns:wp="http://schemas.openxmlformats.org/drawingml/2006/wordprocessingDrawing" xmlns:w10="urn:schemas-microsoft-com:office:word" xmlns:w="http://schemas.openxmlformats.org/wordprocessingml/2006/main" xmlns:w14="http://schemas.microsoft.com/office/word/2010/wordml" xmlns:w15="http://schemas.microsoft.com/office/word/2012/wordml" xmlns:w16cex="http://schemas.microsoft.com/office/word/2018/wordml/cex" xmlns:w16cid="http://schemas.microsoft.com/office/word/2016/wordml/cid" xmlns:w16="http://schemas.microsoft.com/office/word/2018/wordml" xmlns:w16du="http://schemas.microsoft.com/office/word/2023/wordml/word16du" xmlns:w16sdtdh="http://schemas.microsoft.com/office/word/2020/wordml/sdtdatahash" xmlns:w16sdtfl="http://schemas.microsoft.com/office/word/2024/wordml/sdtformatlock" xmlns:w16se="http://schemas.microsoft.com/office/word/2015/wordml/symex" xmlns:wpg="http://schemas.microsoft.com/office/word/2010/wordprocessingGroup" xmlns:wpi="http://schemas.microsoft.com/office/word/2010/wordprocessingInk" xmlns:wne="http://schemas.microsoft.com/office/word/2006/wordml" xmlns:wps="http://schemas.microsoft.com/office/word/2010/wordprocessingShape" mc:Ignorable="w14 w15 w16se w16cid w16 w16cex w16sdtdh w16sdtfl w16du wp14">
   <w:sdt>
     <w:sdtPr>
       <w:rPr>
@@ -21563,17 +22242,14 @@
       <w:ind w:right="360"/>
     </w:pPr>
     <w:r>
-      <w:t>December 21</w:t>
-    </w:r>
-    <w:r>
-      <w:t>, 2024</w:t>
+      <w:t>February 21, 2025</w:t>
     </w:r>
   </w:p>
 </w:ftr>
 </file>
 
 <file path=word/footer3.xml><?xml version="1.0" encoding="utf-8"?>
-<w:ftr xmlns:wpc="http://schemas.microsoft.com/office/word/2010/wordprocessingCanvas" xmlns:cx="http://schemas.microsoft.com/office/drawing/2014/chartex" xmlns:cx1="http://schemas.microsoft.com/office/drawing/2015/9/8/chartex" xmlns:cx2="http://schemas.microsoft.com/office/drawing/2015/10/21/chartex" xmlns:cx3="http://schemas.microsoft.com/office/drawing/2016/5/9/chartex" xmlns:cx4="http://schemas.microsoft.com/office/drawing/2016/5/10/chartex" xmlns:cx5="http://schemas.microsoft.com/office/drawing/2016/5/11/chartex" xmlns:cx6="http://schemas.microsoft.com/office/drawing/2016/5/12/chartex" xmlns:cx7="http://schemas.microsoft.com/office/drawing/2016/5/13/chartex" xmlns:cx8="http://schemas.microsoft.com/office/drawing/2016/5/14/chartex" xmlns:mc="http://schemas.openxmlformats.org/markup-compatibility/2006" xmlns:aink="http://schemas.microsoft.com/office/drawing/2016/ink" xmlns:am3d="http://schemas.microsoft.com/office/drawing/2017/model3d" xmlns:o="urn:schemas-microsoft-com:office:office" xmlns:oel="http://schemas.microsoft.com/office/2019/extlst" xmlns:r="http://schemas.openxmlformats.org/officeDocument/2006/relationships" xmlns:m="http://schemas.openxmlformats.org/officeDocument/2006/math" xmlns:v="urn:schemas-microsoft-com:vml" xmlns:wp14="http://schemas.microsoft.com/office/word/2010/wordprocessingDrawing" xmlns:wp="http://schemas.openxmlformats.org/drawingml/2006/wordprocessingDrawing" xmlns:w10="urn:schemas-microsoft-com:office:word" xmlns:w="http://schemas.openxmlformats.org/wordprocessingml/2006/main" xmlns:w14="http://schemas.microsoft.com/office/word/2010/wordml" xmlns:w15="http://schemas.microsoft.com/office/word/2012/wordml" xmlns:w16cex="http://schemas.microsoft.com/office/word/2018/wordml/cex" xmlns:w16cid="http://schemas.microsoft.com/office/word/2016/wordml/cid" xmlns:w16="http://schemas.microsoft.com/office/word/2018/wordml" xmlns:w16du="http://schemas.microsoft.com/office/word/2023/wordml/word16du" xmlns:w16sdtdh="http://schemas.microsoft.com/office/word/2020/wordml/sdtdatahash" xmlns:w16se="http://schemas.microsoft.com/office/word/2015/wordml/symex" xmlns:wpg="http://schemas.microsoft.com/office/word/2010/wordprocessingGroup" xmlns:wpi="http://schemas.microsoft.com/office/word/2010/wordprocessingInk" xmlns:wne="http://schemas.microsoft.com/office/word/2006/wordml" xmlns:wps="http://schemas.microsoft.com/office/word/2010/wordprocessingShape" mc:Ignorable="w14 w15 w16se w16cid w16 w16cex w16sdtdh w16du wp14">
+<w:ftr xmlns:wpc="http://schemas.microsoft.com/office/word/2010/wordprocessingCanvas" xmlns:cx="http://schemas.microsoft.com/office/drawing/2014/chartex" xmlns:cx1="http://schemas.microsoft.com/office/drawing/2015/9/8/chartex" xmlns:cx2="http://schemas.microsoft.com/office/drawing/2015/10/21/chartex" xmlns:cx3="http://schemas.microsoft.com/office/drawing/2016/5/9/chartex" xmlns:cx4="http://schemas.microsoft.com/office/drawing/2016/5/10/chartex" xmlns:cx5="http://schemas.microsoft.com/office/drawing/2016/5/11/chartex" xmlns:cx6="http://schemas.microsoft.com/office/drawing/2016/5/12/chartex" xmlns:cx7="http://schemas.microsoft.com/office/drawing/2016/5/13/chartex" xmlns:cx8="http://schemas.microsoft.com/office/drawing/2016/5/14/chartex" xmlns:mc="http://schemas.openxmlformats.org/markup-compatibility/2006" xmlns:aink="http://schemas.microsoft.com/office/drawing/2016/ink" xmlns:am3d="http://schemas.microsoft.com/office/drawing/2017/model3d" xmlns:o="urn:schemas-microsoft-com:office:office" xmlns:oel="http://schemas.microsoft.com/office/2019/extlst" xmlns:r="http://schemas.openxmlformats.org/officeDocument/2006/relationships" xmlns:m="http://schemas.openxmlformats.org/officeDocument/2006/math" xmlns:v="urn:schemas-microsoft-com:vml" xmlns:wp14="http://schemas.microsoft.com/office/word/2010/wordprocessingDrawing" xmlns:wp="http://schemas.openxmlformats.org/drawingml/2006/wordprocessingDrawing" xmlns:w10="urn:schemas-microsoft-com:office:word" xmlns:w="http://schemas.openxmlformats.org/wordprocessingml/2006/main" xmlns:w14="http://schemas.microsoft.com/office/word/2010/wordml" xmlns:w15="http://schemas.microsoft.com/office/word/2012/wordml" xmlns:w16cex="http://schemas.microsoft.com/office/word/2018/wordml/cex" xmlns:w16cid="http://schemas.microsoft.com/office/word/2016/wordml/cid" xmlns:w16="http://schemas.microsoft.com/office/word/2018/wordml" xmlns:w16du="http://schemas.microsoft.com/office/word/2023/wordml/word16du" xmlns:w16sdtdh="http://schemas.microsoft.com/office/word/2020/wordml/sdtdatahash" xmlns:w16sdtfl="http://schemas.microsoft.com/office/word/2024/wordml/sdtformatlock" xmlns:w16se="http://schemas.microsoft.com/office/word/2015/wordml/symex" xmlns:wpg="http://schemas.microsoft.com/office/word/2010/wordprocessingGroup" xmlns:wpi="http://schemas.microsoft.com/office/word/2010/wordprocessingInk" xmlns:wne="http://schemas.microsoft.com/office/word/2006/wordml" xmlns:wps="http://schemas.microsoft.com/office/word/2010/wordprocessingShape" mc:Ignorable="w14 w15 w16se w16cid w16 w16cex w16sdtdh w16sdtfl w16du wp14">
   <w:sdt>
     <w:sdtPr>
       <w:rPr>
@@ -21638,7 +22314,7 @@
 </file>
 
 <file path=word/footnotes.xml><?xml version="1.0" encoding="utf-8"?>
-<w:footnotes xmlns:wpc="http://schemas.microsoft.com/office/word/2010/wordprocessingCanvas" xmlns:cx="http://schemas.microsoft.com/office/drawing/2014/chartex" xmlns:cx1="http://schemas.microsoft.com/office/drawing/2015/9/8/chartex" xmlns:cx2="http://schemas.microsoft.com/office/drawing/2015/10/21/chartex" xmlns:cx3="http://schemas.microsoft.com/office/drawing/2016/5/9/chartex" xmlns:cx4="http://schemas.microsoft.com/office/drawing/2016/5/10/chartex" xmlns:cx5="http://schemas.microsoft.com/office/drawing/2016/5/11/chartex" xmlns:cx6="http://schemas.microsoft.com/office/drawing/2016/5/12/chartex" xmlns:cx7="http://schemas.microsoft.com/office/drawing/2016/5/13/chartex" xmlns:cx8="http://schemas.microsoft.com/office/drawing/2016/5/14/chartex" xmlns:mc="http://schemas.openxmlformats.org/markup-compatibility/2006" xmlns:aink="http://schemas.microsoft.com/office/drawing/2016/ink" xmlns:am3d="http://schemas.microsoft.com/office/drawing/2017/model3d" xmlns:o="urn:schemas-microsoft-com:office:office" xmlns:oel="http://schemas.microsoft.com/office/2019/extlst" xmlns:r="http://schemas.openxmlformats.org/officeDocument/2006/relationships" xmlns:m="http://schemas.openxmlformats.org/officeDocument/2006/math" xmlns:v="urn:schemas-microsoft-com:vml" xmlns:wp14="http://schemas.microsoft.com/office/word/2010/wordprocessingDrawing" xmlns:wp="http://schemas.openxmlformats.org/drawingml/2006/wordprocessingDrawing" xmlns:w10="urn:schemas-microsoft-com:office:word" xmlns:w="http://schemas.openxmlformats.org/wordprocessingml/2006/main" xmlns:w14="http://schemas.microsoft.com/office/word/2010/wordml" xmlns:w15="http://schemas.microsoft.com/office/word/2012/wordml" xmlns:w16cex="http://schemas.microsoft.com/office/word/2018/wordml/cex" xmlns:w16cid="http://schemas.microsoft.com/office/word/2016/wordml/cid" xmlns:w16="http://schemas.microsoft.com/office/word/2018/wordml" xmlns:w16du="http://schemas.microsoft.com/office/word/2023/wordml/word16du" xmlns:w16sdtdh="http://schemas.microsoft.com/office/word/2020/wordml/sdtdatahash" xmlns:w16se="http://schemas.microsoft.com/office/word/2015/wordml/symex" xmlns:wpg="http://schemas.microsoft.com/office/word/2010/wordprocessingGroup" xmlns:wpi="http://schemas.microsoft.com/office/word/2010/wordprocessingInk" xmlns:wne="http://schemas.microsoft.com/office/word/2006/wordml" xmlns:wps="http://schemas.microsoft.com/office/word/2010/wordprocessingShape" mc:Ignorable="w14 w15 w16se w16cid w16 w16cex w16sdtdh w16du wp14">
+<w:footnotes xmlns:wpc="http://schemas.microsoft.com/office/word/2010/wordprocessingCanvas" xmlns:cx="http://schemas.microsoft.com/office/drawing/2014/chartex" xmlns:cx1="http://schemas.microsoft.com/office/drawing/2015/9/8/chartex" xmlns:cx2="http://schemas.microsoft.com/office/drawing/2015/10/21/chartex" xmlns:cx3="http://schemas.microsoft.com/office/drawing/2016/5/9/chartex" xmlns:cx4="http://schemas.microsoft.com/office/drawing/2016/5/10/chartex" xmlns:cx5="http://schemas.microsoft.com/office/drawing/2016/5/11/chartex" xmlns:cx6="http://schemas.microsoft.com/office/drawing/2016/5/12/chartex" xmlns:cx7="http://schemas.microsoft.com/office/drawing/2016/5/13/chartex" xmlns:cx8="http://schemas.microsoft.com/office/drawing/2016/5/14/chartex" xmlns:mc="http://schemas.openxmlformats.org/markup-compatibility/2006" xmlns:aink="http://schemas.microsoft.com/office/drawing/2016/ink" xmlns:am3d="http://schemas.microsoft.com/office/drawing/2017/model3d" xmlns:o="urn:schemas-microsoft-com:office:office" xmlns:oel="http://schemas.microsoft.com/office/2019/extlst" xmlns:r="http://schemas.openxmlformats.org/officeDocument/2006/relationships" xmlns:m="http://schemas.openxmlformats.org/officeDocument/2006/math" xmlns:v="urn:schemas-microsoft-com:vml" xmlns:wp14="http://schemas.microsoft.com/office/word/2010/wordprocessingDrawing" xmlns:wp="http://schemas.openxmlformats.org/drawingml/2006/wordprocessingDrawing" xmlns:w10="urn:schemas-microsoft-com:office:word" xmlns:w="http://schemas.openxmlformats.org/wordprocessingml/2006/main" xmlns:w14="http://schemas.microsoft.com/office/word/2010/wordml" xmlns:w15="http://schemas.microsoft.com/office/word/2012/wordml" xmlns:w16cex="http://schemas.microsoft.com/office/word/2018/wordml/cex" xmlns:w16cid="http://schemas.microsoft.com/office/word/2016/wordml/cid" xmlns:w16="http://schemas.microsoft.com/office/word/2018/wordml" xmlns:w16du="http://schemas.microsoft.com/office/word/2023/wordml/word16du" xmlns:w16sdtdh="http://schemas.microsoft.com/office/word/2020/wordml/sdtdatahash" xmlns:w16sdtfl="http://schemas.microsoft.com/office/word/2024/wordml/sdtformatlock" xmlns:w16se="http://schemas.microsoft.com/office/word/2015/wordml/symex" xmlns:wpg="http://schemas.microsoft.com/office/word/2010/wordprocessingGroup" xmlns:wpi="http://schemas.microsoft.com/office/word/2010/wordprocessingInk" xmlns:wne="http://schemas.microsoft.com/office/word/2006/wordml" xmlns:wps="http://schemas.microsoft.com/office/word/2010/wordprocessingShape" mc:Ignorable="w14 w15 w16se w16cid w16 w16cex w16sdtdh w16sdtfl w16du wp14">
   <w:footnote w:type="separator" w:id="-1">
     <w:p>
       <w:pPr>
@@ -21663,7 +22339,7 @@
 </file>
 
 <file path=word/header1.xml><?xml version="1.0" encoding="utf-8"?>
-<w:hdr xmlns:wpc="http://schemas.microsoft.com/office/word/2010/wordprocessingCanvas" xmlns:cx="http://schemas.microsoft.com/office/drawing/2014/chartex" xmlns:cx1="http://schemas.microsoft.com/office/drawing/2015/9/8/chartex" xmlns:cx2="http://schemas.microsoft.com/office/drawing/2015/10/21/chartex" xmlns:cx3="http://schemas.microsoft.com/office/drawing/2016/5/9/chartex" xmlns:cx4="http://schemas.microsoft.com/office/drawing/2016/5/10/chartex" xmlns:cx5="http://schemas.microsoft.com/office/drawing/2016/5/11/chartex" xmlns:cx6="http://schemas.microsoft.com/office/drawing/2016/5/12/chartex" xmlns:cx7="http://schemas.microsoft.com/office/drawing/2016/5/13/chartex" xmlns:cx8="http://schemas.microsoft.com/office/drawing/2016/5/14/chartex" xmlns:mc="http://schemas.openxmlformats.org/markup-compatibility/2006" xmlns:aink="http://schemas.microsoft.com/office/drawing/2016/ink" xmlns:am3d="http://schemas.microsoft.com/office/drawing/2017/model3d" xmlns:o="urn:schemas-microsoft-com:office:office" xmlns:oel="http://schemas.microsoft.com/office/2019/extlst" xmlns:r="http://schemas.openxmlformats.org/officeDocument/2006/relationships" xmlns:m="http://schemas.openxmlformats.org/officeDocument/2006/math" xmlns:v="urn:schemas-microsoft-com:vml" xmlns:wp14="http://schemas.microsoft.com/office/word/2010/wordprocessingDrawing" xmlns:wp="http://schemas.openxmlformats.org/drawingml/2006/wordprocessingDrawing" xmlns:w10="urn:schemas-microsoft-com:office:word" xmlns:w="http://schemas.openxmlformats.org/wordprocessingml/2006/main" xmlns:w14="http://schemas.microsoft.com/office/word/2010/wordml" xmlns:w15="http://schemas.microsoft.com/office/word/2012/wordml" xmlns:w16cex="http://schemas.microsoft.com/office/word/2018/wordml/cex" xmlns:w16cid="http://schemas.microsoft.com/office/word/2016/wordml/cid" xmlns:w16="http://schemas.microsoft.com/office/word/2018/wordml" xmlns:w16du="http://schemas.microsoft.com/office/word/2023/wordml/word16du" xmlns:w16sdtdh="http://schemas.microsoft.com/office/word/2020/wordml/sdtdatahash" xmlns:w16se="http://schemas.microsoft.com/office/word/2015/wordml/symex" xmlns:wpg="http://schemas.microsoft.com/office/word/2010/wordprocessingGroup" xmlns:wpi="http://schemas.microsoft.com/office/word/2010/wordprocessingInk" xmlns:wne="http://schemas.microsoft.com/office/word/2006/wordml" xmlns:wps="http://schemas.microsoft.com/office/word/2010/wordprocessingShape" mc:Ignorable="w14 w15 w16se w16cid w16 w16cex w16sdtdh w16du wp14">
+<w:hdr xmlns:wpc="http://schemas.microsoft.com/office/word/2010/wordprocessingCanvas" xmlns:cx="http://schemas.microsoft.com/office/drawing/2014/chartex" xmlns:cx1="http://schemas.microsoft.com/office/drawing/2015/9/8/chartex" xmlns:cx2="http://schemas.microsoft.com/office/drawing/2015/10/21/chartex" xmlns:cx3="http://schemas.microsoft.com/office/drawing/2016/5/9/chartex" xmlns:cx4="http://schemas.microsoft.com/office/drawing/2016/5/10/chartex" xmlns:cx5="http://schemas.microsoft.com/office/drawing/2016/5/11/chartex" xmlns:cx6="http://schemas.microsoft.com/office/drawing/2016/5/12/chartex" xmlns:cx7="http://schemas.microsoft.com/office/drawing/2016/5/13/chartex" xmlns:cx8="http://schemas.microsoft.com/office/drawing/2016/5/14/chartex" xmlns:mc="http://schemas.openxmlformats.org/markup-compatibility/2006" xmlns:aink="http://schemas.microsoft.com/office/drawing/2016/ink" xmlns:am3d="http://schemas.microsoft.com/office/drawing/2017/model3d" xmlns:o="urn:schemas-microsoft-com:office:office" xmlns:oel="http://schemas.microsoft.com/office/2019/extlst" xmlns:r="http://schemas.openxmlformats.org/officeDocument/2006/relationships" xmlns:m="http://schemas.openxmlformats.org/officeDocument/2006/math" xmlns:v="urn:schemas-microsoft-com:vml" xmlns:wp14="http://schemas.microsoft.com/office/word/2010/wordprocessingDrawing" xmlns:wp="http://schemas.openxmlformats.org/drawingml/2006/wordprocessingDrawing" xmlns:w10="urn:schemas-microsoft-com:office:word" xmlns:w="http://schemas.openxmlformats.org/wordprocessingml/2006/main" xmlns:w14="http://schemas.microsoft.com/office/word/2010/wordml" xmlns:w15="http://schemas.microsoft.com/office/word/2012/wordml" xmlns:w16cex="http://schemas.microsoft.com/office/word/2018/wordml/cex" xmlns:w16cid="http://schemas.microsoft.com/office/word/2016/wordml/cid" xmlns:w16="http://schemas.microsoft.com/office/word/2018/wordml" xmlns:w16du="http://schemas.microsoft.com/office/word/2023/wordml/word16du" xmlns:w16sdtdh="http://schemas.microsoft.com/office/word/2020/wordml/sdtdatahash" xmlns:w16sdtfl="http://schemas.microsoft.com/office/word/2024/wordml/sdtformatlock" xmlns:w16se="http://schemas.microsoft.com/office/word/2015/wordml/symex" xmlns:wpg="http://schemas.microsoft.com/office/word/2010/wordprocessingGroup" xmlns:wpi="http://schemas.microsoft.com/office/word/2010/wordprocessingInk" xmlns:wne="http://schemas.microsoft.com/office/word/2006/wordml" xmlns:wps="http://schemas.microsoft.com/office/word/2010/wordprocessingShape" mc:Ignorable="w14 w15 w16se w16cid w16 w16cex w16sdtdh w16sdtfl w16du wp14">
   <w:p>
     <w:pPr>
       <w:pStyle w:val="Heading1"/>
@@ -21781,7 +22457,7 @@
 </file>
 
 <file path=word/header10.xml><?xml version="1.0" encoding="utf-8"?>
-<w:hdr xmlns:wpc="http://schemas.microsoft.com/office/word/2010/wordprocessingCanvas" xmlns:cx="http://schemas.microsoft.com/office/drawing/2014/chartex" xmlns:cx1="http://schemas.microsoft.com/office/drawing/2015/9/8/chartex" xmlns:cx2="http://schemas.microsoft.com/office/drawing/2015/10/21/chartex" xmlns:cx3="http://schemas.microsoft.com/office/drawing/2016/5/9/chartex" xmlns:cx4="http://schemas.microsoft.com/office/drawing/2016/5/10/chartex" xmlns:cx5="http://schemas.microsoft.com/office/drawing/2016/5/11/chartex" xmlns:cx6="http://schemas.microsoft.com/office/drawing/2016/5/12/chartex" xmlns:cx7="http://schemas.microsoft.com/office/drawing/2016/5/13/chartex" xmlns:cx8="http://schemas.microsoft.com/office/drawing/2016/5/14/chartex" xmlns:mc="http://schemas.openxmlformats.org/markup-compatibility/2006" xmlns:aink="http://schemas.microsoft.com/office/drawing/2016/ink" xmlns:am3d="http://schemas.microsoft.com/office/drawing/2017/model3d" xmlns:o="urn:schemas-microsoft-com:office:office" xmlns:oel="http://schemas.microsoft.com/office/2019/extlst" xmlns:r="http://schemas.openxmlformats.org/officeDocument/2006/relationships" xmlns:m="http://schemas.openxmlformats.org/officeDocument/2006/math" xmlns:v="urn:schemas-microsoft-com:vml" xmlns:wp14="http://schemas.microsoft.com/office/word/2010/wordprocessingDrawing" xmlns:wp="http://schemas.openxmlformats.org/drawingml/2006/wordprocessingDrawing" xmlns:w10="urn:schemas-microsoft-com:office:word" xmlns:w="http://schemas.openxmlformats.org/wordprocessingml/2006/main" xmlns:w14="http://schemas.microsoft.com/office/word/2010/wordml" xmlns:w15="http://schemas.microsoft.com/office/word/2012/wordml" xmlns:w16cex="http://schemas.microsoft.com/office/word/2018/wordml/cex" xmlns:w16cid="http://schemas.microsoft.com/office/word/2016/wordml/cid" xmlns:w16="http://schemas.microsoft.com/office/word/2018/wordml" xmlns:w16du="http://schemas.microsoft.com/office/word/2023/wordml/word16du" xmlns:w16sdtdh="http://schemas.microsoft.com/office/word/2020/wordml/sdtdatahash" xmlns:w16se="http://schemas.microsoft.com/office/word/2015/wordml/symex" xmlns:wpg="http://schemas.microsoft.com/office/word/2010/wordprocessingGroup" xmlns:wpi="http://schemas.microsoft.com/office/word/2010/wordprocessingInk" xmlns:wne="http://schemas.microsoft.com/office/word/2006/wordml" xmlns:wps="http://schemas.microsoft.com/office/word/2010/wordprocessingShape" mc:Ignorable="w14 w15 w16se w16cid w16 w16cex w16sdtdh w16du wp14">
+<w:hdr xmlns:wpc="http://schemas.microsoft.com/office/word/2010/wordprocessingCanvas" xmlns:cx="http://schemas.microsoft.com/office/drawing/2014/chartex" xmlns:cx1="http://schemas.microsoft.com/office/drawing/2015/9/8/chartex" xmlns:cx2="http://schemas.microsoft.com/office/drawing/2015/10/21/chartex" xmlns:cx3="http://schemas.microsoft.com/office/drawing/2016/5/9/chartex" xmlns:cx4="http://schemas.microsoft.com/office/drawing/2016/5/10/chartex" xmlns:cx5="http://schemas.microsoft.com/office/drawing/2016/5/11/chartex" xmlns:cx6="http://schemas.microsoft.com/office/drawing/2016/5/12/chartex" xmlns:cx7="http://schemas.microsoft.com/office/drawing/2016/5/13/chartex" xmlns:cx8="http://schemas.microsoft.com/office/drawing/2016/5/14/chartex" xmlns:mc="http://schemas.openxmlformats.org/markup-compatibility/2006" xmlns:aink="http://schemas.microsoft.com/office/drawing/2016/ink" xmlns:am3d="http://schemas.microsoft.com/office/drawing/2017/model3d" xmlns:o="urn:schemas-microsoft-com:office:office" xmlns:oel="http://schemas.microsoft.com/office/2019/extlst" xmlns:r="http://schemas.openxmlformats.org/officeDocument/2006/relationships" xmlns:m="http://schemas.openxmlformats.org/officeDocument/2006/math" xmlns:v="urn:schemas-microsoft-com:vml" xmlns:wp14="http://schemas.microsoft.com/office/word/2010/wordprocessingDrawing" xmlns:wp="http://schemas.openxmlformats.org/drawingml/2006/wordprocessingDrawing" xmlns:w10="urn:schemas-microsoft-com:office:word" xmlns:w="http://schemas.openxmlformats.org/wordprocessingml/2006/main" xmlns:w14="http://schemas.microsoft.com/office/word/2010/wordml" xmlns:w15="http://schemas.microsoft.com/office/word/2012/wordml" xmlns:w16cex="http://schemas.microsoft.com/office/word/2018/wordml/cex" xmlns:w16cid="http://schemas.microsoft.com/office/word/2016/wordml/cid" xmlns:w16="http://schemas.microsoft.com/office/word/2018/wordml" xmlns:w16du="http://schemas.microsoft.com/office/word/2023/wordml/word16du" xmlns:w16sdtdh="http://schemas.microsoft.com/office/word/2020/wordml/sdtdatahash" xmlns:w16sdtfl="http://schemas.microsoft.com/office/word/2024/wordml/sdtformatlock" xmlns:w16se="http://schemas.microsoft.com/office/word/2015/wordml/symex" xmlns:wpg="http://schemas.microsoft.com/office/word/2010/wordprocessingGroup" xmlns:wpi="http://schemas.microsoft.com/office/word/2010/wordprocessingInk" xmlns:wne="http://schemas.microsoft.com/office/word/2006/wordml" xmlns:wps="http://schemas.microsoft.com/office/word/2010/wordprocessingShape" mc:Ignorable="w14 w15 w16se w16cid w16 w16cex w16sdtdh w16sdtfl w16du wp14">
   <w:p>
     <w:pPr>
       <w:pStyle w:val="Heading1"/>
@@ -21899,7 +22575,7 @@
 </file>
 
 <file path=word/header11.xml><?xml version="1.0" encoding="utf-8"?>
-<w:hdr xmlns:wpc="http://schemas.microsoft.com/office/word/2010/wordprocessingCanvas" xmlns:cx="http://schemas.microsoft.com/office/drawing/2014/chartex" xmlns:cx1="http://schemas.microsoft.com/office/drawing/2015/9/8/chartex" xmlns:cx2="http://schemas.microsoft.com/office/drawing/2015/10/21/chartex" xmlns:cx3="http://schemas.microsoft.com/office/drawing/2016/5/9/chartex" xmlns:cx4="http://schemas.microsoft.com/office/drawing/2016/5/10/chartex" xmlns:cx5="http://schemas.microsoft.com/office/drawing/2016/5/11/chartex" xmlns:cx6="http://schemas.microsoft.com/office/drawing/2016/5/12/chartex" xmlns:cx7="http://schemas.microsoft.com/office/drawing/2016/5/13/chartex" xmlns:cx8="http://schemas.microsoft.com/office/drawing/2016/5/14/chartex" xmlns:mc="http://schemas.openxmlformats.org/markup-compatibility/2006" xmlns:aink="http://schemas.microsoft.com/office/drawing/2016/ink" xmlns:am3d="http://schemas.microsoft.com/office/drawing/2017/model3d" xmlns:o="urn:schemas-microsoft-com:office:office" xmlns:oel="http://schemas.microsoft.com/office/2019/extlst" xmlns:r="http://schemas.openxmlformats.org/officeDocument/2006/relationships" xmlns:m="http://schemas.openxmlformats.org/officeDocument/2006/math" xmlns:v="urn:schemas-microsoft-com:vml" xmlns:wp14="http://schemas.microsoft.com/office/word/2010/wordprocessingDrawing" xmlns:wp="http://schemas.openxmlformats.org/drawingml/2006/wordprocessingDrawing" xmlns:w10="urn:schemas-microsoft-com:office:word" xmlns:w="http://schemas.openxmlformats.org/wordprocessingml/2006/main" xmlns:w14="http://schemas.microsoft.com/office/word/2010/wordml" xmlns:w15="http://schemas.microsoft.com/office/word/2012/wordml" xmlns:w16cex="http://schemas.microsoft.com/office/word/2018/wordml/cex" xmlns:w16cid="http://schemas.microsoft.com/office/word/2016/wordml/cid" xmlns:w16="http://schemas.microsoft.com/office/word/2018/wordml" xmlns:w16du="http://schemas.microsoft.com/office/word/2023/wordml/word16du" xmlns:w16sdtdh="http://schemas.microsoft.com/office/word/2020/wordml/sdtdatahash" xmlns:w16se="http://schemas.microsoft.com/office/word/2015/wordml/symex" xmlns:wpg="http://schemas.microsoft.com/office/word/2010/wordprocessingGroup" xmlns:wpi="http://schemas.microsoft.com/office/word/2010/wordprocessingInk" xmlns:wne="http://schemas.microsoft.com/office/word/2006/wordml" xmlns:wps="http://schemas.microsoft.com/office/word/2010/wordprocessingShape" mc:Ignorable="w14 w15 w16se w16cid w16 w16cex w16sdtdh w16du wp14">
+<w:hdr xmlns:wpc="http://schemas.microsoft.com/office/word/2010/wordprocessingCanvas" xmlns:cx="http://schemas.microsoft.com/office/drawing/2014/chartex" xmlns:cx1="http://schemas.microsoft.com/office/drawing/2015/9/8/chartex" xmlns:cx2="http://schemas.microsoft.com/office/drawing/2015/10/21/chartex" xmlns:cx3="http://schemas.microsoft.com/office/drawing/2016/5/9/chartex" xmlns:cx4="http://schemas.microsoft.com/office/drawing/2016/5/10/chartex" xmlns:cx5="http://schemas.microsoft.com/office/drawing/2016/5/11/chartex" xmlns:cx6="http://schemas.microsoft.com/office/drawing/2016/5/12/chartex" xmlns:cx7="http://schemas.microsoft.com/office/drawing/2016/5/13/chartex" xmlns:cx8="http://schemas.microsoft.com/office/drawing/2016/5/14/chartex" xmlns:mc="http://schemas.openxmlformats.org/markup-compatibility/2006" xmlns:aink="http://schemas.microsoft.com/office/drawing/2016/ink" xmlns:am3d="http://schemas.microsoft.com/office/drawing/2017/model3d" xmlns:o="urn:schemas-microsoft-com:office:office" xmlns:oel="http://schemas.microsoft.com/office/2019/extlst" xmlns:r="http://schemas.openxmlformats.org/officeDocument/2006/relationships" xmlns:m="http://schemas.openxmlformats.org/officeDocument/2006/math" xmlns:v="urn:schemas-microsoft-com:vml" xmlns:wp14="http://schemas.microsoft.com/office/word/2010/wordprocessingDrawing" xmlns:wp="http://schemas.openxmlformats.org/drawingml/2006/wordprocessingDrawing" xmlns:w10="urn:schemas-microsoft-com:office:word" xmlns:w="http://schemas.openxmlformats.org/wordprocessingml/2006/main" xmlns:w14="http://schemas.microsoft.com/office/word/2010/wordml" xmlns:w15="http://schemas.microsoft.com/office/word/2012/wordml" xmlns:w16cex="http://schemas.microsoft.com/office/word/2018/wordml/cex" xmlns:w16cid="http://schemas.microsoft.com/office/word/2016/wordml/cid" xmlns:w16="http://schemas.microsoft.com/office/word/2018/wordml" xmlns:w16du="http://schemas.microsoft.com/office/word/2023/wordml/word16du" xmlns:w16sdtdh="http://schemas.microsoft.com/office/word/2020/wordml/sdtdatahash" xmlns:w16sdtfl="http://schemas.microsoft.com/office/word/2024/wordml/sdtformatlock" xmlns:w16se="http://schemas.microsoft.com/office/word/2015/wordml/symex" xmlns:wpg="http://schemas.microsoft.com/office/word/2010/wordprocessingGroup" xmlns:wpi="http://schemas.microsoft.com/office/word/2010/wordprocessingInk" xmlns:wne="http://schemas.microsoft.com/office/word/2006/wordml" xmlns:wps="http://schemas.microsoft.com/office/word/2010/wordprocessingShape" mc:Ignorable="w14 w15 w16se w16cid w16 w16cex w16sdtdh w16sdtfl w16du wp14">
   <w:p>
     <w:pPr>
       <w:pStyle w:val="Heading1"/>
@@ -22020,7 +22696,7 @@
 </file>
 
 <file path=word/header12.xml><?xml version="1.0" encoding="utf-8"?>
-<w:hdr xmlns:wpc="http://schemas.microsoft.com/office/word/2010/wordprocessingCanvas" xmlns:cx="http://schemas.microsoft.com/office/drawing/2014/chartex" xmlns:cx1="http://schemas.microsoft.com/office/drawing/2015/9/8/chartex" xmlns:cx2="http://schemas.microsoft.com/office/drawing/2015/10/21/chartex" xmlns:cx3="http://schemas.microsoft.com/office/drawing/2016/5/9/chartex" xmlns:cx4="http://schemas.microsoft.com/office/drawing/2016/5/10/chartex" xmlns:cx5="http://schemas.microsoft.com/office/drawing/2016/5/11/chartex" xmlns:cx6="http://schemas.microsoft.com/office/drawing/2016/5/12/chartex" xmlns:cx7="http://schemas.microsoft.com/office/drawing/2016/5/13/chartex" xmlns:cx8="http://schemas.microsoft.com/office/drawing/2016/5/14/chartex" xmlns:mc="http://schemas.openxmlformats.org/markup-compatibility/2006" xmlns:aink="http://schemas.microsoft.com/office/drawing/2016/ink" xmlns:am3d="http://schemas.microsoft.com/office/drawing/2017/model3d" xmlns:o="urn:schemas-microsoft-com:office:office" xmlns:oel="http://schemas.microsoft.com/office/2019/extlst" xmlns:r="http://schemas.openxmlformats.org/officeDocument/2006/relationships" xmlns:m="http://schemas.openxmlformats.org/officeDocument/2006/math" xmlns:v="urn:schemas-microsoft-com:vml" xmlns:wp14="http://schemas.microsoft.com/office/word/2010/wordprocessingDrawing" xmlns:wp="http://schemas.openxmlformats.org/drawingml/2006/wordprocessingDrawing" xmlns:w10="urn:schemas-microsoft-com:office:word" xmlns:w="http://schemas.openxmlformats.org/wordprocessingml/2006/main" xmlns:w14="http://schemas.microsoft.com/office/word/2010/wordml" xmlns:w15="http://schemas.microsoft.com/office/word/2012/wordml" xmlns:w16cex="http://schemas.microsoft.com/office/word/2018/wordml/cex" xmlns:w16cid="http://schemas.microsoft.com/office/word/2016/wordml/cid" xmlns:w16="http://schemas.microsoft.com/office/word/2018/wordml" xmlns:w16du="http://schemas.microsoft.com/office/word/2023/wordml/word16du" xmlns:w16sdtdh="http://schemas.microsoft.com/office/word/2020/wordml/sdtdatahash" xmlns:w16se="http://schemas.microsoft.com/office/word/2015/wordml/symex" xmlns:wpg="http://schemas.microsoft.com/office/word/2010/wordprocessingGroup" xmlns:wpi="http://schemas.microsoft.com/office/word/2010/wordprocessingInk" xmlns:wne="http://schemas.microsoft.com/office/word/2006/wordml" xmlns:wps="http://schemas.microsoft.com/office/word/2010/wordprocessingShape" mc:Ignorable="w14 w15 w16se w16cid w16 w16cex w16sdtdh w16du wp14">
+<w:hdr xmlns:wpc="http://schemas.microsoft.com/office/word/2010/wordprocessingCanvas" xmlns:cx="http://schemas.microsoft.com/office/drawing/2014/chartex" xmlns:cx1="http://schemas.microsoft.com/office/drawing/2015/9/8/chartex" xmlns:cx2="http://schemas.microsoft.com/office/drawing/2015/10/21/chartex" xmlns:cx3="http://schemas.microsoft.com/office/drawing/2016/5/9/chartex" xmlns:cx4="http://schemas.microsoft.com/office/drawing/2016/5/10/chartex" xmlns:cx5="http://schemas.microsoft.com/office/drawing/2016/5/11/chartex" xmlns:cx6="http://schemas.microsoft.com/office/drawing/2016/5/12/chartex" xmlns:cx7="http://schemas.microsoft.com/office/drawing/2016/5/13/chartex" xmlns:cx8="http://schemas.microsoft.com/office/drawing/2016/5/14/chartex" xmlns:mc="http://schemas.openxmlformats.org/markup-compatibility/2006" xmlns:aink="http://schemas.microsoft.com/office/drawing/2016/ink" xmlns:am3d="http://schemas.microsoft.com/office/drawing/2017/model3d" xmlns:o="urn:schemas-microsoft-com:office:office" xmlns:oel="http://schemas.microsoft.com/office/2019/extlst" xmlns:r="http://schemas.openxmlformats.org/officeDocument/2006/relationships" xmlns:m="http://schemas.openxmlformats.org/officeDocument/2006/math" xmlns:v="urn:schemas-microsoft-com:vml" xmlns:wp14="http://schemas.microsoft.com/office/word/2010/wordprocessingDrawing" xmlns:wp="http://schemas.openxmlformats.org/drawingml/2006/wordprocessingDrawing" xmlns:w10="urn:schemas-microsoft-com:office:word" xmlns:w="http://schemas.openxmlformats.org/wordprocessingml/2006/main" xmlns:w14="http://schemas.microsoft.com/office/word/2010/wordml" xmlns:w15="http://schemas.microsoft.com/office/word/2012/wordml" xmlns:w16cex="http://schemas.microsoft.com/office/word/2018/wordml/cex" xmlns:w16cid="http://schemas.microsoft.com/office/word/2016/wordml/cid" xmlns:w16="http://schemas.microsoft.com/office/word/2018/wordml" xmlns:w16du="http://schemas.microsoft.com/office/word/2023/wordml/word16du" xmlns:w16sdtdh="http://schemas.microsoft.com/office/word/2020/wordml/sdtdatahash" xmlns:w16sdtfl="http://schemas.microsoft.com/office/word/2024/wordml/sdtformatlock" xmlns:w16se="http://schemas.microsoft.com/office/word/2015/wordml/symex" xmlns:wpg="http://schemas.microsoft.com/office/word/2010/wordprocessingGroup" xmlns:wpi="http://schemas.microsoft.com/office/word/2010/wordprocessingInk" xmlns:wne="http://schemas.microsoft.com/office/word/2006/wordml" xmlns:wps="http://schemas.microsoft.com/office/word/2010/wordprocessingShape" mc:Ignorable="w14 w15 w16se w16cid w16 w16cex w16sdtdh w16sdtfl w16du wp14">
   <w:p>
     <w:pPr>
       <w:pStyle w:val="Heading1"/>
@@ -22141,7 +22817,7 @@
 </file>
 
 <file path=word/header13.xml><?xml version="1.0" encoding="utf-8"?>
-<w:hdr xmlns:wpc="http://schemas.microsoft.com/office/word/2010/wordprocessingCanvas" xmlns:cx="http://schemas.microsoft.com/office/drawing/2014/chartex" xmlns:cx1="http://schemas.microsoft.com/office/drawing/2015/9/8/chartex" xmlns:cx2="http://schemas.microsoft.com/office/drawing/2015/10/21/chartex" xmlns:cx3="http://schemas.microsoft.com/office/drawing/2016/5/9/chartex" xmlns:cx4="http://schemas.microsoft.com/office/drawing/2016/5/10/chartex" xmlns:cx5="http://schemas.microsoft.com/office/drawing/2016/5/11/chartex" xmlns:cx6="http://schemas.microsoft.com/office/drawing/2016/5/12/chartex" xmlns:cx7="http://schemas.microsoft.com/office/drawing/2016/5/13/chartex" xmlns:cx8="http://schemas.microsoft.com/office/drawing/2016/5/14/chartex" xmlns:mc="http://schemas.openxmlformats.org/markup-compatibility/2006" xmlns:aink="http://schemas.microsoft.com/office/drawing/2016/ink" xmlns:am3d="http://schemas.microsoft.com/office/drawing/2017/model3d" xmlns:o="urn:schemas-microsoft-com:office:office" xmlns:oel="http://schemas.microsoft.com/office/2019/extlst" xmlns:r="http://schemas.openxmlformats.org/officeDocument/2006/relationships" xmlns:m="http://schemas.openxmlformats.org/officeDocument/2006/math" xmlns:v="urn:schemas-microsoft-com:vml" xmlns:wp14="http://schemas.microsoft.com/office/word/2010/wordprocessingDrawing" xmlns:wp="http://schemas.openxmlformats.org/drawingml/2006/wordprocessingDrawing" xmlns:w10="urn:schemas-microsoft-com:office:word" xmlns:w="http://schemas.openxmlformats.org/wordprocessingml/2006/main" xmlns:w14="http://schemas.microsoft.com/office/word/2010/wordml" xmlns:w15="http://schemas.microsoft.com/office/word/2012/wordml" xmlns:w16cex="http://schemas.microsoft.com/office/word/2018/wordml/cex" xmlns:w16cid="http://schemas.microsoft.com/office/word/2016/wordml/cid" xmlns:w16="http://schemas.microsoft.com/office/word/2018/wordml" xmlns:w16du="http://schemas.microsoft.com/office/word/2023/wordml/word16du" xmlns:w16sdtdh="http://schemas.microsoft.com/office/word/2020/wordml/sdtdatahash" xmlns:w16se="http://schemas.microsoft.com/office/word/2015/wordml/symex" xmlns:wpg="http://schemas.microsoft.com/office/word/2010/wordprocessingGroup" xmlns:wpi="http://schemas.microsoft.com/office/word/2010/wordprocessingInk" xmlns:wne="http://schemas.microsoft.com/office/word/2006/wordml" xmlns:wps="http://schemas.microsoft.com/office/word/2010/wordprocessingShape" mc:Ignorable="w14 w15 w16se w16cid w16 w16cex w16sdtdh w16du wp14">
+<w:hdr xmlns:wpc="http://schemas.microsoft.com/office/word/2010/wordprocessingCanvas" xmlns:cx="http://schemas.microsoft.com/office/drawing/2014/chartex" xmlns:cx1="http://schemas.microsoft.com/office/drawing/2015/9/8/chartex" xmlns:cx2="http://schemas.microsoft.com/office/drawing/2015/10/21/chartex" xmlns:cx3="http://schemas.microsoft.com/office/drawing/2016/5/9/chartex" xmlns:cx4="http://schemas.microsoft.com/office/drawing/2016/5/10/chartex" xmlns:cx5="http://schemas.microsoft.com/office/drawing/2016/5/11/chartex" xmlns:cx6="http://schemas.microsoft.com/office/drawing/2016/5/12/chartex" xmlns:cx7="http://schemas.microsoft.com/office/drawing/2016/5/13/chartex" xmlns:cx8="http://schemas.microsoft.com/office/drawing/2016/5/14/chartex" xmlns:mc="http://schemas.openxmlformats.org/markup-compatibility/2006" xmlns:aink="http://schemas.microsoft.com/office/drawing/2016/ink" xmlns:am3d="http://schemas.microsoft.com/office/drawing/2017/model3d" xmlns:o="urn:schemas-microsoft-com:office:office" xmlns:oel="http://schemas.microsoft.com/office/2019/extlst" xmlns:r="http://schemas.openxmlformats.org/officeDocument/2006/relationships" xmlns:m="http://schemas.openxmlformats.org/officeDocument/2006/math" xmlns:v="urn:schemas-microsoft-com:vml" xmlns:wp14="http://schemas.microsoft.com/office/word/2010/wordprocessingDrawing" xmlns:wp="http://schemas.openxmlformats.org/drawingml/2006/wordprocessingDrawing" xmlns:w10="urn:schemas-microsoft-com:office:word" xmlns:w="http://schemas.openxmlformats.org/wordprocessingml/2006/main" xmlns:w14="http://schemas.microsoft.com/office/word/2010/wordml" xmlns:w15="http://schemas.microsoft.com/office/word/2012/wordml" xmlns:w16cex="http://schemas.microsoft.com/office/word/2018/wordml/cex" xmlns:w16cid="http://schemas.microsoft.com/office/word/2016/wordml/cid" xmlns:w16="http://schemas.microsoft.com/office/word/2018/wordml" xmlns:w16du="http://schemas.microsoft.com/office/word/2023/wordml/word16du" xmlns:w16sdtdh="http://schemas.microsoft.com/office/word/2020/wordml/sdtdatahash" xmlns:w16sdtfl="http://schemas.microsoft.com/office/word/2024/wordml/sdtformatlock" xmlns:w16se="http://schemas.microsoft.com/office/word/2015/wordml/symex" xmlns:wpg="http://schemas.microsoft.com/office/word/2010/wordprocessingGroup" xmlns:wpi="http://schemas.microsoft.com/office/word/2010/wordprocessingInk" xmlns:wne="http://schemas.microsoft.com/office/word/2006/wordml" xmlns:wps="http://schemas.microsoft.com/office/word/2010/wordprocessingShape" mc:Ignorable="w14 w15 w16se w16cid w16 w16cex w16sdtdh w16sdtfl w16du wp14">
   <w:p>
     <w:pPr>
       <w:pStyle w:val="Heading1"/>
@@ -22262,7 +22938,7 @@
 </file>
 
 <file path=word/header14.xml><?xml version="1.0" encoding="utf-8"?>
-<w:hdr xmlns:wpc="http://schemas.microsoft.com/office/word/2010/wordprocessingCanvas" xmlns:cx="http://schemas.microsoft.com/office/drawing/2014/chartex" xmlns:cx1="http://schemas.microsoft.com/office/drawing/2015/9/8/chartex" xmlns:cx2="http://schemas.microsoft.com/office/drawing/2015/10/21/chartex" xmlns:cx3="http://schemas.microsoft.com/office/drawing/2016/5/9/chartex" xmlns:cx4="http://schemas.microsoft.com/office/drawing/2016/5/10/chartex" xmlns:cx5="http://schemas.microsoft.com/office/drawing/2016/5/11/chartex" xmlns:cx6="http://schemas.microsoft.com/office/drawing/2016/5/12/chartex" xmlns:cx7="http://schemas.microsoft.com/office/drawing/2016/5/13/chartex" xmlns:cx8="http://schemas.microsoft.com/office/drawing/2016/5/14/chartex" xmlns:mc="http://schemas.openxmlformats.org/markup-compatibility/2006" xmlns:aink="http://schemas.microsoft.com/office/drawing/2016/ink" xmlns:am3d="http://schemas.microsoft.com/office/drawing/2017/model3d" xmlns:o="urn:schemas-microsoft-com:office:office" xmlns:oel="http://schemas.microsoft.com/office/2019/extlst" xmlns:r="http://schemas.openxmlformats.org/officeDocument/2006/relationships" xmlns:m="http://schemas.openxmlformats.org/officeDocument/2006/math" xmlns:v="urn:schemas-microsoft-com:vml" xmlns:wp14="http://schemas.microsoft.com/office/word/2010/wordprocessingDrawing" xmlns:wp="http://schemas.openxmlformats.org/drawingml/2006/wordprocessingDrawing" xmlns:w10="urn:schemas-microsoft-com:office:word" xmlns:w="http://schemas.openxmlformats.org/wordprocessingml/2006/main" xmlns:w14="http://schemas.microsoft.com/office/word/2010/wordml" xmlns:w15="http://schemas.microsoft.com/office/word/2012/wordml" xmlns:w16cex="http://schemas.microsoft.com/office/word/2018/wordml/cex" xmlns:w16cid="http://schemas.microsoft.com/office/word/2016/wordml/cid" xmlns:w16="http://schemas.microsoft.com/office/word/2018/wordml" xmlns:w16du="http://schemas.microsoft.com/office/word/2023/wordml/word16du" xmlns:w16sdtdh="http://schemas.microsoft.com/office/word/2020/wordml/sdtdatahash" xmlns:w16se="http://schemas.microsoft.com/office/word/2015/wordml/symex" xmlns:wpg="http://schemas.microsoft.com/office/word/2010/wordprocessingGroup" xmlns:wpi="http://schemas.microsoft.com/office/word/2010/wordprocessingInk" xmlns:wne="http://schemas.microsoft.com/office/word/2006/wordml" xmlns:wps="http://schemas.microsoft.com/office/word/2010/wordprocessingShape" mc:Ignorable="w14 w15 w16se w16cid w16 w16cex w16sdtdh w16du wp14">
+<w:hdr xmlns:wpc="http://schemas.microsoft.com/office/word/2010/wordprocessingCanvas" xmlns:cx="http://schemas.microsoft.com/office/drawing/2014/chartex" xmlns:cx1="http://schemas.microsoft.com/office/drawing/2015/9/8/chartex" xmlns:cx2="http://schemas.microsoft.com/office/drawing/2015/10/21/chartex" xmlns:cx3="http://schemas.microsoft.com/office/drawing/2016/5/9/chartex" xmlns:cx4="http://schemas.microsoft.com/office/drawing/2016/5/10/chartex" xmlns:cx5="http://schemas.microsoft.com/office/drawing/2016/5/11/chartex" xmlns:cx6="http://schemas.microsoft.com/office/drawing/2016/5/12/chartex" xmlns:cx7="http://schemas.microsoft.com/office/drawing/2016/5/13/chartex" xmlns:cx8="http://schemas.microsoft.com/office/drawing/2016/5/14/chartex" xmlns:mc="http://schemas.openxmlformats.org/markup-compatibility/2006" xmlns:aink="http://schemas.microsoft.com/office/drawing/2016/ink" xmlns:am3d="http://schemas.microsoft.com/office/drawing/2017/model3d" xmlns:o="urn:schemas-microsoft-com:office:office" xmlns:oel="http://schemas.microsoft.com/office/2019/extlst" xmlns:r="http://schemas.openxmlformats.org/officeDocument/2006/relationships" xmlns:m="http://schemas.openxmlformats.org/officeDocument/2006/math" xmlns:v="urn:schemas-microsoft-com:vml" xmlns:wp14="http://schemas.microsoft.com/office/word/2010/wordprocessingDrawing" xmlns:wp="http://schemas.openxmlformats.org/drawingml/2006/wordprocessingDrawing" xmlns:w10="urn:schemas-microsoft-com:office:word" xmlns:w="http://schemas.openxmlformats.org/wordprocessingml/2006/main" xmlns:w14="http://schemas.microsoft.com/office/word/2010/wordml" xmlns:w15="http://schemas.microsoft.com/office/word/2012/wordml" xmlns:w16cex="http://schemas.microsoft.com/office/word/2018/wordml/cex" xmlns:w16cid="http://schemas.microsoft.com/office/word/2016/wordml/cid" xmlns:w16="http://schemas.microsoft.com/office/word/2018/wordml" xmlns:w16du="http://schemas.microsoft.com/office/word/2023/wordml/word16du" xmlns:w16sdtdh="http://schemas.microsoft.com/office/word/2020/wordml/sdtdatahash" xmlns:w16sdtfl="http://schemas.microsoft.com/office/word/2024/wordml/sdtformatlock" xmlns:w16se="http://schemas.microsoft.com/office/word/2015/wordml/symex" xmlns:wpg="http://schemas.microsoft.com/office/word/2010/wordprocessingGroup" xmlns:wpi="http://schemas.microsoft.com/office/word/2010/wordprocessingInk" xmlns:wne="http://schemas.microsoft.com/office/word/2006/wordml" xmlns:wps="http://schemas.microsoft.com/office/word/2010/wordprocessingShape" mc:Ignorable="w14 w15 w16se w16cid w16 w16cex w16sdtdh w16sdtfl w16du wp14">
   <w:p>
     <w:pPr>
       <w:pStyle w:val="Heading1"/>
@@ -22380,7 +23056,7 @@
 </file>
 
 <file path=word/header2.xml><?xml version="1.0" encoding="utf-8"?>
-<w:hdr xmlns:wpc="http://schemas.microsoft.com/office/word/2010/wordprocessingCanvas" xmlns:cx="http://schemas.microsoft.com/office/drawing/2014/chartex" xmlns:cx1="http://schemas.microsoft.com/office/drawing/2015/9/8/chartex" xmlns:cx2="http://schemas.microsoft.com/office/drawing/2015/10/21/chartex" xmlns:cx3="http://schemas.microsoft.com/office/drawing/2016/5/9/chartex" xmlns:cx4="http://schemas.microsoft.com/office/drawing/2016/5/10/chartex" xmlns:cx5="http://schemas.microsoft.com/office/drawing/2016/5/11/chartex" xmlns:cx6="http://schemas.microsoft.com/office/drawing/2016/5/12/chartex" xmlns:cx7="http://schemas.microsoft.com/office/drawing/2016/5/13/chartex" xmlns:cx8="http://schemas.microsoft.com/office/drawing/2016/5/14/chartex" xmlns:mc="http://schemas.openxmlformats.org/markup-compatibility/2006" xmlns:aink="http://schemas.microsoft.com/office/drawing/2016/ink" xmlns:am3d="http://schemas.microsoft.com/office/drawing/2017/model3d" xmlns:o="urn:schemas-microsoft-com:office:office" xmlns:oel="http://schemas.microsoft.com/office/2019/extlst" xmlns:r="http://schemas.openxmlformats.org/officeDocument/2006/relationships" xmlns:m="http://schemas.openxmlformats.org/officeDocument/2006/math" xmlns:v="urn:schemas-microsoft-com:vml" xmlns:wp14="http://schemas.microsoft.com/office/word/2010/wordprocessingDrawing" xmlns:wp="http://schemas.openxmlformats.org/drawingml/2006/wordprocessingDrawing" xmlns:w10="urn:schemas-microsoft-com:office:word" xmlns:w="http://schemas.openxmlformats.org/wordprocessingml/2006/main" xmlns:w14="http://schemas.microsoft.com/office/word/2010/wordml" xmlns:w15="http://schemas.microsoft.com/office/word/2012/wordml" xmlns:w16cex="http://schemas.microsoft.com/office/word/2018/wordml/cex" xmlns:w16cid="http://schemas.microsoft.com/office/word/2016/wordml/cid" xmlns:w16="http://schemas.microsoft.com/office/word/2018/wordml" xmlns:w16du="http://schemas.microsoft.com/office/word/2023/wordml/word16du" xmlns:w16sdtdh="http://schemas.microsoft.com/office/word/2020/wordml/sdtdatahash" xmlns:w16se="http://schemas.microsoft.com/office/word/2015/wordml/symex" xmlns:wpg="http://schemas.microsoft.com/office/word/2010/wordprocessingGroup" xmlns:wpi="http://schemas.microsoft.com/office/word/2010/wordprocessingInk" xmlns:wne="http://schemas.microsoft.com/office/word/2006/wordml" xmlns:wps="http://schemas.microsoft.com/office/word/2010/wordprocessingShape" mc:Ignorable="w14 w15 w16se w16cid w16 w16cex w16sdtdh w16du wp14">
+<w:hdr xmlns:wpc="http://schemas.microsoft.com/office/word/2010/wordprocessingCanvas" xmlns:cx="http://schemas.microsoft.com/office/drawing/2014/chartex" xmlns:cx1="http://schemas.microsoft.com/office/drawing/2015/9/8/chartex" xmlns:cx2="http://schemas.microsoft.com/office/drawing/2015/10/21/chartex" xmlns:cx3="http://schemas.microsoft.com/office/drawing/2016/5/9/chartex" xmlns:cx4="http://schemas.microsoft.com/office/drawing/2016/5/10/chartex" xmlns:cx5="http://schemas.microsoft.com/office/drawing/2016/5/11/chartex" xmlns:cx6="http://schemas.microsoft.com/office/drawing/2016/5/12/chartex" xmlns:cx7="http://schemas.microsoft.com/office/drawing/2016/5/13/chartex" xmlns:cx8="http://schemas.microsoft.com/office/drawing/2016/5/14/chartex" xmlns:mc="http://schemas.openxmlformats.org/markup-compatibility/2006" xmlns:aink="http://schemas.microsoft.com/office/drawing/2016/ink" xmlns:am3d="http://schemas.microsoft.com/office/drawing/2017/model3d" xmlns:o="urn:schemas-microsoft-com:office:office" xmlns:oel="http://schemas.microsoft.com/office/2019/extlst" xmlns:r="http://schemas.openxmlformats.org/officeDocument/2006/relationships" xmlns:m="http://schemas.openxmlformats.org/officeDocument/2006/math" xmlns:v="urn:schemas-microsoft-com:vml" xmlns:wp14="http://schemas.microsoft.com/office/word/2010/wordprocessingDrawing" xmlns:wp="http://schemas.openxmlformats.org/drawingml/2006/wordprocessingDrawing" xmlns:w10="urn:schemas-microsoft-com:office:word" xmlns:w="http://schemas.openxmlformats.org/wordprocessingml/2006/main" xmlns:w14="http://schemas.microsoft.com/office/word/2010/wordml" xmlns:w15="http://schemas.microsoft.com/office/word/2012/wordml" xmlns:w16cex="http://schemas.microsoft.com/office/word/2018/wordml/cex" xmlns:w16cid="http://schemas.microsoft.com/office/word/2016/wordml/cid" xmlns:w16="http://schemas.microsoft.com/office/word/2018/wordml" xmlns:w16du="http://schemas.microsoft.com/office/word/2023/wordml/word16du" xmlns:w16sdtdh="http://schemas.microsoft.com/office/word/2020/wordml/sdtdatahash" xmlns:w16sdtfl="http://schemas.microsoft.com/office/word/2024/wordml/sdtformatlock" xmlns:w16se="http://schemas.microsoft.com/office/word/2015/wordml/symex" xmlns:wpg="http://schemas.microsoft.com/office/word/2010/wordprocessingGroup" xmlns:wpi="http://schemas.microsoft.com/office/word/2010/wordprocessingInk" xmlns:wne="http://schemas.microsoft.com/office/word/2006/wordml" xmlns:wps="http://schemas.microsoft.com/office/word/2010/wordprocessingShape" mc:Ignorable="w14 w15 w16se w16cid w16 w16cex w16sdtdh w16sdtfl w16du wp14">
   <w:p>
     <w:pPr>
       <w:pStyle w:val="Heading1"/>
@@ -22398,7 +23074,7 @@
 </file>
 
 <file path=word/header3.xml><?xml version="1.0" encoding="utf-8"?>
-<w:hdr xmlns:wpc="http://schemas.microsoft.com/office/word/2010/wordprocessingCanvas" xmlns:cx="http://schemas.microsoft.com/office/drawing/2014/chartex" xmlns:cx1="http://schemas.microsoft.com/office/drawing/2015/9/8/chartex" xmlns:cx2="http://schemas.microsoft.com/office/drawing/2015/10/21/chartex" xmlns:cx3="http://schemas.microsoft.com/office/drawing/2016/5/9/chartex" xmlns:cx4="http://schemas.microsoft.com/office/drawing/2016/5/10/chartex" xmlns:cx5="http://schemas.microsoft.com/office/drawing/2016/5/11/chartex" xmlns:cx6="http://schemas.microsoft.com/office/drawing/2016/5/12/chartex" xmlns:cx7="http://schemas.microsoft.com/office/drawing/2016/5/13/chartex" xmlns:cx8="http://schemas.microsoft.com/office/drawing/2016/5/14/chartex" xmlns:mc="http://schemas.openxmlformats.org/markup-compatibility/2006" xmlns:aink="http://schemas.microsoft.com/office/drawing/2016/ink" xmlns:am3d="http://schemas.microsoft.com/office/drawing/2017/model3d" xmlns:o="urn:schemas-microsoft-com:office:office" xmlns:oel="http://schemas.microsoft.com/office/2019/extlst" xmlns:r="http://schemas.openxmlformats.org/officeDocument/2006/relationships" xmlns:m="http://schemas.openxmlformats.org/officeDocument/2006/math" xmlns:v="urn:schemas-microsoft-com:vml" xmlns:wp14="http://schemas.microsoft.com/office/word/2010/wordprocessingDrawing" xmlns:wp="http://schemas.openxmlformats.org/drawingml/2006/wordprocessingDrawing" xmlns:w10="urn:schemas-microsoft-com:office:word" xmlns:w="http://schemas.openxmlformats.org/wordprocessingml/2006/main" xmlns:w14="http://schemas.microsoft.com/office/word/2010/wordml" xmlns:w15="http://schemas.microsoft.com/office/word/2012/wordml" xmlns:w16cex="http://schemas.microsoft.com/office/word/2018/wordml/cex" xmlns:w16cid="http://schemas.microsoft.com/office/word/2016/wordml/cid" xmlns:w16="http://schemas.microsoft.com/office/word/2018/wordml" xmlns:w16du="http://schemas.microsoft.com/office/word/2023/wordml/word16du" xmlns:w16sdtdh="http://schemas.microsoft.com/office/word/2020/wordml/sdtdatahash" xmlns:w16se="http://schemas.microsoft.com/office/word/2015/wordml/symex" xmlns:wpg="http://schemas.microsoft.com/office/word/2010/wordprocessingGroup" xmlns:wpi="http://schemas.microsoft.com/office/word/2010/wordprocessingInk" xmlns:wne="http://schemas.microsoft.com/office/word/2006/wordml" xmlns:wps="http://schemas.microsoft.com/office/word/2010/wordprocessingShape" mc:Ignorable="w14 w15 w16se w16cid w16 w16cex w16sdtdh w16du wp14">
+<w:hdr xmlns:wpc="http://schemas.microsoft.com/office/word/2010/wordprocessingCanvas" xmlns:cx="http://schemas.microsoft.com/office/drawing/2014/chartex" xmlns:cx1="http://schemas.microsoft.com/office/drawing/2015/9/8/chartex" xmlns:cx2="http://schemas.microsoft.com/office/drawing/2015/10/21/chartex" xmlns:cx3="http://schemas.microsoft.com/office/drawing/2016/5/9/chartex" xmlns:cx4="http://schemas.microsoft.com/office/drawing/2016/5/10/chartex" xmlns:cx5="http://schemas.microsoft.com/office/drawing/2016/5/11/chartex" xmlns:cx6="http://schemas.microsoft.com/office/drawing/2016/5/12/chartex" xmlns:cx7="http://schemas.microsoft.com/office/drawing/2016/5/13/chartex" xmlns:cx8="http://schemas.microsoft.com/office/drawing/2016/5/14/chartex" xmlns:mc="http://schemas.openxmlformats.org/markup-compatibility/2006" xmlns:aink="http://schemas.microsoft.com/office/drawing/2016/ink" xmlns:am3d="http://schemas.microsoft.com/office/drawing/2017/model3d" xmlns:o="urn:schemas-microsoft-com:office:office" xmlns:oel="http://schemas.microsoft.com/office/2019/extlst" xmlns:r="http://schemas.openxmlformats.org/officeDocument/2006/relationships" xmlns:m="http://schemas.openxmlformats.org/officeDocument/2006/math" xmlns:v="urn:schemas-microsoft-com:vml" xmlns:wp14="http://schemas.microsoft.com/office/word/2010/wordprocessingDrawing" xmlns:wp="http://schemas.openxmlformats.org/drawingml/2006/wordprocessingDrawing" xmlns:w10="urn:schemas-microsoft-com:office:word" xmlns:w="http://schemas.openxmlformats.org/wordprocessingml/2006/main" xmlns:w14="http://schemas.microsoft.com/office/word/2010/wordml" xmlns:w15="http://schemas.microsoft.com/office/word/2012/wordml" xmlns:w16cex="http://schemas.microsoft.com/office/word/2018/wordml/cex" xmlns:w16cid="http://schemas.microsoft.com/office/word/2016/wordml/cid" xmlns:w16="http://schemas.microsoft.com/office/word/2018/wordml" xmlns:w16du="http://schemas.microsoft.com/office/word/2023/wordml/word16du" xmlns:w16sdtdh="http://schemas.microsoft.com/office/word/2020/wordml/sdtdatahash" xmlns:w16sdtfl="http://schemas.microsoft.com/office/word/2024/wordml/sdtformatlock" xmlns:w16se="http://schemas.microsoft.com/office/word/2015/wordml/symex" xmlns:wpg="http://schemas.microsoft.com/office/word/2010/wordprocessingGroup" xmlns:wpi="http://schemas.microsoft.com/office/word/2010/wordprocessingInk" xmlns:wne="http://schemas.microsoft.com/office/word/2006/wordml" xmlns:wps="http://schemas.microsoft.com/office/word/2010/wordprocessingShape" mc:Ignorable="w14 w15 w16se w16cid w16 w16cex w16sdtdh w16sdtfl w16du wp14">
   <w:p>
     <w:pPr>
       <w:pStyle w:val="Heading1"/>
@@ -22516,7 +23192,7 @@
 </file>
 
 <file path=word/header4.xml><?xml version="1.0" encoding="utf-8"?>
-<w:hdr xmlns:wpc="http://schemas.microsoft.com/office/word/2010/wordprocessingCanvas" xmlns:cx="http://schemas.microsoft.com/office/drawing/2014/chartex" xmlns:cx1="http://schemas.microsoft.com/office/drawing/2015/9/8/chartex" xmlns:cx2="http://schemas.microsoft.com/office/drawing/2015/10/21/chartex" xmlns:cx3="http://schemas.microsoft.com/office/drawing/2016/5/9/chartex" xmlns:cx4="http://schemas.microsoft.com/office/drawing/2016/5/10/chartex" xmlns:cx5="http://schemas.microsoft.com/office/drawing/2016/5/11/chartex" xmlns:cx6="http://schemas.microsoft.com/office/drawing/2016/5/12/chartex" xmlns:cx7="http://schemas.microsoft.com/office/drawing/2016/5/13/chartex" xmlns:cx8="http://schemas.microsoft.com/office/drawing/2016/5/14/chartex" xmlns:mc="http://schemas.openxmlformats.org/markup-compatibility/2006" xmlns:aink="http://schemas.microsoft.com/office/drawing/2016/ink" xmlns:am3d="http://schemas.microsoft.com/office/drawing/2017/model3d" xmlns:o="urn:schemas-microsoft-com:office:office" xmlns:oel="http://schemas.microsoft.com/office/2019/extlst" xmlns:r="http://schemas.openxmlformats.org/officeDocument/2006/relationships" xmlns:m="http://schemas.openxmlformats.org/officeDocument/2006/math" xmlns:v="urn:schemas-microsoft-com:vml" xmlns:wp14="http://schemas.microsoft.com/office/word/2010/wordprocessingDrawing" xmlns:wp="http://schemas.openxmlformats.org/drawingml/2006/wordprocessingDrawing" xmlns:w10="urn:schemas-microsoft-com:office:word" xmlns:w="http://schemas.openxmlformats.org/wordprocessingml/2006/main" xmlns:w14="http://schemas.microsoft.com/office/word/2010/wordml" xmlns:w15="http://schemas.microsoft.com/office/word/2012/wordml" xmlns:w16cex="http://schemas.microsoft.com/office/word/2018/wordml/cex" xmlns:w16cid="http://schemas.microsoft.com/office/word/2016/wordml/cid" xmlns:w16="http://schemas.microsoft.com/office/word/2018/wordml" xmlns:w16du="http://schemas.microsoft.com/office/word/2023/wordml/word16du" xmlns:w16sdtdh="http://schemas.microsoft.com/office/word/2020/wordml/sdtdatahash" xmlns:w16se="http://schemas.microsoft.com/office/word/2015/wordml/symex" xmlns:wpg="http://schemas.microsoft.com/office/word/2010/wordprocessingGroup" xmlns:wpi="http://schemas.microsoft.com/office/word/2010/wordprocessingInk" xmlns:wne="http://schemas.microsoft.com/office/word/2006/wordml" xmlns:wps="http://schemas.microsoft.com/office/word/2010/wordprocessingShape" mc:Ignorable="w14 w15 w16se w16cid w16 w16cex w16sdtdh w16du wp14">
+<w:hdr xmlns:wpc="http://schemas.microsoft.com/office/word/2010/wordprocessingCanvas" xmlns:cx="http://schemas.microsoft.com/office/drawing/2014/chartex" xmlns:cx1="http://schemas.microsoft.com/office/drawing/2015/9/8/chartex" xmlns:cx2="http://schemas.microsoft.com/office/drawing/2015/10/21/chartex" xmlns:cx3="http://schemas.microsoft.com/office/drawing/2016/5/9/chartex" xmlns:cx4="http://schemas.microsoft.com/office/drawing/2016/5/10/chartex" xmlns:cx5="http://schemas.microsoft.com/office/drawing/2016/5/11/chartex" xmlns:cx6="http://schemas.microsoft.com/office/drawing/2016/5/12/chartex" xmlns:cx7="http://schemas.microsoft.com/office/drawing/2016/5/13/chartex" xmlns:cx8="http://schemas.microsoft.com/office/drawing/2016/5/14/chartex" xmlns:mc="http://schemas.openxmlformats.org/markup-compatibility/2006" xmlns:aink="http://schemas.microsoft.com/office/drawing/2016/ink" xmlns:am3d="http://schemas.microsoft.com/office/drawing/2017/model3d" xmlns:o="urn:schemas-microsoft-com:office:office" xmlns:oel="http://schemas.microsoft.com/office/2019/extlst" xmlns:r="http://schemas.openxmlformats.org/officeDocument/2006/relationships" xmlns:m="http://schemas.openxmlformats.org/officeDocument/2006/math" xmlns:v="urn:schemas-microsoft-com:vml" xmlns:wp14="http://schemas.microsoft.com/office/word/2010/wordprocessingDrawing" xmlns:wp="http://schemas.openxmlformats.org/drawingml/2006/wordprocessingDrawing" xmlns:w10="urn:schemas-microsoft-com:office:word" xmlns:w="http://schemas.openxmlformats.org/wordprocessingml/2006/main" xmlns:w14="http://schemas.microsoft.com/office/word/2010/wordml" xmlns:w15="http://schemas.microsoft.com/office/word/2012/wordml" xmlns:w16cex="http://schemas.microsoft.com/office/word/2018/wordml/cex" xmlns:w16cid="http://schemas.microsoft.com/office/word/2016/wordml/cid" xmlns:w16="http://schemas.microsoft.com/office/word/2018/wordml" xmlns:w16du="http://schemas.microsoft.com/office/word/2023/wordml/word16du" xmlns:w16sdtdh="http://schemas.microsoft.com/office/word/2020/wordml/sdtdatahash" xmlns:w16sdtfl="http://schemas.microsoft.com/office/word/2024/wordml/sdtformatlock" xmlns:w16se="http://schemas.microsoft.com/office/word/2015/wordml/symex" xmlns:wpg="http://schemas.microsoft.com/office/word/2010/wordprocessingGroup" xmlns:wpi="http://schemas.microsoft.com/office/word/2010/wordprocessingInk" xmlns:wne="http://schemas.microsoft.com/office/word/2006/wordml" xmlns:wps="http://schemas.microsoft.com/office/word/2010/wordprocessingShape" mc:Ignorable="w14 w15 w16se w16cid w16 w16cex w16sdtdh w16sdtfl w16du wp14">
   <w:p>
     <w:pPr>
       <w:pStyle w:val="Heading1"/>
@@ -22639,7 +23315,7 @@
 </file>
 
 <file path=word/header5.xml><?xml version="1.0" encoding="utf-8"?>
-<w:hdr xmlns:wpc="http://schemas.microsoft.com/office/word/2010/wordprocessingCanvas" xmlns:cx="http://schemas.microsoft.com/office/drawing/2014/chartex" xmlns:cx1="http://schemas.microsoft.com/office/drawing/2015/9/8/chartex" xmlns:cx2="http://schemas.microsoft.com/office/drawing/2015/10/21/chartex" xmlns:cx3="http://schemas.microsoft.com/office/drawing/2016/5/9/chartex" xmlns:cx4="http://schemas.microsoft.com/office/drawing/2016/5/10/chartex" xmlns:cx5="http://schemas.microsoft.com/office/drawing/2016/5/11/chartex" xmlns:cx6="http://schemas.microsoft.com/office/drawing/2016/5/12/chartex" xmlns:cx7="http://schemas.microsoft.com/office/drawing/2016/5/13/chartex" xmlns:cx8="http://schemas.microsoft.com/office/drawing/2016/5/14/chartex" xmlns:mc="http://schemas.openxmlformats.org/markup-compatibility/2006" xmlns:aink="http://schemas.microsoft.com/office/drawing/2016/ink" xmlns:am3d="http://schemas.microsoft.com/office/drawing/2017/model3d" xmlns:o="urn:schemas-microsoft-com:office:office" xmlns:oel="http://schemas.microsoft.com/office/2019/extlst" xmlns:r="http://schemas.openxmlformats.org/officeDocument/2006/relationships" xmlns:m="http://schemas.openxmlformats.org/officeDocument/2006/math" xmlns:v="urn:schemas-microsoft-com:vml" xmlns:wp14="http://schemas.microsoft.com/office/word/2010/wordprocessingDrawing" xmlns:wp="http://schemas.openxmlformats.org/drawingml/2006/wordprocessingDrawing" xmlns:w10="urn:schemas-microsoft-com:office:word" xmlns:w="http://schemas.openxmlformats.org/wordprocessingml/2006/main" xmlns:w14="http://schemas.microsoft.com/office/word/2010/wordml" xmlns:w15="http://schemas.microsoft.com/office/word/2012/wordml" xmlns:w16cex="http://schemas.microsoft.com/office/word/2018/wordml/cex" xmlns:w16cid="http://schemas.microsoft.com/office/word/2016/wordml/cid" xmlns:w16="http://schemas.microsoft.com/office/word/2018/wordml" xmlns:w16du="http://schemas.microsoft.com/office/word/2023/wordml/word16du" xmlns:w16sdtdh="http://schemas.microsoft.com/office/word/2020/wordml/sdtdatahash" xmlns:w16se="http://schemas.microsoft.com/office/word/2015/wordml/symex" xmlns:wpg="http://schemas.microsoft.com/office/word/2010/wordprocessingGroup" xmlns:wpi="http://schemas.microsoft.com/office/word/2010/wordprocessingInk" xmlns:wne="http://schemas.microsoft.com/office/word/2006/wordml" xmlns:wps="http://schemas.microsoft.com/office/word/2010/wordprocessingShape" mc:Ignorable="w14 w15 w16se w16cid w16 w16cex w16sdtdh w16du wp14">
+<w:hdr xmlns:wpc="http://schemas.microsoft.com/office/word/2010/wordprocessingCanvas" xmlns:cx="http://schemas.microsoft.com/office/drawing/2014/chartex" xmlns:cx1="http://schemas.microsoft.com/office/drawing/2015/9/8/chartex" xmlns:cx2="http://schemas.microsoft.com/office/drawing/2015/10/21/chartex" xmlns:cx3="http://schemas.microsoft.com/office/drawing/2016/5/9/chartex" xmlns:cx4="http://schemas.microsoft.com/office/drawing/2016/5/10/chartex" xmlns:cx5="http://schemas.microsoft.com/office/drawing/2016/5/11/chartex" xmlns:cx6="http://schemas.microsoft.com/office/drawing/2016/5/12/chartex" xmlns:cx7="http://schemas.microsoft.com/office/drawing/2016/5/13/chartex" xmlns:cx8="http://schemas.microsoft.com/office/drawing/2016/5/14/chartex" xmlns:mc="http://schemas.openxmlformats.org/markup-compatibility/2006" xmlns:aink="http://schemas.microsoft.com/office/drawing/2016/ink" xmlns:am3d="http://schemas.microsoft.com/office/drawing/2017/model3d" xmlns:o="urn:schemas-microsoft-com:office:office" xmlns:oel="http://schemas.microsoft.com/office/2019/extlst" xmlns:r="http://schemas.openxmlformats.org/officeDocument/2006/relationships" xmlns:m="http://schemas.openxmlformats.org/officeDocument/2006/math" xmlns:v="urn:schemas-microsoft-com:vml" xmlns:wp14="http://schemas.microsoft.com/office/word/2010/wordprocessingDrawing" xmlns:wp="http://schemas.openxmlformats.org/drawingml/2006/wordprocessingDrawing" xmlns:w10="urn:schemas-microsoft-com:office:word" xmlns:w="http://schemas.openxmlformats.org/wordprocessingml/2006/main" xmlns:w14="http://schemas.microsoft.com/office/word/2010/wordml" xmlns:w15="http://schemas.microsoft.com/office/word/2012/wordml" xmlns:w16cex="http://schemas.microsoft.com/office/word/2018/wordml/cex" xmlns:w16cid="http://schemas.microsoft.com/office/word/2016/wordml/cid" xmlns:w16="http://schemas.microsoft.com/office/word/2018/wordml" xmlns:w16du="http://schemas.microsoft.com/office/word/2023/wordml/word16du" xmlns:w16sdtdh="http://schemas.microsoft.com/office/word/2020/wordml/sdtdatahash" xmlns:w16sdtfl="http://schemas.microsoft.com/office/word/2024/wordml/sdtformatlock" xmlns:w16se="http://schemas.microsoft.com/office/word/2015/wordml/symex" xmlns:wpg="http://schemas.microsoft.com/office/word/2010/wordprocessingGroup" xmlns:wpi="http://schemas.microsoft.com/office/word/2010/wordprocessingInk" xmlns:wne="http://schemas.microsoft.com/office/word/2006/wordml" xmlns:wps="http://schemas.microsoft.com/office/word/2010/wordprocessingShape" mc:Ignorable="w14 w15 w16se w16cid w16 w16cex w16sdtdh w16sdtfl w16du wp14">
   <w:p>
     <w:pPr>
       <w:pStyle w:val="Heading1"/>
@@ -22757,7 +23433,7 @@
 </file>
 
 <file path=word/header6.xml><?xml version="1.0" encoding="utf-8"?>
-<w:hdr xmlns:wpc="http://schemas.microsoft.com/office/word/2010/wordprocessingCanvas" xmlns:cx="http://schemas.microsoft.com/office/drawing/2014/chartex" xmlns:cx1="http://schemas.microsoft.com/office/drawing/2015/9/8/chartex" xmlns:cx2="http://schemas.microsoft.com/office/drawing/2015/10/21/chartex" xmlns:cx3="http://schemas.microsoft.com/office/drawing/2016/5/9/chartex" xmlns:cx4="http://schemas.microsoft.com/office/drawing/2016/5/10/chartex" xmlns:cx5="http://schemas.microsoft.com/office/drawing/2016/5/11/chartex" xmlns:cx6="http://schemas.microsoft.com/office/drawing/2016/5/12/chartex" xmlns:cx7="http://schemas.microsoft.com/office/drawing/2016/5/13/chartex" xmlns:cx8="http://schemas.microsoft.com/office/drawing/2016/5/14/chartex" xmlns:mc="http://schemas.openxmlformats.org/markup-compatibility/2006" xmlns:aink="http://schemas.microsoft.com/office/drawing/2016/ink" xmlns:am3d="http://schemas.microsoft.com/office/drawing/2017/model3d" xmlns:o="urn:schemas-microsoft-com:office:office" xmlns:oel="http://schemas.microsoft.com/office/2019/extlst" xmlns:r="http://schemas.openxmlformats.org/officeDocument/2006/relationships" xmlns:m="http://schemas.openxmlformats.org/officeDocument/2006/math" xmlns:v="urn:schemas-microsoft-com:vml" xmlns:wp14="http://schemas.microsoft.com/office/word/2010/wordprocessingDrawing" xmlns:wp="http://schemas.openxmlformats.org/drawingml/2006/wordprocessingDrawing" xmlns:w10="urn:schemas-microsoft-com:office:word" xmlns:w="http://schemas.openxmlformats.org/wordprocessingml/2006/main" xmlns:w14="http://schemas.microsoft.com/office/word/2010/wordml" xmlns:w15="http://schemas.microsoft.com/office/word/2012/wordml" xmlns:w16cex="http://schemas.microsoft.com/office/word/2018/wordml/cex" xmlns:w16cid="http://schemas.microsoft.com/office/word/2016/wordml/cid" xmlns:w16="http://schemas.microsoft.com/office/word/2018/wordml" xmlns:w16du="http://schemas.microsoft.com/office/word/2023/wordml/word16du" xmlns:w16sdtdh="http://schemas.microsoft.com/office/word/2020/wordml/sdtdatahash" xmlns:w16se="http://schemas.microsoft.com/office/word/2015/wordml/symex" xmlns:wpg="http://schemas.microsoft.com/office/word/2010/wordprocessingGroup" xmlns:wpi="http://schemas.microsoft.com/office/word/2010/wordprocessingInk" xmlns:wne="http://schemas.microsoft.com/office/word/2006/wordml" xmlns:wps="http://schemas.microsoft.com/office/word/2010/wordprocessingShape" mc:Ignorable="w14 w15 w16se w16cid w16 w16cex w16sdtdh w16du wp14">
+<w:hdr xmlns:wpc="http://schemas.microsoft.com/office/word/2010/wordprocessingCanvas" xmlns:cx="http://schemas.microsoft.com/office/drawing/2014/chartex" xmlns:cx1="http://schemas.microsoft.com/office/drawing/2015/9/8/chartex" xmlns:cx2="http://schemas.microsoft.com/office/drawing/2015/10/21/chartex" xmlns:cx3="http://schemas.microsoft.com/office/drawing/2016/5/9/chartex" xmlns:cx4="http://schemas.microsoft.com/office/drawing/2016/5/10/chartex" xmlns:cx5="http://schemas.microsoft.com/office/drawing/2016/5/11/chartex" xmlns:cx6="http://schemas.microsoft.com/office/drawing/2016/5/12/chartex" xmlns:cx7="http://schemas.microsoft.com/office/drawing/2016/5/13/chartex" xmlns:cx8="http://schemas.microsoft.com/office/drawing/2016/5/14/chartex" xmlns:mc="http://schemas.openxmlformats.org/markup-compatibility/2006" xmlns:aink="http://schemas.microsoft.com/office/drawing/2016/ink" xmlns:am3d="http://schemas.microsoft.com/office/drawing/2017/model3d" xmlns:o="urn:schemas-microsoft-com:office:office" xmlns:oel="http://schemas.microsoft.com/office/2019/extlst" xmlns:r="http://schemas.openxmlformats.org/officeDocument/2006/relationships" xmlns:m="http://schemas.openxmlformats.org/officeDocument/2006/math" xmlns:v="urn:schemas-microsoft-com:vml" xmlns:wp14="http://schemas.microsoft.com/office/word/2010/wordprocessingDrawing" xmlns:wp="http://schemas.openxmlformats.org/drawingml/2006/wordprocessingDrawing" xmlns:w10="urn:schemas-microsoft-com:office:word" xmlns:w="http://schemas.openxmlformats.org/wordprocessingml/2006/main" xmlns:w14="http://schemas.microsoft.com/office/word/2010/wordml" xmlns:w15="http://schemas.microsoft.com/office/word/2012/wordml" xmlns:w16cex="http://schemas.microsoft.com/office/word/2018/wordml/cex" xmlns:w16cid="http://schemas.microsoft.com/office/word/2016/wordml/cid" xmlns:w16="http://schemas.microsoft.com/office/word/2018/wordml" xmlns:w16du="http://schemas.microsoft.com/office/word/2023/wordml/word16du" xmlns:w16sdtdh="http://schemas.microsoft.com/office/word/2020/wordml/sdtdatahash" xmlns:w16sdtfl="http://schemas.microsoft.com/office/word/2024/wordml/sdtformatlock" xmlns:w16se="http://schemas.microsoft.com/office/word/2015/wordml/symex" xmlns:wpg="http://schemas.microsoft.com/office/word/2010/wordprocessingGroup" xmlns:wpi="http://schemas.microsoft.com/office/word/2010/wordprocessingInk" xmlns:wne="http://schemas.microsoft.com/office/word/2006/wordml" xmlns:wps="http://schemas.microsoft.com/office/word/2010/wordprocessingShape" mc:Ignorable="w14 w15 w16se w16cid w16 w16cex w16sdtdh w16sdtfl w16du wp14">
   <w:p>
     <w:pPr>
       <w:pStyle w:val="Heading1"/>
@@ -22875,7 +23551,7 @@
 </file>
 
 <file path=word/header7.xml><?xml version="1.0" encoding="utf-8"?>
-<w:hdr xmlns:wpc="http://schemas.microsoft.com/office/word/2010/wordprocessingCanvas" xmlns:cx="http://schemas.microsoft.com/office/drawing/2014/chartex" xmlns:cx1="http://schemas.microsoft.com/office/drawing/2015/9/8/chartex" xmlns:cx2="http://schemas.microsoft.com/office/drawing/2015/10/21/chartex" xmlns:cx3="http://schemas.microsoft.com/office/drawing/2016/5/9/chartex" xmlns:cx4="http://schemas.microsoft.com/office/drawing/2016/5/10/chartex" xmlns:cx5="http://schemas.microsoft.com/office/drawing/2016/5/11/chartex" xmlns:cx6="http://schemas.microsoft.com/office/drawing/2016/5/12/chartex" xmlns:cx7="http://schemas.microsoft.com/office/drawing/2016/5/13/chartex" xmlns:cx8="http://schemas.microsoft.com/office/drawing/2016/5/14/chartex" xmlns:mc="http://schemas.openxmlformats.org/markup-compatibility/2006" xmlns:aink="http://schemas.microsoft.com/office/drawing/2016/ink" xmlns:am3d="http://schemas.microsoft.com/office/drawing/2017/model3d" xmlns:o="urn:schemas-microsoft-com:office:office" xmlns:oel="http://schemas.microsoft.com/office/2019/extlst" xmlns:r="http://schemas.openxmlformats.org/officeDocument/2006/relationships" xmlns:m="http://schemas.openxmlformats.org/officeDocument/2006/math" xmlns:v="urn:schemas-microsoft-com:vml" xmlns:wp14="http://schemas.microsoft.com/office/word/2010/wordprocessingDrawing" xmlns:wp="http://schemas.openxmlformats.org/drawingml/2006/wordprocessingDrawing" xmlns:w10="urn:schemas-microsoft-com:office:word" xmlns:w="http://schemas.openxmlformats.org/wordprocessingml/2006/main" xmlns:w14="http://schemas.microsoft.com/office/word/2010/wordml" xmlns:w15="http://schemas.microsoft.com/office/word/2012/wordml" xmlns:w16cex="http://schemas.microsoft.com/office/word/2018/wordml/cex" xmlns:w16cid="http://schemas.microsoft.com/office/word/2016/wordml/cid" xmlns:w16="http://schemas.microsoft.com/office/word/2018/wordml" xmlns:w16du="http://schemas.microsoft.com/office/word/2023/wordml/word16du" xmlns:w16sdtdh="http://schemas.microsoft.com/office/word/2020/wordml/sdtdatahash" xmlns:w16se="http://schemas.microsoft.com/office/word/2015/wordml/symex" xmlns:wpg="http://schemas.microsoft.com/office/word/2010/wordprocessingGroup" xmlns:wpi="http://schemas.microsoft.com/office/word/2010/wordprocessingInk" xmlns:wne="http://schemas.microsoft.com/office/word/2006/wordml" xmlns:wps="http://schemas.microsoft.com/office/word/2010/wordprocessingShape" mc:Ignorable="w14 w15 w16se w16cid w16 w16cex w16sdtdh w16du wp14">
+<w:hdr xmlns:wpc="http://schemas.microsoft.com/office/word/2010/wordprocessingCanvas" xmlns:cx="http://schemas.microsoft.com/office/drawing/2014/chartex" xmlns:cx1="http://schemas.microsoft.com/office/drawing/2015/9/8/chartex" xmlns:cx2="http://schemas.microsoft.com/office/drawing/2015/10/21/chartex" xmlns:cx3="http://schemas.microsoft.com/office/drawing/2016/5/9/chartex" xmlns:cx4="http://schemas.microsoft.com/office/drawing/2016/5/10/chartex" xmlns:cx5="http://schemas.microsoft.com/office/drawing/2016/5/11/chartex" xmlns:cx6="http://schemas.microsoft.com/office/drawing/2016/5/12/chartex" xmlns:cx7="http://schemas.microsoft.com/office/drawing/2016/5/13/chartex" xmlns:cx8="http://schemas.microsoft.com/office/drawing/2016/5/14/chartex" xmlns:mc="http://schemas.openxmlformats.org/markup-compatibility/2006" xmlns:aink="http://schemas.microsoft.com/office/drawing/2016/ink" xmlns:am3d="http://schemas.microsoft.com/office/drawing/2017/model3d" xmlns:o="urn:schemas-microsoft-com:office:office" xmlns:oel="http://schemas.microsoft.com/office/2019/extlst" xmlns:r="http://schemas.openxmlformats.org/officeDocument/2006/relationships" xmlns:m="http://schemas.openxmlformats.org/officeDocument/2006/math" xmlns:v="urn:schemas-microsoft-com:vml" xmlns:wp14="http://schemas.microsoft.com/office/word/2010/wordprocessingDrawing" xmlns:wp="http://schemas.openxmlformats.org/drawingml/2006/wordprocessingDrawing" xmlns:w10="urn:schemas-microsoft-com:office:word" xmlns:w="http://schemas.openxmlformats.org/wordprocessingml/2006/main" xmlns:w14="http://schemas.microsoft.com/office/word/2010/wordml" xmlns:w15="http://schemas.microsoft.com/office/word/2012/wordml" xmlns:w16cex="http://schemas.microsoft.com/office/word/2018/wordml/cex" xmlns:w16cid="http://schemas.microsoft.com/office/word/2016/wordml/cid" xmlns:w16="http://schemas.microsoft.com/office/word/2018/wordml" xmlns:w16du="http://schemas.microsoft.com/office/word/2023/wordml/word16du" xmlns:w16sdtdh="http://schemas.microsoft.com/office/word/2020/wordml/sdtdatahash" xmlns:w16sdtfl="http://schemas.microsoft.com/office/word/2024/wordml/sdtformatlock" xmlns:w16se="http://schemas.microsoft.com/office/word/2015/wordml/symex" xmlns:wpg="http://schemas.microsoft.com/office/word/2010/wordprocessingGroup" xmlns:wpi="http://schemas.microsoft.com/office/word/2010/wordprocessingInk" xmlns:wne="http://schemas.microsoft.com/office/word/2006/wordml" xmlns:wps="http://schemas.microsoft.com/office/word/2010/wordprocessingShape" mc:Ignorable="w14 w15 w16se w16cid w16 w16cex w16sdtdh w16sdtfl w16du wp14">
   <w:p>
     <w:pPr>
       <w:pStyle w:val="Heading1"/>
@@ -22993,7 +23669,7 @@
 </file>
 
 <file path=word/header8.xml><?xml version="1.0" encoding="utf-8"?>
-<w:hdr xmlns:wpc="http://schemas.microsoft.com/office/word/2010/wordprocessingCanvas" xmlns:cx="http://schemas.microsoft.com/office/drawing/2014/chartex" xmlns:cx1="http://schemas.microsoft.com/office/drawing/2015/9/8/chartex" xmlns:cx2="http://schemas.microsoft.com/office/drawing/2015/10/21/chartex" xmlns:cx3="http://schemas.microsoft.com/office/drawing/2016/5/9/chartex" xmlns:cx4="http://schemas.microsoft.com/office/drawing/2016/5/10/chartex" xmlns:cx5="http://schemas.microsoft.com/office/drawing/2016/5/11/chartex" xmlns:cx6="http://schemas.microsoft.com/office/drawing/2016/5/12/chartex" xmlns:cx7="http://schemas.microsoft.com/office/drawing/2016/5/13/chartex" xmlns:cx8="http://schemas.microsoft.com/office/drawing/2016/5/14/chartex" xmlns:mc="http://schemas.openxmlformats.org/markup-compatibility/2006" xmlns:aink="http://schemas.microsoft.com/office/drawing/2016/ink" xmlns:am3d="http://schemas.microsoft.com/office/drawing/2017/model3d" xmlns:o="urn:schemas-microsoft-com:office:office" xmlns:oel="http://schemas.microsoft.com/office/2019/extlst" xmlns:r="http://schemas.openxmlformats.org/officeDocument/2006/relationships" xmlns:m="http://schemas.openxmlformats.org/officeDocument/2006/math" xmlns:v="urn:schemas-microsoft-com:vml" xmlns:wp14="http://schemas.microsoft.com/office/word/2010/wordprocessingDrawing" xmlns:wp="http://schemas.openxmlformats.org/drawingml/2006/wordprocessingDrawing" xmlns:w10="urn:schemas-microsoft-com:office:word" xmlns:w="http://schemas.openxmlformats.org/wordprocessingml/2006/main" xmlns:w14="http://schemas.microsoft.com/office/word/2010/wordml" xmlns:w15="http://schemas.microsoft.com/office/word/2012/wordml" xmlns:w16cex="http://schemas.microsoft.com/office/word/2018/wordml/cex" xmlns:w16cid="http://schemas.microsoft.com/office/word/2016/wordml/cid" xmlns:w16="http://schemas.microsoft.com/office/word/2018/wordml" xmlns:w16du="http://schemas.microsoft.com/office/word/2023/wordml/word16du" xmlns:w16sdtdh="http://schemas.microsoft.com/office/word/2020/wordml/sdtdatahash" xmlns:w16se="http://schemas.microsoft.com/office/word/2015/wordml/symex" xmlns:wpg="http://schemas.microsoft.com/office/word/2010/wordprocessingGroup" xmlns:wpi="http://schemas.microsoft.com/office/word/2010/wordprocessingInk" xmlns:wne="http://schemas.microsoft.com/office/word/2006/wordml" xmlns:wps="http://schemas.microsoft.com/office/word/2010/wordprocessingShape" mc:Ignorable="w14 w15 w16se w16cid w16 w16cex w16sdtdh w16du wp14">
+<w:hdr xmlns:wpc="http://schemas.microsoft.com/office/word/2010/wordprocessingCanvas" xmlns:cx="http://schemas.microsoft.com/office/drawing/2014/chartex" xmlns:cx1="http://schemas.microsoft.com/office/drawing/2015/9/8/chartex" xmlns:cx2="http://schemas.microsoft.com/office/drawing/2015/10/21/chartex" xmlns:cx3="http://schemas.microsoft.com/office/drawing/2016/5/9/chartex" xmlns:cx4="http://schemas.microsoft.com/office/drawing/2016/5/10/chartex" xmlns:cx5="http://schemas.microsoft.com/office/drawing/2016/5/11/chartex" xmlns:cx6="http://schemas.microsoft.com/office/drawing/2016/5/12/chartex" xmlns:cx7="http://schemas.microsoft.com/office/drawing/2016/5/13/chartex" xmlns:cx8="http://schemas.microsoft.com/office/drawing/2016/5/14/chartex" xmlns:mc="http://schemas.openxmlformats.org/markup-compatibility/2006" xmlns:aink="http://schemas.microsoft.com/office/drawing/2016/ink" xmlns:am3d="http://schemas.microsoft.com/office/drawing/2017/model3d" xmlns:o="urn:schemas-microsoft-com:office:office" xmlns:oel="http://schemas.microsoft.com/office/2019/extlst" xmlns:r="http://schemas.openxmlformats.org/officeDocument/2006/relationships" xmlns:m="http://schemas.openxmlformats.org/officeDocument/2006/math" xmlns:v="urn:schemas-microsoft-com:vml" xmlns:wp14="http://schemas.microsoft.com/office/word/2010/wordprocessingDrawing" xmlns:wp="http://schemas.openxmlformats.org/drawingml/2006/wordprocessingDrawing" xmlns:w10="urn:schemas-microsoft-com:office:word" xmlns:w="http://schemas.openxmlformats.org/wordprocessingml/2006/main" xmlns:w14="http://schemas.microsoft.com/office/word/2010/wordml" xmlns:w15="http://schemas.microsoft.com/office/word/2012/wordml" xmlns:w16cex="http://schemas.microsoft.com/office/word/2018/wordml/cex" xmlns:w16cid="http://schemas.microsoft.com/office/word/2016/wordml/cid" xmlns:w16="http://schemas.microsoft.com/office/word/2018/wordml" xmlns:w16du="http://schemas.microsoft.com/office/word/2023/wordml/word16du" xmlns:w16sdtdh="http://schemas.microsoft.com/office/word/2020/wordml/sdtdatahash" xmlns:w16sdtfl="http://schemas.microsoft.com/office/word/2024/wordml/sdtformatlock" xmlns:w16se="http://schemas.microsoft.com/office/word/2015/wordml/symex" xmlns:wpg="http://schemas.microsoft.com/office/word/2010/wordprocessingGroup" xmlns:wpi="http://schemas.microsoft.com/office/word/2010/wordprocessingInk" xmlns:wne="http://schemas.microsoft.com/office/word/2006/wordml" xmlns:wps="http://schemas.microsoft.com/office/word/2010/wordprocessingShape" mc:Ignorable="w14 w15 w16se w16cid w16 w16cex w16sdtdh w16sdtfl w16du wp14">
   <w:p>
     <w:pPr>
       <w:pStyle w:val="Heading1"/>
@@ -23111,7 +23787,7 @@
 </file>
 
 <file path=word/header9.xml><?xml version="1.0" encoding="utf-8"?>
-<w:hdr xmlns:wpc="http://schemas.microsoft.com/office/word/2010/wordprocessingCanvas" xmlns:cx="http://schemas.microsoft.com/office/drawing/2014/chartex" xmlns:cx1="http://schemas.microsoft.com/office/drawing/2015/9/8/chartex" xmlns:cx2="http://schemas.microsoft.com/office/drawing/2015/10/21/chartex" xmlns:cx3="http://schemas.microsoft.com/office/drawing/2016/5/9/chartex" xmlns:cx4="http://schemas.microsoft.com/office/drawing/2016/5/10/chartex" xmlns:cx5="http://schemas.microsoft.com/office/drawing/2016/5/11/chartex" xmlns:cx6="http://schemas.microsoft.com/office/drawing/2016/5/12/chartex" xmlns:cx7="http://schemas.microsoft.com/office/drawing/2016/5/13/chartex" xmlns:cx8="http://schemas.microsoft.com/office/drawing/2016/5/14/chartex" xmlns:mc="http://schemas.openxmlformats.org/markup-compatibility/2006" xmlns:aink="http://schemas.microsoft.com/office/drawing/2016/ink" xmlns:am3d="http://schemas.microsoft.com/office/drawing/2017/model3d" xmlns:o="urn:schemas-microsoft-com:office:office" xmlns:oel="http://schemas.microsoft.com/office/2019/extlst" xmlns:r="http://schemas.openxmlformats.org/officeDocument/2006/relationships" xmlns:m="http://schemas.openxmlformats.org/officeDocument/2006/math" xmlns:v="urn:schemas-microsoft-com:vml" xmlns:wp14="http://schemas.microsoft.com/office/word/2010/wordprocessingDrawing" xmlns:wp="http://schemas.openxmlformats.org/drawingml/2006/wordprocessingDrawing" xmlns:w10="urn:schemas-microsoft-com:office:word" xmlns:w="http://schemas.openxmlformats.org/wordprocessingml/2006/main" xmlns:w14="http://schemas.microsoft.com/office/word/2010/wordml" xmlns:w15="http://schemas.microsoft.com/office/word/2012/wordml" xmlns:w16cex="http://schemas.microsoft.com/office/word/2018/wordml/cex" xmlns:w16cid="http://schemas.microsoft.com/office/word/2016/wordml/cid" xmlns:w16="http://schemas.microsoft.com/office/word/2018/wordml" xmlns:w16du="http://schemas.microsoft.com/office/word/2023/wordml/word16du" xmlns:w16sdtdh="http://schemas.microsoft.com/office/word/2020/wordml/sdtdatahash" xmlns:w16se="http://schemas.microsoft.com/office/word/2015/wordml/symex" xmlns:wpg="http://schemas.microsoft.com/office/word/2010/wordprocessingGroup" xmlns:wpi="http://schemas.microsoft.com/office/word/2010/wordprocessingInk" xmlns:wne="http://schemas.microsoft.com/office/word/2006/wordml" xmlns:wps="http://schemas.microsoft.com/office/word/2010/wordprocessingShape" mc:Ignorable="w14 w15 w16se w16cid w16 w16cex w16sdtdh w16du wp14">
+<w:hdr xmlns:wpc="http://schemas.microsoft.com/office/word/2010/wordprocessingCanvas" xmlns:cx="http://schemas.microsoft.com/office/drawing/2014/chartex" xmlns:cx1="http://schemas.microsoft.com/office/drawing/2015/9/8/chartex" xmlns:cx2="http://schemas.microsoft.com/office/drawing/2015/10/21/chartex" xmlns:cx3="http://schemas.microsoft.com/office/drawing/2016/5/9/chartex" xmlns:cx4="http://schemas.microsoft.com/office/drawing/2016/5/10/chartex" xmlns:cx5="http://schemas.microsoft.com/office/drawing/2016/5/11/chartex" xmlns:cx6="http://schemas.microsoft.com/office/drawing/2016/5/12/chartex" xmlns:cx7="http://schemas.microsoft.com/office/drawing/2016/5/13/chartex" xmlns:cx8="http://schemas.microsoft.com/office/drawing/2016/5/14/chartex" xmlns:mc="http://schemas.openxmlformats.org/markup-compatibility/2006" xmlns:aink="http://schemas.microsoft.com/office/drawing/2016/ink" xmlns:am3d="http://schemas.microsoft.com/office/drawing/2017/model3d" xmlns:o="urn:schemas-microsoft-com:office:office" xmlns:oel="http://schemas.microsoft.com/office/2019/extlst" xmlns:r="http://schemas.openxmlformats.org/officeDocument/2006/relationships" xmlns:m="http://schemas.openxmlformats.org/officeDocument/2006/math" xmlns:v="urn:schemas-microsoft-com:vml" xmlns:wp14="http://schemas.microsoft.com/office/word/2010/wordprocessingDrawing" xmlns:wp="http://schemas.openxmlformats.org/drawingml/2006/wordprocessingDrawing" xmlns:w10="urn:schemas-microsoft-com:office:word" xmlns:w="http://schemas.openxmlformats.org/wordprocessingml/2006/main" xmlns:w14="http://schemas.microsoft.com/office/word/2010/wordml" xmlns:w15="http://schemas.microsoft.com/office/word/2012/wordml" xmlns:w16cex="http://schemas.microsoft.com/office/word/2018/wordml/cex" xmlns:w16cid="http://schemas.microsoft.com/office/word/2016/wordml/cid" xmlns:w16="http://schemas.microsoft.com/office/word/2018/wordml" xmlns:w16du="http://schemas.microsoft.com/office/word/2023/wordml/word16du" xmlns:w16sdtdh="http://schemas.microsoft.com/office/word/2020/wordml/sdtdatahash" xmlns:w16sdtfl="http://schemas.microsoft.com/office/word/2024/wordml/sdtformatlock" xmlns:w16se="http://schemas.microsoft.com/office/word/2015/wordml/symex" xmlns:wpg="http://schemas.microsoft.com/office/word/2010/wordprocessingGroup" xmlns:wpi="http://schemas.microsoft.com/office/word/2010/wordprocessingInk" xmlns:wne="http://schemas.microsoft.com/office/word/2006/wordml" xmlns:wps="http://schemas.microsoft.com/office/word/2010/wordprocessingShape" mc:Ignorable="w14 w15 w16se w16cid w16 w16cex w16sdtdh w16sdtfl w16du wp14">
   <w:p>
     <w:pPr>
       <w:pStyle w:val="Heading1"/>
@@ -23229,7 +23905,7 @@
 </file>
 
 <file path=word/numbering.xml><?xml version="1.0" encoding="utf-8"?>
-<w:numbering xmlns:wpc="http://schemas.microsoft.com/office/word/2010/wordprocessingCanvas" xmlns:cx="http://schemas.microsoft.com/office/drawing/2014/chartex" xmlns:cx1="http://schemas.microsoft.com/office/drawing/2015/9/8/chartex" xmlns:cx2="http://schemas.microsoft.com/office/drawing/2015/10/21/chartex" xmlns:cx3="http://schemas.microsoft.com/office/drawing/2016/5/9/chartex" xmlns:cx4="http://schemas.microsoft.com/office/drawing/2016/5/10/chartex" xmlns:cx5="http://schemas.microsoft.com/office/drawing/2016/5/11/chartex" xmlns:cx6="http://schemas.microsoft.com/office/drawing/2016/5/12/chartex" xmlns:cx7="http://schemas.microsoft.com/office/drawing/2016/5/13/chartex" xmlns:cx8="http://schemas.microsoft.com/office/drawing/2016/5/14/chartex" xmlns:mc="http://schemas.openxmlformats.org/markup-compatibility/2006" xmlns:aink="http://schemas.microsoft.com/office/drawing/2016/ink" xmlns:am3d="http://schemas.microsoft.com/office/drawing/2017/model3d" xmlns:o="urn:schemas-microsoft-com:office:office" xmlns:oel="http://schemas.microsoft.com/office/2019/extlst" xmlns:r="http://schemas.openxmlformats.org/officeDocument/2006/relationships" xmlns:m="http://schemas.openxmlformats.org/officeDocument/2006/math" xmlns:v="urn:schemas-microsoft-com:vml" xmlns:wp14="http://schemas.microsoft.com/office/word/2010/wordprocessingDrawing" xmlns:wp="http://schemas.openxmlformats.org/drawingml/2006/wordprocessingDrawing" xmlns:w10="urn:schemas-microsoft-com:office:word" xmlns:w="http://schemas.openxmlformats.org/wordprocessingml/2006/main" xmlns:w14="http://schemas.microsoft.com/office/word/2010/wordml" xmlns:w15="http://schemas.microsoft.com/office/word/2012/wordml" xmlns:w16cex="http://schemas.microsoft.com/office/word/2018/wordml/cex" xmlns:w16cid="http://schemas.microsoft.com/office/word/2016/wordml/cid" xmlns:w16="http://schemas.microsoft.com/office/word/2018/wordml" xmlns:w16du="http://schemas.microsoft.com/office/word/2023/wordml/word16du" xmlns:w16sdtdh="http://schemas.microsoft.com/office/word/2020/wordml/sdtdatahash" xmlns:w16se="http://schemas.microsoft.com/office/word/2015/wordml/symex" xmlns:wpg="http://schemas.microsoft.com/office/word/2010/wordprocessingGroup" xmlns:wpi="http://schemas.microsoft.com/office/word/2010/wordprocessingInk" xmlns:wne="http://schemas.microsoft.com/office/word/2006/wordml" xmlns:wps="http://schemas.microsoft.com/office/word/2010/wordprocessingShape" mc:Ignorable="w14 w15 w16se w16cid w16 w16cex w16sdtdh w16du wp14">
+<w:numbering xmlns:wpc="http://schemas.microsoft.com/office/word/2010/wordprocessingCanvas" xmlns:cx="http://schemas.microsoft.com/office/drawing/2014/chartex" xmlns:cx1="http://schemas.microsoft.com/office/drawing/2015/9/8/chartex" xmlns:cx2="http://schemas.microsoft.com/office/drawing/2015/10/21/chartex" xmlns:cx3="http://schemas.microsoft.com/office/drawing/2016/5/9/chartex" xmlns:cx4="http://schemas.microsoft.com/office/drawing/2016/5/10/chartex" xmlns:cx5="http://schemas.microsoft.com/office/drawing/2016/5/11/chartex" xmlns:cx6="http://schemas.microsoft.com/office/drawing/2016/5/12/chartex" xmlns:cx7="http://schemas.microsoft.com/office/drawing/2016/5/13/chartex" xmlns:cx8="http://schemas.microsoft.com/office/drawing/2016/5/14/chartex" xmlns:mc="http://schemas.openxmlformats.org/markup-compatibility/2006" xmlns:aink="http://schemas.microsoft.com/office/drawing/2016/ink" xmlns:am3d="http://schemas.microsoft.com/office/drawing/2017/model3d" xmlns:o="urn:schemas-microsoft-com:office:office" xmlns:oel="http://schemas.microsoft.com/office/2019/extlst" xmlns:r="http://schemas.openxmlformats.org/officeDocument/2006/relationships" xmlns:m="http://schemas.openxmlformats.org/officeDocument/2006/math" xmlns:v="urn:schemas-microsoft-com:vml" xmlns:wp14="http://schemas.microsoft.com/office/word/2010/wordprocessingDrawing" xmlns:wp="http://schemas.openxmlformats.org/drawingml/2006/wordprocessingDrawing" xmlns:w10="urn:schemas-microsoft-com:office:word" xmlns:w="http://schemas.openxmlformats.org/wordprocessingml/2006/main" xmlns:w14="http://schemas.microsoft.com/office/word/2010/wordml" xmlns:w15="http://schemas.microsoft.com/office/word/2012/wordml" xmlns:w16cex="http://schemas.microsoft.com/office/word/2018/wordml/cex" xmlns:w16cid="http://schemas.microsoft.com/office/word/2016/wordml/cid" xmlns:w16="http://schemas.microsoft.com/office/word/2018/wordml" xmlns:w16du="http://schemas.microsoft.com/office/word/2023/wordml/word16du" xmlns:w16sdtdh="http://schemas.microsoft.com/office/word/2020/wordml/sdtdatahash" xmlns:w16sdtfl="http://schemas.microsoft.com/office/word/2024/wordml/sdtformatlock" xmlns:w16se="http://schemas.microsoft.com/office/word/2015/wordml/symex" xmlns:wpg="http://schemas.microsoft.com/office/word/2010/wordprocessingGroup" xmlns:wpi="http://schemas.microsoft.com/office/word/2010/wordprocessingInk" xmlns:wne="http://schemas.microsoft.com/office/word/2006/wordml" xmlns:wps="http://schemas.microsoft.com/office/word/2010/wordprocessingShape" mc:Ignorable="w14 w15 w16se w16cid w16 w16cex w16sdtdh w16sdtfl w16du wp14">
   <w:abstractNum w:abstractNumId="0" w15:restartNumberingAfterBreak="0">
     <w:nsid w:val="01054FF0"/>
     <w:multiLevelType w:val="hybridMultilevel"/>
@@ -28758,7 +29434,7 @@
 </file>
 
 <file path=word/styles.xml><?xml version="1.0" encoding="utf-8"?>
-<w:styles xmlns:mc="http://schemas.openxmlformats.org/markup-compatibility/2006" xmlns:r="http://schemas.openxmlformats.org/officeDocument/2006/relationships" xmlns:w="http://schemas.openxmlformats.org/wordprocessingml/2006/main" xmlns:w14="http://schemas.microsoft.com/office/word/2010/wordml" xmlns:w15="http://schemas.microsoft.com/office/word/2012/wordml" xmlns:w16cex="http://schemas.microsoft.com/office/word/2018/wordml/cex" xmlns:w16cid="http://schemas.microsoft.com/office/word/2016/wordml/cid" xmlns:w16="http://schemas.microsoft.com/office/word/2018/wordml" xmlns:w16du="http://schemas.microsoft.com/office/word/2023/wordml/word16du" xmlns:w16sdtdh="http://schemas.microsoft.com/office/word/2020/wordml/sdtdatahash" xmlns:w16se="http://schemas.microsoft.com/office/word/2015/wordml/symex" mc:Ignorable="w14 w15 w16se w16cid w16 w16cex w16sdtdh w16du">
+<w:styles xmlns:mc="http://schemas.openxmlformats.org/markup-compatibility/2006" xmlns:r="http://schemas.openxmlformats.org/officeDocument/2006/relationships" xmlns:w="http://schemas.openxmlformats.org/wordprocessingml/2006/main" xmlns:w14="http://schemas.microsoft.com/office/word/2010/wordml" xmlns:w15="http://schemas.microsoft.com/office/word/2012/wordml" xmlns:w16cex="http://schemas.microsoft.com/office/word/2018/wordml/cex" xmlns:w16cid="http://schemas.microsoft.com/office/word/2016/wordml/cid" xmlns:w16="http://schemas.microsoft.com/office/word/2018/wordml" xmlns:w16du="http://schemas.microsoft.com/office/word/2023/wordml/word16du" xmlns:w16sdtdh="http://schemas.microsoft.com/office/word/2020/wordml/sdtdatahash" xmlns:w16sdtfl="http://schemas.microsoft.com/office/word/2024/wordml/sdtformatlock" xmlns:w16se="http://schemas.microsoft.com/office/word/2015/wordml/symex" mc:Ignorable="w14 w15 w16se w16cid w16 w16cex w16sdtdh w16sdtfl w16du">
   <w:docDefaults>
     <w:rPrDefault>
       <w:rPr>

</xml_diff>